<commit_message>
EMPOWER study: 16-sheet formula-first workbook verified (716/716 formula cells reproduce, 13 drivers directional, 134 pasted cells inert)
Co-Authored-By: Claude Fable 5 <noreply@anthropic.com>
Claude-Session: https://claude.ai/code/session_012CkW3xW1KqNUtQUf3ovr6G
</commit_message>
<xml_diff>
--- a/engine/empower_study/EMPOWER_Bibliography_09-08-2026.docx
+++ b/engine/empower_study/EMPOWER_Bibliography_09-08-2026.docx
@@ -1029,20 +1029,6 @@
         <w:t>Values are shown as the model holds them: AED millions for financial-statement lines (thousands of refrigeration tons for capacity), decimals for rates and ratios. The layer is the research layer defined on the first page. Where a value is a construction rather than a quotation, the construction is stated in the source column itself.</w:t>
       </w:r>
     </w:p>
-    <w:p>
-      <w:pPr>
-        <w:spacing w:after="80" w:before="180"/>
-      </w:pPr>
-      <w:r>
-        <w:rPr>
-          <w:b/>
-          <w:i w:val="0"/>
-          <w:color w:val="1C3A36"/>
-          <w:sz w:val="22"/>
-        </w:rPr>
-        <w:t>Market layer — 1 input</w:t>
-      </w:r>
-    </w:p>
     <w:tbl>
       <w:tblPr>
         <w:tblW w:type="auto" w:w="0"/>
@@ -1067,9 +1053,10 @@
       </w:tblPr>
       <w:tblGrid>
         <w:gridCol w:w="1872"/>
-        <w:gridCol w:w="2232"/>
-        <w:gridCol w:w="1080"/>
-        <w:gridCol w:w="8928"/>
+        <w:gridCol w:w="2304"/>
+        <w:gridCol w:w="893"/>
+        <w:gridCol w:w="1123"/>
+        <w:gridCol w:w="7920"/>
       </w:tblGrid>
       <w:tr>
         <w:tc>
@@ -1093,7 +1080,7 @@
         </w:tc>
         <w:tc>
           <w:tcPr>
-            <w:tcW w:type="dxa" w:w="2232"/>
+            <w:tcW w:type="dxa" w:w="2304"/>
             <w:shd w:val="clear" w:color="auto" w:fill="EAF0EE"/>
           </w:tcPr>
           <w:p>
@@ -1112,7 +1099,7 @@
         </w:tc>
         <w:tc>
           <w:tcPr>
-            <w:tcW w:type="dxa" w:w="1080"/>
+            <w:tcW w:type="dxa" w:w="893"/>
             <w:shd w:val="clear" w:color="auto" w:fill="EAF0EE"/>
           </w:tcPr>
           <w:p>
@@ -1125,13 +1112,32 @@
                 <w:color w:val="1C3A36"/>
                 <w:sz w:val="15"/>
               </w:rPr>
+              <w:t>Layer</w:t>
+            </w:r>
+          </w:p>
+        </w:tc>
+        <w:tc>
+          <w:tcPr>
+            <w:tcW w:type="dxa" w:w="1123"/>
+            <w:shd w:val="clear" w:color="auto" w:fill="EAF0EE"/>
+          </w:tcPr>
+          <w:p>
+            <w:pPr>
+              <w:spacing w:after="20"/>
+            </w:pPr>
+            <w:r>
+              <w:rPr>
+                <w:b/>
+                <w:color w:val="1C3A36"/>
+                <w:sz w:val="15"/>
+              </w:rPr>
               <w:t>Date</w:t>
             </w:r>
           </w:p>
         </w:tc>
         <w:tc>
           <w:tcPr>
-            <w:tcW w:type="dxa" w:w="8928"/>
+            <w:tcW w:type="dxa" w:w="7920"/>
             <w:shd w:val="clear" w:color="auto" w:fill="EAF0EE"/>
           </w:tcPr>
           <w:p>
@@ -1169,7 +1175,7 @@
         </w:tc>
         <w:tc>
           <w:tcPr>
-            <w:tcW w:type="dxa" w:w="2232"/>
+            <w:tcW w:type="dxa" w:w="2304"/>
           </w:tcPr>
           <w:p>
             <w:pPr>
@@ -1186,7 +1192,24 @@
         </w:tc>
         <w:tc>
           <w:tcPr>
-            <w:tcW w:type="dxa" w:w="1080"/>
+            <w:tcW w:type="dxa" w:w="893"/>
+          </w:tcPr>
+          <w:p>
+            <w:pPr>
+              <w:spacing w:after="20"/>
+            </w:pPr>
+            <w:r>
+              <w:rPr>
+                <w:color w:val="1C3A36"/>
+                <w:sz w:val="15"/>
+              </w:rPr>
+              <w:t>Market</w:t>
+            </w:r>
+          </w:p>
+        </w:tc>
+        <w:tc>
+          <w:tcPr>
+            <w:tcW w:type="dxa" w:w="1123"/>
           </w:tcPr>
           <w:p>
             <w:pPr>
@@ -1203,7 +1226,7 @@
         </w:tc>
         <w:tc>
           <w:tcPr>
-            <w:tcW w:type="dxa" w:w="8928"/>
+            <w:tcW w:type="dxa" w:w="7920"/>
           </w:tcPr>
           <w:p>
             <w:pPr>
@@ -1215,132 +1238,6 @@
                 <w:sz w:val="15"/>
               </w:rPr>
               <w:t>Uploaded DFM daily price history, last close</w:t>
-            </w:r>
-          </w:p>
-        </w:tc>
-      </w:tr>
-    </w:tbl>
-    <w:p>
-      <w:pPr>
-        <w:spacing w:after="40"/>
-      </w:pPr>
-    </w:p>
-    <w:p>
-      <w:pPr>
-        <w:spacing w:after="80" w:before="180"/>
-      </w:pPr>
-      <w:r>
-        <w:rPr>
-          <w:b/>
-          <w:i w:val="0"/>
-          <w:color w:val="1C3A36"/>
-          <w:sz w:val="22"/>
-        </w:rPr>
-        <w:t>Company layer — 72 inputs</w:t>
-      </w:r>
-    </w:p>
-    <w:tbl>
-      <w:tblPr>
-        <w:tblW w:type="auto" w:w="0"/>
-        <w:jc w:val="center"/>
-        <w:tblLook w:firstColumn="1" w:firstRow="1" w:lastColumn="0" w:lastRow="0" w:noHBand="0" w:noVBand="1" w:val="04A0"/>
-        <w:tblLayout w:type="fixed"/>
-        <w:tblCellMar>
-          <w:top w:w="40" w:type="dxa"/>
-          <w:left w:w="80" w:type="dxa"/>
-          <w:bottom w:w="40" w:type="dxa"/>
-          <w:right w:w="80" w:type="dxa"/>
-        </w:tblCellMar>
-        <w:tblBorders>
-          <w:top w:val="single" w:sz="4" w:space="0" w:color="C9D4D1"/>
-          <w:left w:val="single" w:sz="4" w:space="0" w:color="C9D4D1"/>
-          <w:bottom w:val="single" w:sz="4" w:space="0" w:color="C9D4D1"/>
-          <w:right w:val="single" w:sz="4" w:space="0" w:color="C9D4D1"/>
-          <w:insideH w:val="single" w:sz="4" w:space="0" w:color="C9D4D1"/>
-          <w:insideV w:val="single" w:sz="4" w:space="0" w:color="C9D4D1"/>
-        </w:tblBorders>
-        <w:tblLayout w:type="fixed"/>
-      </w:tblPr>
-      <w:tblGrid>
-        <w:gridCol w:w="1872"/>
-        <w:gridCol w:w="2232"/>
-        <w:gridCol w:w="1080"/>
-        <w:gridCol w:w="8928"/>
-      </w:tblGrid>
-      <w:tr>
-        <w:tc>
-          <w:tcPr>
-            <w:tcW w:type="dxa" w:w="1872"/>
-            <w:shd w:val="clear" w:color="auto" w:fill="EAF0EE"/>
-          </w:tcPr>
-          <w:p>
-            <w:pPr>
-              <w:spacing w:after="20"/>
-            </w:pPr>
-            <w:r>
-              <w:rPr>
-                <w:b/>
-                <w:color w:val="1C3A36"/>
-                <w:sz w:val="15"/>
-              </w:rPr>
-              <w:t>Input</w:t>
-            </w:r>
-          </w:p>
-        </w:tc>
-        <w:tc>
-          <w:tcPr>
-            <w:tcW w:type="dxa" w:w="2232"/>
-            <w:shd w:val="clear" w:color="auto" w:fill="EAF0EE"/>
-          </w:tcPr>
-          <w:p>
-            <w:pPr>
-              <w:spacing w:after="20"/>
-            </w:pPr>
-            <w:r>
-              <w:rPr>
-                <w:b/>
-                <w:color w:val="1C3A36"/>
-                <w:sz w:val="15"/>
-              </w:rPr>
-              <w:t>Value</w:t>
-            </w:r>
-          </w:p>
-        </w:tc>
-        <w:tc>
-          <w:tcPr>
-            <w:tcW w:type="dxa" w:w="1080"/>
-            <w:shd w:val="clear" w:color="auto" w:fill="EAF0EE"/>
-          </w:tcPr>
-          <w:p>
-            <w:pPr>
-              <w:spacing w:after="20"/>
-            </w:pPr>
-            <w:r>
-              <w:rPr>
-                <w:b/>
-                <w:color w:val="1C3A36"/>
-                <w:sz w:val="15"/>
-              </w:rPr>
-              <w:t>Date</w:t>
-            </w:r>
-          </w:p>
-        </w:tc>
-        <w:tc>
-          <w:tcPr>
-            <w:tcW w:type="dxa" w:w="8928"/>
-            <w:shd w:val="clear" w:color="auto" w:fill="EAF0EE"/>
-          </w:tcPr>
-          <w:p>
-            <w:pPr>
-              <w:spacing w:after="20"/>
-            </w:pPr>
-            <w:r>
-              <w:rPr>
-                <w:b/>
-                <w:color w:val="1C3A36"/>
-                <w:sz w:val="15"/>
-              </w:rPr>
-              <w:t>Source and construction</w:t>
             </w:r>
           </w:p>
         </w:tc>
@@ -1365,7 +1262,7 @@
         </w:tc>
         <w:tc>
           <w:tcPr>
-            <w:tcW w:type="dxa" w:w="2232"/>
+            <w:tcW w:type="dxa" w:w="2304"/>
           </w:tcPr>
           <w:p>
             <w:pPr>
@@ -1382,7 +1279,24 @@
         </w:tc>
         <w:tc>
           <w:tcPr>
-            <w:tcW w:type="dxa" w:w="1080"/>
+            <w:tcW w:type="dxa" w:w="893"/>
+          </w:tcPr>
+          <w:p>
+            <w:pPr>
+              <w:spacing w:after="20"/>
+            </w:pPr>
+            <w:r>
+              <w:rPr>
+                <w:color w:val="1C3A36"/>
+                <w:sz w:val="15"/>
+              </w:rPr>
+              <w:t>Company</w:t>
+            </w:r>
+          </w:p>
+        </w:tc>
+        <w:tc>
+          <w:tcPr>
+            <w:tcW w:type="dxa" w:w="1123"/>
           </w:tcPr>
           <w:p>
             <w:pPr>
@@ -1399,7 +1313,7 @@
         </w:tc>
         <w:tc>
           <w:tcPr>
-            <w:tcW w:type="dxa" w:w="8928"/>
+            <w:tcW w:type="dxa" w:w="7920"/>
           </w:tcPr>
           <w:p>
             <w:pPr>
@@ -1435,7 +1349,7 @@
         </w:tc>
         <w:tc>
           <w:tcPr>
-            <w:tcW w:type="dxa" w:w="2232"/>
+            <w:tcW w:type="dxa" w:w="2304"/>
           </w:tcPr>
           <w:p>
             <w:pPr>
@@ -1452,7 +1366,24 @@
         </w:tc>
         <w:tc>
           <w:tcPr>
-            <w:tcW w:type="dxa" w:w="1080"/>
+            <w:tcW w:type="dxa" w:w="893"/>
+          </w:tcPr>
+          <w:p>
+            <w:pPr>
+              <w:spacing w:after="20"/>
+            </w:pPr>
+            <w:r>
+              <w:rPr>
+                <w:color w:val="1C3A36"/>
+                <w:sz w:val="15"/>
+              </w:rPr>
+              <w:t>Company</w:t>
+            </w:r>
+          </w:p>
+        </w:tc>
+        <w:tc>
+          <w:tcPr>
+            <w:tcW w:type="dxa" w:w="1123"/>
           </w:tcPr>
           <w:p>
             <w:pPr>
@@ -1469,7 +1400,7 @@
         </w:tc>
         <w:tc>
           <w:tcPr>
-            <w:tcW w:type="dxa" w:w="8928"/>
+            <w:tcW w:type="dxa" w:w="7920"/>
           </w:tcPr>
           <w:p>
             <w:pPr>
@@ -1505,7 +1436,7 @@
         </w:tc>
         <w:tc>
           <w:tcPr>
-            <w:tcW w:type="dxa" w:w="2232"/>
+            <w:tcW w:type="dxa" w:w="2304"/>
           </w:tcPr>
           <w:p>
             <w:pPr>
@@ -1522,7 +1453,24 @@
         </w:tc>
         <w:tc>
           <w:tcPr>
-            <w:tcW w:type="dxa" w:w="1080"/>
+            <w:tcW w:type="dxa" w:w="893"/>
+          </w:tcPr>
+          <w:p>
+            <w:pPr>
+              <w:spacing w:after="20"/>
+            </w:pPr>
+            <w:r>
+              <w:rPr>
+                <w:color w:val="1C3A36"/>
+                <w:sz w:val="15"/>
+              </w:rPr>
+              <w:t>Company</w:t>
+            </w:r>
+          </w:p>
+        </w:tc>
+        <w:tc>
+          <w:tcPr>
+            <w:tcW w:type="dxa" w:w="1123"/>
           </w:tcPr>
           <w:p>
             <w:pPr>
@@ -1539,7 +1487,7 @@
         </w:tc>
         <w:tc>
           <w:tcPr>
-            <w:tcW w:type="dxa" w:w="8928"/>
+            <w:tcW w:type="dxa" w:w="7920"/>
           </w:tcPr>
           <w:p>
             <w:pPr>
@@ -1575,7 +1523,7 @@
         </w:tc>
         <w:tc>
           <w:tcPr>
-            <w:tcW w:type="dxa" w:w="2232"/>
+            <w:tcW w:type="dxa" w:w="2304"/>
           </w:tcPr>
           <w:p>
             <w:pPr>
@@ -1592,7 +1540,24 @@
         </w:tc>
         <w:tc>
           <w:tcPr>
-            <w:tcW w:type="dxa" w:w="1080"/>
+            <w:tcW w:type="dxa" w:w="893"/>
+          </w:tcPr>
+          <w:p>
+            <w:pPr>
+              <w:spacing w:after="20"/>
+            </w:pPr>
+            <w:r>
+              <w:rPr>
+                <w:color w:val="1C3A36"/>
+                <w:sz w:val="15"/>
+              </w:rPr>
+              <w:t>Company</w:t>
+            </w:r>
+          </w:p>
+        </w:tc>
+        <w:tc>
+          <w:tcPr>
+            <w:tcW w:type="dxa" w:w="1123"/>
           </w:tcPr>
           <w:p>
             <w:pPr>
@@ -1609,7 +1574,7 @@
         </w:tc>
         <w:tc>
           <w:tcPr>
-            <w:tcW w:type="dxa" w:w="8928"/>
+            <w:tcW w:type="dxa" w:w="7920"/>
           </w:tcPr>
           <w:p>
             <w:pPr>
@@ -1645,7 +1610,7 @@
         </w:tc>
         <w:tc>
           <w:tcPr>
-            <w:tcW w:type="dxa" w:w="2232"/>
+            <w:tcW w:type="dxa" w:w="2304"/>
           </w:tcPr>
           <w:p>
             <w:pPr>
@@ -1662,7 +1627,24 @@
         </w:tc>
         <w:tc>
           <w:tcPr>
-            <w:tcW w:type="dxa" w:w="1080"/>
+            <w:tcW w:type="dxa" w:w="893"/>
+          </w:tcPr>
+          <w:p>
+            <w:pPr>
+              <w:spacing w:after="20"/>
+            </w:pPr>
+            <w:r>
+              <w:rPr>
+                <w:color w:val="1C3A36"/>
+                <w:sz w:val="15"/>
+              </w:rPr>
+              <w:t>Company</w:t>
+            </w:r>
+          </w:p>
+        </w:tc>
+        <w:tc>
+          <w:tcPr>
+            <w:tcW w:type="dxa" w:w="1123"/>
           </w:tcPr>
           <w:p>
             <w:pPr>
@@ -1679,7 +1661,7 @@
         </w:tc>
         <w:tc>
           <w:tcPr>
-            <w:tcW w:type="dxa" w:w="8928"/>
+            <w:tcW w:type="dxa" w:w="7920"/>
           </w:tcPr>
           <w:p>
             <w:pPr>
@@ -1715,7 +1697,7 @@
         </w:tc>
         <w:tc>
           <w:tcPr>
-            <w:tcW w:type="dxa" w:w="2232"/>
+            <w:tcW w:type="dxa" w:w="2304"/>
           </w:tcPr>
           <w:p>
             <w:pPr>
@@ -1732,7 +1714,24 @@
         </w:tc>
         <w:tc>
           <w:tcPr>
-            <w:tcW w:type="dxa" w:w="1080"/>
+            <w:tcW w:type="dxa" w:w="893"/>
+          </w:tcPr>
+          <w:p>
+            <w:pPr>
+              <w:spacing w:after="20"/>
+            </w:pPr>
+            <w:r>
+              <w:rPr>
+                <w:color w:val="1C3A36"/>
+                <w:sz w:val="15"/>
+              </w:rPr>
+              <w:t>Company</w:t>
+            </w:r>
+          </w:p>
+        </w:tc>
+        <w:tc>
+          <w:tcPr>
+            <w:tcW w:type="dxa" w:w="1123"/>
           </w:tcPr>
           <w:p>
             <w:pPr>
@@ -1749,7 +1748,7 @@
         </w:tc>
         <w:tc>
           <w:tcPr>
-            <w:tcW w:type="dxa" w:w="8928"/>
+            <w:tcW w:type="dxa" w:w="7920"/>
           </w:tcPr>
           <w:p>
             <w:pPr>
@@ -1785,7 +1784,7 @@
         </w:tc>
         <w:tc>
           <w:tcPr>
-            <w:tcW w:type="dxa" w:w="2232"/>
+            <w:tcW w:type="dxa" w:w="2304"/>
           </w:tcPr>
           <w:p>
             <w:pPr>
@@ -1802,7 +1801,24 @@
         </w:tc>
         <w:tc>
           <w:tcPr>
-            <w:tcW w:type="dxa" w:w="1080"/>
+            <w:tcW w:type="dxa" w:w="893"/>
+          </w:tcPr>
+          <w:p>
+            <w:pPr>
+              <w:spacing w:after="20"/>
+            </w:pPr>
+            <w:r>
+              <w:rPr>
+                <w:color w:val="1C3A36"/>
+                <w:sz w:val="15"/>
+              </w:rPr>
+              <w:t>Company</w:t>
+            </w:r>
+          </w:p>
+        </w:tc>
+        <w:tc>
+          <w:tcPr>
+            <w:tcW w:type="dxa" w:w="1123"/>
           </w:tcPr>
           <w:p>
             <w:pPr>
@@ -1819,7 +1835,7 @@
         </w:tc>
         <w:tc>
           <w:tcPr>
-            <w:tcW w:type="dxa" w:w="8928"/>
+            <w:tcW w:type="dxa" w:w="7920"/>
           </w:tcPr>
           <w:p>
             <w:pPr>
@@ -1855,7 +1871,7 @@
         </w:tc>
         <w:tc>
           <w:tcPr>
-            <w:tcW w:type="dxa" w:w="2232"/>
+            <w:tcW w:type="dxa" w:w="2304"/>
           </w:tcPr>
           <w:p>
             <w:pPr>
@@ -1872,7 +1888,24 @@
         </w:tc>
         <w:tc>
           <w:tcPr>
-            <w:tcW w:type="dxa" w:w="1080"/>
+            <w:tcW w:type="dxa" w:w="893"/>
+          </w:tcPr>
+          <w:p>
+            <w:pPr>
+              <w:spacing w:after="20"/>
+            </w:pPr>
+            <w:r>
+              <w:rPr>
+                <w:color w:val="1C3A36"/>
+                <w:sz w:val="15"/>
+              </w:rPr>
+              <w:t>Company</w:t>
+            </w:r>
+          </w:p>
+        </w:tc>
+        <w:tc>
+          <w:tcPr>
+            <w:tcW w:type="dxa" w:w="1123"/>
           </w:tcPr>
           <w:p>
             <w:pPr>
@@ -1889,7 +1922,7 @@
         </w:tc>
         <w:tc>
           <w:tcPr>
-            <w:tcW w:type="dxa" w:w="8928"/>
+            <w:tcW w:type="dxa" w:w="7920"/>
           </w:tcPr>
           <w:p>
             <w:pPr>
@@ -1925,7 +1958,7 @@
         </w:tc>
         <w:tc>
           <w:tcPr>
-            <w:tcW w:type="dxa" w:w="2232"/>
+            <w:tcW w:type="dxa" w:w="2304"/>
           </w:tcPr>
           <w:p>
             <w:pPr>
@@ -1942,7 +1975,24 @@
         </w:tc>
         <w:tc>
           <w:tcPr>
-            <w:tcW w:type="dxa" w:w="1080"/>
+            <w:tcW w:type="dxa" w:w="893"/>
+          </w:tcPr>
+          <w:p>
+            <w:pPr>
+              <w:spacing w:after="20"/>
+            </w:pPr>
+            <w:r>
+              <w:rPr>
+                <w:color w:val="1C3A36"/>
+                <w:sz w:val="15"/>
+              </w:rPr>
+              <w:t>Company</w:t>
+            </w:r>
+          </w:p>
+        </w:tc>
+        <w:tc>
+          <w:tcPr>
+            <w:tcW w:type="dxa" w:w="1123"/>
           </w:tcPr>
           <w:p>
             <w:pPr>
@@ -1959,7 +2009,7 @@
         </w:tc>
         <w:tc>
           <w:tcPr>
-            <w:tcW w:type="dxa" w:w="8928"/>
+            <w:tcW w:type="dxa" w:w="7920"/>
           </w:tcPr>
           <w:p>
             <w:pPr>
@@ -1995,7 +2045,7 @@
         </w:tc>
         <w:tc>
           <w:tcPr>
-            <w:tcW w:type="dxa" w:w="2232"/>
+            <w:tcW w:type="dxa" w:w="2304"/>
           </w:tcPr>
           <w:p>
             <w:pPr>
@@ -2012,7 +2062,24 @@
         </w:tc>
         <w:tc>
           <w:tcPr>
-            <w:tcW w:type="dxa" w:w="1080"/>
+            <w:tcW w:type="dxa" w:w="893"/>
+          </w:tcPr>
+          <w:p>
+            <w:pPr>
+              <w:spacing w:after="20"/>
+            </w:pPr>
+            <w:r>
+              <w:rPr>
+                <w:color w:val="1C3A36"/>
+                <w:sz w:val="15"/>
+              </w:rPr>
+              <w:t>Company</w:t>
+            </w:r>
+          </w:p>
+        </w:tc>
+        <w:tc>
+          <w:tcPr>
+            <w:tcW w:type="dxa" w:w="1123"/>
           </w:tcPr>
           <w:p>
             <w:pPr>
@@ -2029,7 +2096,7 @@
         </w:tc>
         <w:tc>
           <w:tcPr>
-            <w:tcW w:type="dxa" w:w="8928"/>
+            <w:tcW w:type="dxa" w:w="7920"/>
           </w:tcPr>
           <w:p>
             <w:pPr>
@@ -2065,7 +2132,7 @@
         </w:tc>
         <w:tc>
           <w:tcPr>
-            <w:tcW w:type="dxa" w:w="2232"/>
+            <w:tcW w:type="dxa" w:w="2304"/>
           </w:tcPr>
           <w:p>
             <w:pPr>
@@ -2082,7 +2149,24 @@
         </w:tc>
         <w:tc>
           <w:tcPr>
-            <w:tcW w:type="dxa" w:w="1080"/>
+            <w:tcW w:type="dxa" w:w="893"/>
+          </w:tcPr>
+          <w:p>
+            <w:pPr>
+              <w:spacing w:after="20"/>
+            </w:pPr>
+            <w:r>
+              <w:rPr>
+                <w:color w:val="1C3A36"/>
+                <w:sz w:val="15"/>
+              </w:rPr>
+              <w:t>Company</w:t>
+            </w:r>
+          </w:p>
+        </w:tc>
+        <w:tc>
+          <w:tcPr>
+            <w:tcW w:type="dxa" w:w="1123"/>
           </w:tcPr>
           <w:p>
             <w:pPr>
@@ -2099,7 +2183,7 @@
         </w:tc>
         <w:tc>
           <w:tcPr>
-            <w:tcW w:type="dxa" w:w="8928"/>
+            <w:tcW w:type="dxa" w:w="7920"/>
           </w:tcPr>
           <w:p>
             <w:pPr>
@@ -2135,7 +2219,7 @@
         </w:tc>
         <w:tc>
           <w:tcPr>
-            <w:tcW w:type="dxa" w:w="2232"/>
+            <w:tcW w:type="dxa" w:w="2304"/>
           </w:tcPr>
           <w:p>
             <w:pPr>
@@ -2152,7 +2236,24 @@
         </w:tc>
         <w:tc>
           <w:tcPr>
-            <w:tcW w:type="dxa" w:w="1080"/>
+            <w:tcW w:type="dxa" w:w="893"/>
+          </w:tcPr>
+          <w:p>
+            <w:pPr>
+              <w:spacing w:after="20"/>
+            </w:pPr>
+            <w:r>
+              <w:rPr>
+                <w:color w:val="1C3A36"/>
+                <w:sz w:val="15"/>
+              </w:rPr>
+              <w:t>Company</w:t>
+            </w:r>
+          </w:p>
+        </w:tc>
+        <w:tc>
+          <w:tcPr>
+            <w:tcW w:type="dxa" w:w="1123"/>
           </w:tcPr>
           <w:p>
             <w:pPr>
@@ -2169,7 +2270,7 @@
         </w:tc>
         <w:tc>
           <w:tcPr>
-            <w:tcW w:type="dxa" w:w="8928"/>
+            <w:tcW w:type="dxa" w:w="7920"/>
           </w:tcPr>
           <w:p>
             <w:pPr>
@@ -2205,7 +2306,7 @@
         </w:tc>
         <w:tc>
           <w:tcPr>
-            <w:tcW w:type="dxa" w:w="2232"/>
+            <w:tcW w:type="dxa" w:w="2304"/>
           </w:tcPr>
           <w:p>
             <w:pPr>
@@ -2222,7 +2323,24 @@
         </w:tc>
         <w:tc>
           <w:tcPr>
-            <w:tcW w:type="dxa" w:w="1080"/>
+            <w:tcW w:type="dxa" w:w="893"/>
+          </w:tcPr>
+          <w:p>
+            <w:pPr>
+              <w:spacing w:after="20"/>
+            </w:pPr>
+            <w:r>
+              <w:rPr>
+                <w:color w:val="1C3A36"/>
+                <w:sz w:val="15"/>
+              </w:rPr>
+              <w:t>Company</w:t>
+            </w:r>
+          </w:p>
+        </w:tc>
+        <w:tc>
+          <w:tcPr>
+            <w:tcW w:type="dxa" w:w="1123"/>
           </w:tcPr>
           <w:p>
             <w:pPr>
@@ -2239,7 +2357,7 @@
         </w:tc>
         <w:tc>
           <w:tcPr>
-            <w:tcW w:type="dxa" w:w="8928"/>
+            <w:tcW w:type="dxa" w:w="7920"/>
           </w:tcPr>
           <w:p>
             <w:pPr>
@@ -2275,7 +2393,7 @@
         </w:tc>
         <w:tc>
           <w:tcPr>
-            <w:tcW w:type="dxa" w:w="2232"/>
+            <w:tcW w:type="dxa" w:w="2304"/>
           </w:tcPr>
           <w:p>
             <w:pPr>
@@ -2292,7 +2410,24 @@
         </w:tc>
         <w:tc>
           <w:tcPr>
-            <w:tcW w:type="dxa" w:w="1080"/>
+            <w:tcW w:type="dxa" w:w="893"/>
+          </w:tcPr>
+          <w:p>
+            <w:pPr>
+              <w:spacing w:after="20"/>
+            </w:pPr>
+            <w:r>
+              <w:rPr>
+                <w:color w:val="1C3A36"/>
+                <w:sz w:val="15"/>
+              </w:rPr>
+              <w:t>Company</w:t>
+            </w:r>
+          </w:p>
+        </w:tc>
+        <w:tc>
+          <w:tcPr>
+            <w:tcW w:type="dxa" w:w="1123"/>
           </w:tcPr>
           <w:p>
             <w:pPr>
@@ -2309,7 +2444,7 @@
         </w:tc>
         <w:tc>
           <w:tcPr>
-            <w:tcW w:type="dxa" w:w="8928"/>
+            <w:tcW w:type="dxa" w:w="7920"/>
           </w:tcPr>
           <w:p>
             <w:pPr>
@@ -2345,7 +2480,7 @@
         </w:tc>
         <w:tc>
           <w:tcPr>
-            <w:tcW w:type="dxa" w:w="2232"/>
+            <w:tcW w:type="dxa" w:w="2304"/>
           </w:tcPr>
           <w:p>
             <w:pPr>
@@ -2362,7 +2497,24 @@
         </w:tc>
         <w:tc>
           <w:tcPr>
-            <w:tcW w:type="dxa" w:w="1080"/>
+            <w:tcW w:type="dxa" w:w="893"/>
+          </w:tcPr>
+          <w:p>
+            <w:pPr>
+              <w:spacing w:after="20"/>
+            </w:pPr>
+            <w:r>
+              <w:rPr>
+                <w:color w:val="1C3A36"/>
+                <w:sz w:val="15"/>
+              </w:rPr>
+              <w:t>Company</w:t>
+            </w:r>
+          </w:p>
+        </w:tc>
+        <w:tc>
+          <w:tcPr>
+            <w:tcW w:type="dxa" w:w="1123"/>
           </w:tcPr>
           <w:p>
             <w:pPr>
@@ -2379,7 +2531,7 @@
         </w:tc>
         <w:tc>
           <w:tcPr>
-            <w:tcW w:type="dxa" w:w="8928"/>
+            <w:tcW w:type="dxa" w:w="7920"/>
           </w:tcPr>
           <w:p>
             <w:pPr>
@@ -2415,7 +2567,7 @@
         </w:tc>
         <w:tc>
           <w:tcPr>
-            <w:tcW w:type="dxa" w:w="2232"/>
+            <w:tcW w:type="dxa" w:w="2304"/>
           </w:tcPr>
           <w:p>
             <w:pPr>
@@ -2432,7 +2584,24 @@
         </w:tc>
         <w:tc>
           <w:tcPr>
-            <w:tcW w:type="dxa" w:w="1080"/>
+            <w:tcW w:type="dxa" w:w="893"/>
+          </w:tcPr>
+          <w:p>
+            <w:pPr>
+              <w:spacing w:after="20"/>
+            </w:pPr>
+            <w:r>
+              <w:rPr>
+                <w:color w:val="1C3A36"/>
+                <w:sz w:val="15"/>
+              </w:rPr>
+              <w:t>Company</w:t>
+            </w:r>
+          </w:p>
+        </w:tc>
+        <w:tc>
+          <w:tcPr>
+            <w:tcW w:type="dxa" w:w="1123"/>
           </w:tcPr>
           <w:p>
             <w:pPr>
@@ -2449,7 +2618,7 @@
         </w:tc>
         <w:tc>
           <w:tcPr>
-            <w:tcW w:type="dxa" w:w="8928"/>
+            <w:tcW w:type="dxa" w:w="7920"/>
           </w:tcPr>
           <w:p>
             <w:pPr>
@@ -2485,7 +2654,7 @@
         </w:tc>
         <w:tc>
           <w:tcPr>
-            <w:tcW w:type="dxa" w:w="2232"/>
+            <w:tcW w:type="dxa" w:w="2304"/>
           </w:tcPr>
           <w:p>
             <w:pPr>
@@ -2502,7 +2671,24 @@
         </w:tc>
         <w:tc>
           <w:tcPr>
-            <w:tcW w:type="dxa" w:w="1080"/>
+            <w:tcW w:type="dxa" w:w="893"/>
+          </w:tcPr>
+          <w:p>
+            <w:pPr>
+              <w:spacing w:after="20"/>
+            </w:pPr>
+            <w:r>
+              <w:rPr>
+                <w:color w:val="1C3A36"/>
+                <w:sz w:val="15"/>
+              </w:rPr>
+              <w:t>Company</w:t>
+            </w:r>
+          </w:p>
+        </w:tc>
+        <w:tc>
+          <w:tcPr>
+            <w:tcW w:type="dxa" w:w="1123"/>
           </w:tcPr>
           <w:p>
             <w:pPr>
@@ -2519,7 +2705,7 @@
         </w:tc>
         <w:tc>
           <w:tcPr>
-            <w:tcW w:type="dxa" w:w="8928"/>
+            <w:tcW w:type="dxa" w:w="7920"/>
           </w:tcPr>
           <w:p>
             <w:pPr>
@@ -2555,7 +2741,7 @@
         </w:tc>
         <w:tc>
           <w:tcPr>
-            <w:tcW w:type="dxa" w:w="2232"/>
+            <w:tcW w:type="dxa" w:w="2304"/>
           </w:tcPr>
           <w:p>
             <w:pPr>
@@ -2572,7 +2758,24 @@
         </w:tc>
         <w:tc>
           <w:tcPr>
-            <w:tcW w:type="dxa" w:w="1080"/>
+            <w:tcW w:type="dxa" w:w="893"/>
+          </w:tcPr>
+          <w:p>
+            <w:pPr>
+              <w:spacing w:after="20"/>
+            </w:pPr>
+            <w:r>
+              <w:rPr>
+                <w:color w:val="1C3A36"/>
+                <w:sz w:val="15"/>
+              </w:rPr>
+              <w:t>Company</w:t>
+            </w:r>
+          </w:p>
+        </w:tc>
+        <w:tc>
+          <w:tcPr>
+            <w:tcW w:type="dxa" w:w="1123"/>
           </w:tcPr>
           <w:p>
             <w:pPr>
@@ -2589,7 +2792,7 @@
         </w:tc>
         <w:tc>
           <w:tcPr>
-            <w:tcW w:type="dxa" w:w="8928"/>
+            <w:tcW w:type="dxa" w:w="7920"/>
           </w:tcPr>
           <w:p>
             <w:pPr>
@@ -2625,7 +2828,7 @@
         </w:tc>
         <w:tc>
           <w:tcPr>
-            <w:tcW w:type="dxa" w:w="2232"/>
+            <w:tcW w:type="dxa" w:w="2304"/>
           </w:tcPr>
           <w:p>
             <w:pPr>
@@ -2642,7 +2845,24 @@
         </w:tc>
         <w:tc>
           <w:tcPr>
-            <w:tcW w:type="dxa" w:w="1080"/>
+            <w:tcW w:type="dxa" w:w="893"/>
+          </w:tcPr>
+          <w:p>
+            <w:pPr>
+              <w:spacing w:after="20"/>
+            </w:pPr>
+            <w:r>
+              <w:rPr>
+                <w:color w:val="1C3A36"/>
+                <w:sz w:val="15"/>
+              </w:rPr>
+              <w:t>Company</w:t>
+            </w:r>
+          </w:p>
+        </w:tc>
+        <w:tc>
+          <w:tcPr>
+            <w:tcW w:type="dxa" w:w="1123"/>
           </w:tcPr>
           <w:p>
             <w:pPr>
@@ -2659,7 +2879,7 @@
         </w:tc>
         <w:tc>
           <w:tcPr>
-            <w:tcW w:type="dxa" w:w="8928"/>
+            <w:tcW w:type="dxa" w:w="7920"/>
           </w:tcPr>
           <w:p>
             <w:pPr>
@@ -2695,7 +2915,7 @@
         </w:tc>
         <w:tc>
           <w:tcPr>
-            <w:tcW w:type="dxa" w:w="2232"/>
+            <w:tcW w:type="dxa" w:w="2304"/>
           </w:tcPr>
           <w:p>
             <w:pPr>
@@ -2712,7 +2932,24 @@
         </w:tc>
         <w:tc>
           <w:tcPr>
-            <w:tcW w:type="dxa" w:w="1080"/>
+            <w:tcW w:type="dxa" w:w="893"/>
+          </w:tcPr>
+          <w:p>
+            <w:pPr>
+              <w:spacing w:after="20"/>
+            </w:pPr>
+            <w:r>
+              <w:rPr>
+                <w:color w:val="1C3A36"/>
+                <w:sz w:val="15"/>
+              </w:rPr>
+              <w:t>Company</w:t>
+            </w:r>
+          </w:p>
+        </w:tc>
+        <w:tc>
+          <w:tcPr>
+            <w:tcW w:type="dxa" w:w="1123"/>
           </w:tcPr>
           <w:p>
             <w:pPr>
@@ -2729,7 +2966,7 @@
         </w:tc>
         <w:tc>
           <w:tcPr>
-            <w:tcW w:type="dxa" w:w="8928"/>
+            <w:tcW w:type="dxa" w:w="7920"/>
           </w:tcPr>
           <w:p>
             <w:pPr>
@@ -2765,7 +3002,7 @@
         </w:tc>
         <w:tc>
           <w:tcPr>
-            <w:tcW w:type="dxa" w:w="2232"/>
+            <w:tcW w:type="dxa" w:w="2304"/>
           </w:tcPr>
           <w:p>
             <w:pPr>
@@ -2782,7 +3019,24 @@
         </w:tc>
         <w:tc>
           <w:tcPr>
-            <w:tcW w:type="dxa" w:w="1080"/>
+            <w:tcW w:type="dxa" w:w="893"/>
+          </w:tcPr>
+          <w:p>
+            <w:pPr>
+              <w:spacing w:after="20"/>
+            </w:pPr>
+            <w:r>
+              <w:rPr>
+                <w:color w:val="1C3A36"/>
+                <w:sz w:val="15"/>
+              </w:rPr>
+              <w:t>Company</w:t>
+            </w:r>
+          </w:p>
+        </w:tc>
+        <w:tc>
+          <w:tcPr>
+            <w:tcW w:type="dxa" w:w="1123"/>
           </w:tcPr>
           <w:p>
             <w:pPr>
@@ -2799,7 +3053,7 @@
         </w:tc>
         <w:tc>
           <w:tcPr>
-            <w:tcW w:type="dxa" w:w="8928"/>
+            <w:tcW w:type="dxa" w:w="7920"/>
           </w:tcPr>
           <w:p>
             <w:pPr>
@@ -2835,7 +3089,7 @@
         </w:tc>
         <w:tc>
           <w:tcPr>
-            <w:tcW w:type="dxa" w:w="2232"/>
+            <w:tcW w:type="dxa" w:w="2304"/>
           </w:tcPr>
           <w:p>
             <w:pPr>
@@ -2852,7 +3106,24 @@
         </w:tc>
         <w:tc>
           <w:tcPr>
-            <w:tcW w:type="dxa" w:w="1080"/>
+            <w:tcW w:type="dxa" w:w="893"/>
+          </w:tcPr>
+          <w:p>
+            <w:pPr>
+              <w:spacing w:after="20"/>
+            </w:pPr>
+            <w:r>
+              <w:rPr>
+                <w:color w:val="1C3A36"/>
+                <w:sz w:val="15"/>
+              </w:rPr>
+              <w:t>Company</w:t>
+            </w:r>
+          </w:p>
+        </w:tc>
+        <w:tc>
+          <w:tcPr>
+            <w:tcW w:type="dxa" w:w="1123"/>
           </w:tcPr>
           <w:p>
             <w:pPr>
@@ -2869,7 +3140,7 @@
         </w:tc>
         <w:tc>
           <w:tcPr>
-            <w:tcW w:type="dxa" w:w="8928"/>
+            <w:tcW w:type="dxa" w:w="7920"/>
           </w:tcPr>
           <w:p>
             <w:pPr>
@@ -2905,7 +3176,7 @@
         </w:tc>
         <w:tc>
           <w:tcPr>
-            <w:tcW w:type="dxa" w:w="2232"/>
+            <w:tcW w:type="dxa" w:w="2304"/>
           </w:tcPr>
           <w:p>
             <w:pPr>
@@ -2922,7 +3193,24 @@
         </w:tc>
         <w:tc>
           <w:tcPr>
-            <w:tcW w:type="dxa" w:w="1080"/>
+            <w:tcW w:type="dxa" w:w="893"/>
+          </w:tcPr>
+          <w:p>
+            <w:pPr>
+              <w:spacing w:after="20"/>
+            </w:pPr>
+            <w:r>
+              <w:rPr>
+                <w:color w:val="1C3A36"/>
+                <w:sz w:val="15"/>
+              </w:rPr>
+              <w:t>Company</w:t>
+            </w:r>
+          </w:p>
+        </w:tc>
+        <w:tc>
+          <w:tcPr>
+            <w:tcW w:type="dxa" w:w="1123"/>
           </w:tcPr>
           <w:p>
             <w:pPr>
@@ -2939,7 +3227,7 @@
         </w:tc>
         <w:tc>
           <w:tcPr>
-            <w:tcW w:type="dxa" w:w="8928"/>
+            <w:tcW w:type="dxa" w:w="7920"/>
           </w:tcPr>
           <w:p>
             <w:pPr>
@@ -2975,7 +3263,7 @@
         </w:tc>
         <w:tc>
           <w:tcPr>
-            <w:tcW w:type="dxa" w:w="2232"/>
+            <w:tcW w:type="dxa" w:w="2304"/>
           </w:tcPr>
           <w:p>
             <w:pPr>
@@ -2992,7 +3280,24 @@
         </w:tc>
         <w:tc>
           <w:tcPr>
-            <w:tcW w:type="dxa" w:w="1080"/>
+            <w:tcW w:type="dxa" w:w="893"/>
+          </w:tcPr>
+          <w:p>
+            <w:pPr>
+              <w:spacing w:after="20"/>
+            </w:pPr>
+            <w:r>
+              <w:rPr>
+                <w:color w:val="1C3A36"/>
+                <w:sz w:val="15"/>
+              </w:rPr>
+              <w:t>Company</w:t>
+            </w:r>
+          </w:p>
+        </w:tc>
+        <w:tc>
+          <w:tcPr>
+            <w:tcW w:type="dxa" w:w="1123"/>
           </w:tcPr>
           <w:p>
             <w:pPr>
@@ -3009,7 +3314,7 @@
         </w:tc>
         <w:tc>
           <w:tcPr>
-            <w:tcW w:type="dxa" w:w="8928"/>
+            <w:tcW w:type="dxa" w:w="7920"/>
           </w:tcPr>
           <w:p>
             <w:pPr>
@@ -3045,7 +3350,7 @@
         </w:tc>
         <w:tc>
           <w:tcPr>
-            <w:tcW w:type="dxa" w:w="2232"/>
+            <w:tcW w:type="dxa" w:w="2304"/>
           </w:tcPr>
           <w:p>
             <w:pPr>
@@ -3062,7 +3367,24 @@
         </w:tc>
         <w:tc>
           <w:tcPr>
-            <w:tcW w:type="dxa" w:w="1080"/>
+            <w:tcW w:type="dxa" w:w="893"/>
+          </w:tcPr>
+          <w:p>
+            <w:pPr>
+              <w:spacing w:after="20"/>
+            </w:pPr>
+            <w:r>
+              <w:rPr>
+                <w:color w:val="1C3A36"/>
+                <w:sz w:val="15"/>
+              </w:rPr>
+              <w:t>Company</w:t>
+            </w:r>
+          </w:p>
+        </w:tc>
+        <w:tc>
+          <w:tcPr>
+            <w:tcW w:type="dxa" w:w="1123"/>
           </w:tcPr>
           <w:p>
             <w:pPr>
@@ -3079,7 +3401,7 @@
         </w:tc>
         <w:tc>
           <w:tcPr>
-            <w:tcW w:type="dxa" w:w="8928"/>
+            <w:tcW w:type="dxa" w:w="7920"/>
           </w:tcPr>
           <w:p>
             <w:pPr>
@@ -3115,7 +3437,7 @@
         </w:tc>
         <w:tc>
           <w:tcPr>
-            <w:tcW w:type="dxa" w:w="2232"/>
+            <w:tcW w:type="dxa" w:w="2304"/>
           </w:tcPr>
           <w:p>
             <w:pPr>
@@ -3132,7 +3454,24 @@
         </w:tc>
         <w:tc>
           <w:tcPr>
-            <w:tcW w:type="dxa" w:w="1080"/>
+            <w:tcW w:type="dxa" w:w="893"/>
+          </w:tcPr>
+          <w:p>
+            <w:pPr>
+              <w:spacing w:after="20"/>
+            </w:pPr>
+            <w:r>
+              <w:rPr>
+                <w:color w:val="1C3A36"/>
+                <w:sz w:val="15"/>
+              </w:rPr>
+              <w:t>Company</w:t>
+            </w:r>
+          </w:p>
+        </w:tc>
+        <w:tc>
+          <w:tcPr>
+            <w:tcW w:type="dxa" w:w="1123"/>
           </w:tcPr>
           <w:p>
             <w:pPr>
@@ -3149,7 +3488,7 @@
         </w:tc>
         <w:tc>
           <w:tcPr>
-            <w:tcW w:type="dxa" w:w="8928"/>
+            <w:tcW w:type="dxa" w:w="7920"/>
           </w:tcPr>
           <w:p>
             <w:pPr>
@@ -3185,7 +3524,7 @@
         </w:tc>
         <w:tc>
           <w:tcPr>
-            <w:tcW w:type="dxa" w:w="2232"/>
+            <w:tcW w:type="dxa" w:w="2304"/>
           </w:tcPr>
           <w:p>
             <w:pPr>
@@ -3202,7 +3541,24 @@
         </w:tc>
         <w:tc>
           <w:tcPr>
-            <w:tcW w:type="dxa" w:w="1080"/>
+            <w:tcW w:type="dxa" w:w="893"/>
+          </w:tcPr>
+          <w:p>
+            <w:pPr>
+              <w:spacing w:after="20"/>
+            </w:pPr>
+            <w:r>
+              <w:rPr>
+                <w:color w:val="1C3A36"/>
+                <w:sz w:val="15"/>
+              </w:rPr>
+              <w:t>Company</w:t>
+            </w:r>
+          </w:p>
+        </w:tc>
+        <w:tc>
+          <w:tcPr>
+            <w:tcW w:type="dxa" w:w="1123"/>
           </w:tcPr>
           <w:p>
             <w:pPr>
@@ -3219,7 +3575,7 @@
         </w:tc>
         <w:tc>
           <w:tcPr>
-            <w:tcW w:type="dxa" w:w="8928"/>
+            <w:tcW w:type="dxa" w:w="7920"/>
           </w:tcPr>
           <w:p>
             <w:pPr>
@@ -3255,7 +3611,7 @@
         </w:tc>
         <w:tc>
           <w:tcPr>
-            <w:tcW w:type="dxa" w:w="2232"/>
+            <w:tcW w:type="dxa" w:w="2304"/>
           </w:tcPr>
           <w:p>
             <w:pPr>
@@ -3272,7 +3628,24 @@
         </w:tc>
         <w:tc>
           <w:tcPr>
-            <w:tcW w:type="dxa" w:w="1080"/>
+            <w:tcW w:type="dxa" w:w="893"/>
+          </w:tcPr>
+          <w:p>
+            <w:pPr>
+              <w:spacing w:after="20"/>
+            </w:pPr>
+            <w:r>
+              <w:rPr>
+                <w:color w:val="1C3A36"/>
+                <w:sz w:val="15"/>
+              </w:rPr>
+              <w:t>Company</w:t>
+            </w:r>
+          </w:p>
+        </w:tc>
+        <w:tc>
+          <w:tcPr>
+            <w:tcW w:type="dxa" w:w="1123"/>
           </w:tcPr>
           <w:p>
             <w:pPr>
@@ -3289,7 +3662,7 @@
         </w:tc>
         <w:tc>
           <w:tcPr>
-            <w:tcW w:type="dxa" w:w="8928"/>
+            <w:tcW w:type="dxa" w:w="7920"/>
           </w:tcPr>
           <w:p>
             <w:pPr>
@@ -3325,7 +3698,7 @@
         </w:tc>
         <w:tc>
           <w:tcPr>
-            <w:tcW w:type="dxa" w:w="2232"/>
+            <w:tcW w:type="dxa" w:w="2304"/>
           </w:tcPr>
           <w:p>
             <w:pPr>
@@ -3342,7 +3715,24 @@
         </w:tc>
         <w:tc>
           <w:tcPr>
-            <w:tcW w:type="dxa" w:w="1080"/>
+            <w:tcW w:type="dxa" w:w="893"/>
+          </w:tcPr>
+          <w:p>
+            <w:pPr>
+              <w:spacing w:after="20"/>
+            </w:pPr>
+            <w:r>
+              <w:rPr>
+                <w:color w:val="1C3A36"/>
+                <w:sz w:val="15"/>
+              </w:rPr>
+              <w:t>Company</w:t>
+            </w:r>
+          </w:p>
+        </w:tc>
+        <w:tc>
+          <w:tcPr>
+            <w:tcW w:type="dxa" w:w="1123"/>
           </w:tcPr>
           <w:p>
             <w:pPr>
@@ -3359,7 +3749,7 @@
         </w:tc>
         <w:tc>
           <w:tcPr>
-            <w:tcW w:type="dxa" w:w="8928"/>
+            <w:tcW w:type="dxa" w:w="7920"/>
           </w:tcPr>
           <w:p>
             <w:pPr>
@@ -3395,7 +3785,7 @@
         </w:tc>
         <w:tc>
           <w:tcPr>
-            <w:tcW w:type="dxa" w:w="2232"/>
+            <w:tcW w:type="dxa" w:w="2304"/>
           </w:tcPr>
           <w:p>
             <w:pPr>
@@ -3412,7 +3802,24 @@
         </w:tc>
         <w:tc>
           <w:tcPr>
-            <w:tcW w:type="dxa" w:w="1080"/>
+            <w:tcW w:type="dxa" w:w="893"/>
+          </w:tcPr>
+          <w:p>
+            <w:pPr>
+              <w:spacing w:after="20"/>
+            </w:pPr>
+            <w:r>
+              <w:rPr>
+                <w:color w:val="1C3A36"/>
+                <w:sz w:val="15"/>
+              </w:rPr>
+              <w:t>Company</w:t>
+            </w:r>
+          </w:p>
+        </w:tc>
+        <w:tc>
+          <w:tcPr>
+            <w:tcW w:type="dxa" w:w="1123"/>
           </w:tcPr>
           <w:p>
             <w:pPr>
@@ -3429,7 +3836,7 @@
         </w:tc>
         <w:tc>
           <w:tcPr>
-            <w:tcW w:type="dxa" w:w="8928"/>
+            <w:tcW w:type="dxa" w:w="7920"/>
           </w:tcPr>
           <w:p>
             <w:pPr>
@@ -3465,7 +3872,7 @@
         </w:tc>
         <w:tc>
           <w:tcPr>
-            <w:tcW w:type="dxa" w:w="2232"/>
+            <w:tcW w:type="dxa" w:w="2304"/>
           </w:tcPr>
           <w:p>
             <w:pPr>
@@ -3482,7 +3889,24 @@
         </w:tc>
         <w:tc>
           <w:tcPr>
-            <w:tcW w:type="dxa" w:w="1080"/>
+            <w:tcW w:type="dxa" w:w="893"/>
+          </w:tcPr>
+          <w:p>
+            <w:pPr>
+              <w:spacing w:after="20"/>
+            </w:pPr>
+            <w:r>
+              <w:rPr>
+                <w:color w:val="1C3A36"/>
+                <w:sz w:val="15"/>
+              </w:rPr>
+              <w:t>Company</w:t>
+            </w:r>
+          </w:p>
+        </w:tc>
+        <w:tc>
+          <w:tcPr>
+            <w:tcW w:type="dxa" w:w="1123"/>
           </w:tcPr>
           <w:p>
             <w:pPr>
@@ -3499,7 +3923,7 @@
         </w:tc>
         <w:tc>
           <w:tcPr>
-            <w:tcW w:type="dxa" w:w="8928"/>
+            <w:tcW w:type="dxa" w:w="7920"/>
           </w:tcPr>
           <w:p>
             <w:pPr>
@@ -3535,7 +3959,7 @@
         </w:tc>
         <w:tc>
           <w:tcPr>
-            <w:tcW w:type="dxa" w:w="2232"/>
+            <w:tcW w:type="dxa" w:w="2304"/>
           </w:tcPr>
           <w:p>
             <w:pPr>
@@ -3552,7 +3976,24 @@
         </w:tc>
         <w:tc>
           <w:tcPr>
-            <w:tcW w:type="dxa" w:w="1080"/>
+            <w:tcW w:type="dxa" w:w="893"/>
+          </w:tcPr>
+          <w:p>
+            <w:pPr>
+              <w:spacing w:after="20"/>
+            </w:pPr>
+            <w:r>
+              <w:rPr>
+                <w:color w:val="1C3A36"/>
+                <w:sz w:val="15"/>
+              </w:rPr>
+              <w:t>Company</w:t>
+            </w:r>
+          </w:p>
+        </w:tc>
+        <w:tc>
+          <w:tcPr>
+            <w:tcW w:type="dxa" w:w="1123"/>
           </w:tcPr>
           <w:p>
             <w:pPr>
@@ -3569,7 +4010,7 @@
         </w:tc>
         <w:tc>
           <w:tcPr>
-            <w:tcW w:type="dxa" w:w="8928"/>
+            <w:tcW w:type="dxa" w:w="7920"/>
           </w:tcPr>
           <w:p>
             <w:pPr>
@@ -3605,7 +4046,7 @@
         </w:tc>
         <w:tc>
           <w:tcPr>
-            <w:tcW w:type="dxa" w:w="2232"/>
+            <w:tcW w:type="dxa" w:w="2304"/>
           </w:tcPr>
           <w:p>
             <w:pPr>
@@ -3622,7 +4063,24 @@
         </w:tc>
         <w:tc>
           <w:tcPr>
-            <w:tcW w:type="dxa" w:w="1080"/>
+            <w:tcW w:type="dxa" w:w="893"/>
+          </w:tcPr>
+          <w:p>
+            <w:pPr>
+              <w:spacing w:after="20"/>
+            </w:pPr>
+            <w:r>
+              <w:rPr>
+                <w:color w:val="1C3A36"/>
+                <w:sz w:val="15"/>
+              </w:rPr>
+              <w:t>Company</w:t>
+            </w:r>
+          </w:p>
+        </w:tc>
+        <w:tc>
+          <w:tcPr>
+            <w:tcW w:type="dxa" w:w="1123"/>
           </w:tcPr>
           <w:p>
             <w:pPr>
@@ -3639,7 +4097,7 @@
         </w:tc>
         <w:tc>
           <w:tcPr>
-            <w:tcW w:type="dxa" w:w="8928"/>
+            <w:tcW w:type="dxa" w:w="7920"/>
           </w:tcPr>
           <w:p>
             <w:pPr>
@@ -3675,7 +4133,7 @@
         </w:tc>
         <w:tc>
           <w:tcPr>
-            <w:tcW w:type="dxa" w:w="2232"/>
+            <w:tcW w:type="dxa" w:w="2304"/>
           </w:tcPr>
           <w:p>
             <w:pPr>
@@ -3692,7 +4150,24 @@
         </w:tc>
         <w:tc>
           <w:tcPr>
-            <w:tcW w:type="dxa" w:w="1080"/>
+            <w:tcW w:type="dxa" w:w="893"/>
+          </w:tcPr>
+          <w:p>
+            <w:pPr>
+              <w:spacing w:after="20"/>
+            </w:pPr>
+            <w:r>
+              <w:rPr>
+                <w:color w:val="1C3A36"/>
+                <w:sz w:val="15"/>
+              </w:rPr>
+              <w:t>Company</w:t>
+            </w:r>
+          </w:p>
+        </w:tc>
+        <w:tc>
+          <w:tcPr>
+            <w:tcW w:type="dxa" w:w="1123"/>
           </w:tcPr>
           <w:p>
             <w:pPr>
@@ -3709,7 +4184,7 @@
         </w:tc>
         <w:tc>
           <w:tcPr>
-            <w:tcW w:type="dxa" w:w="8928"/>
+            <w:tcW w:type="dxa" w:w="7920"/>
           </w:tcPr>
           <w:p>
             <w:pPr>
@@ -3745,7 +4220,7 @@
         </w:tc>
         <w:tc>
           <w:tcPr>
-            <w:tcW w:type="dxa" w:w="2232"/>
+            <w:tcW w:type="dxa" w:w="2304"/>
           </w:tcPr>
           <w:p>
             <w:pPr>
@@ -3762,7 +4237,24 @@
         </w:tc>
         <w:tc>
           <w:tcPr>
-            <w:tcW w:type="dxa" w:w="1080"/>
+            <w:tcW w:type="dxa" w:w="893"/>
+          </w:tcPr>
+          <w:p>
+            <w:pPr>
+              <w:spacing w:after="20"/>
+            </w:pPr>
+            <w:r>
+              <w:rPr>
+                <w:color w:val="1C3A36"/>
+                <w:sz w:val="15"/>
+              </w:rPr>
+              <w:t>Company</w:t>
+            </w:r>
+          </w:p>
+        </w:tc>
+        <w:tc>
+          <w:tcPr>
+            <w:tcW w:type="dxa" w:w="1123"/>
           </w:tcPr>
           <w:p>
             <w:pPr>
@@ -3779,7 +4271,7 @@
         </w:tc>
         <w:tc>
           <w:tcPr>
-            <w:tcW w:type="dxa" w:w="8928"/>
+            <w:tcW w:type="dxa" w:w="7920"/>
           </w:tcPr>
           <w:p>
             <w:pPr>
@@ -3815,7 +4307,7 @@
         </w:tc>
         <w:tc>
           <w:tcPr>
-            <w:tcW w:type="dxa" w:w="2232"/>
+            <w:tcW w:type="dxa" w:w="2304"/>
           </w:tcPr>
           <w:p>
             <w:pPr>
@@ -3832,7 +4324,24 @@
         </w:tc>
         <w:tc>
           <w:tcPr>
-            <w:tcW w:type="dxa" w:w="1080"/>
+            <w:tcW w:type="dxa" w:w="893"/>
+          </w:tcPr>
+          <w:p>
+            <w:pPr>
+              <w:spacing w:after="20"/>
+            </w:pPr>
+            <w:r>
+              <w:rPr>
+                <w:color w:val="1C3A36"/>
+                <w:sz w:val="15"/>
+              </w:rPr>
+              <w:t>Company</w:t>
+            </w:r>
+          </w:p>
+        </w:tc>
+        <w:tc>
+          <w:tcPr>
+            <w:tcW w:type="dxa" w:w="1123"/>
           </w:tcPr>
           <w:p>
             <w:pPr>
@@ -3849,7 +4358,7 @@
         </w:tc>
         <w:tc>
           <w:tcPr>
-            <w:tcW w:type="dxa" w:w="8928"/>
+            <w:tcW w:type="dxa" w:w="7920"/>
           </w:tcPr>
           <w:p>
             <w:pPr>
@@ -3885,7 +4394,7 @@
         </w:tc>
         <w:tc>
           <w:tcPr>
-            <w:tcW w:type="dxa" w:w="2232"/>
+            <w:tcW w:type="dxa" w:w="2304"/>
           </w:tcPr>
           <w:p>
             <w:pPr>
@@ -3902,7 +4411,24 @@
         </w:tc>
         <w:tc>
           <w:tcPr>
-            <w:tcW w:type="dxa" w:w="1080"/>
+            <w:tcW w:type="dxa" w:w="893"/>
+          </w:tcPr>
+          <w:p>
+            <w:pPr>
+              <w:spacing w:after="20"/>
+            </w:pPr>
+            <w:r>
+              <w:rPr>
+                <w:color w:val="1C3A36"/>
+                <w:sz w:val="15"/>
+              </w:rPr>
+              <w:t>Company</w:t>
+            </w:r>
+          </w:p>
+        </w:tc>
+        <w:tc>
+          <w:tcPr>
+            <w:tcW w:type="dxa" w:w="1123"/>
           </w:tcPr>
           <w:p>
             <w:pPr>
@@ -3919,7 +4445,7 @@
         </w:tc>
         <w:tc>
           <w:tcPr>
-            <w:tcW w:type="dxa" w:w="8928"/>
+            <w:tcW w:type="dxa" w:w="7920"/>
           </w:tcPr>
           <w:p>
             <w:pPr>
@@ -3955,7 +4481,7 @@
         </w:tc>
         <w:tc>
           <w:tcPr>
-            <w:tcW w:type="dxa" w:w="2232"/>
+            <w:tcW w:type="dxa" w:w="2304"/>
           </w:tcPr>
           <w:p>
             <w:pPr>
@@ -3972,7 +4498,24 @@
         </w:tc>
         <w:tc>
           <w:tcPr>
-            <w:tcW w:type="dxa" w:w="1080"/>
+            <w:tcW w:type="dxa" w:w="893"/>
+          </w:tcPr>
+          <w:p>
+            <w:pPr>
+              <w:spacing w:after="20"/>
+            </w:pPr>
+            <w:r>
+              <w:rPr>
+                <w:color w:val="1C3A36"/>
+                <w:sz w:val="15"/>
+              </w:rPr>
+              <w:t>Company</w:t>
+            </w:r>
+          </w:p>
+        </w:tc>
+        <w:tc>
+          <w:tcPr>
+            <w:tcW w:type="dxa" w:w="1123"/>
           </w:tcPr>
           <w:p>
             <w:pPr>
@@ -3989,7 +4532,7 @@
         </w:tc>
         <w:tc>
           <w:tcPr>
-            <w:tcW w:type="dxa" w:w="8928"/>
+            <w:tcW w:type="dxa" w:w="7920"/>
           </w:tcPr>
           <w:p>
             <w:pPr>
@@ -4025,7 +4568,7 @@
         </w:tc>
         <w:tc>
           <w:tcPr>
-            <w:tcW w:type="dxa" w:w="2232"/>
+            <w:tcW w:type="dxa" w:w="2304"/>
           </w:tcPr>
           <w:p>
             <w:pPr>
@@ -4042,7 +4585,24 @@
         </w:tc>
         <w:tc>
           <w:tcPr>
-            <w:tcW w:type="dxa" w:w="1080"/>
+            <w:tcW w:type="dxa" w:w="893"/>
+          </w:tcPr>
+          <w:p>
+            <w:pPr>
+              <w:spacing w:after="20"/>
+            </w:pPr>
+            <w:r>
+              <w:rPr>
+                <w:color w:val="1C3A36"/>
+                <w:sz w:val="15"/>
+              </w:rPr>
+              <w:t>Company</w:t>
+            </w:r>
+          </w:p>
+        </w:tc>
+        <w:tc>
+          <w:tcPr>
+            <w:tcW w:type="dxa" w:w="1123"/>
           </w:tcPr>
           <w:p>
             <w:pPr>
@@ -4059,7 +4619,7 @@
         </w:tc>
         <w:tc>
           <w:tcPr>
-            <w:tcW w:type="dxa" w:w="8928"/>
+            <w:tcW w:type="dxa" w:w="7920"/>
           </w:tcPr>
           <w:p>
             <w:pPr>
@@ -4095,7 +4655,7 @@
         </w:tc>
         <w:tc>
           <w:tcPr>
-            <w:tcW w:type="dxa" w:w="2232"/>
+            <w:tcW w:type="dxa" w:w="2304"/>
           </w:tcPr>
           <w:p>
             <w:pPr>
@@ -4112,7 +4672,24 @@
         </w:tc>
         <w:tc>
           <w:tcPr>
-            <w:tcW w:type="dxa" w:w="1080"/>
+            <w:tcW w:type="dxa" w:w="893"/>
+          </w:tcPr>
+          <w:p>
+            <w:pPr>
+              <w:spacing w:after="20"/>
+            </w:pPr>
+            <w:r>
+              <w:rPr>
+                <w:color w:val="1C3A36"/>
+                <w:sz w:val="15"/>
+              </w:rPr>
+              <w:t>Company</w:t>
+            </w:r>
+          </w:p>
+        </w:tc>
+        <w:tc>
+          <w:tcPr>
+            <w:tcW w:type="dxa" w:w="1123"/>
           </w:tcPr>
           <w:p>
             <w:pPr>
@@ -4129,7 +4706,7 @@
         </w:tc>
         <w:tc>
           <w:tcPr>
-            <w:tcW w:type="dxa" w:w="8928"/>
+            <w:tcW w:type="dxa" w:w="7920"/>
           </w:tcPr>
           <w:p>
             <w:pPr>
@@ -4165,7 +4742,7 @@
         </w:tc>
         <w:tc>
           <w:tcPr>
-            <w:tcW w:type="dxa" w:w="2232"/>
+            <w:tcW w:type="dxa" w:w="2304"/>
           </w:tcPr>
           <w:p>
             <w:pPr>
@@ -4182,7 +4759,24 @@
         </w:tc>
         <w:tc>
           <w:tcPr>
-            <w:tcW w:type="dxa" w:w="1080"/>
+            <w:tcW w:type="dxa" w:w="893"/>
+          </w:tcPr>
+          <w:p>
+            <w:pPr>
+              <w:spacing w:after="20"/>
+            </w:pPr>
+            <w:r>
+              <w:rPr>
+                <w:color w:val="1C3A36"/>
+                <w:sz w:val="15"/>
+              </w:rPr>
+              <w:t>Company</w:t>
+            </w:r>
+          </w:p>
+        </w:tc>
+        <w:tc>
+          <w:tcPr>
+            <w:tcW w:type="dxa" w:w="1123"/>
           </w:tcPr>
           <w:p>
             <w:pPr>
@@ -4199,7 +4793,7 @@
         </w:tc>
         <w:tc>
           <w:tcPr>
-            <w:tcW w:type="dxa" w:w="8928"/>
+            <w:tcW w:type="dxa" w:w="7920"/>
           </w:tcPr>
           <w:p>
             <w:pPr>
@@ -4235,7 +4829,7 @@
         </w:tc>
         <w:tc>
           <w:tcPr>
-            <w:tcW w:type="dxa" w:w="2232"/>
+            <w:tcW w:type="dxa" w:w="2304"/>
           </w:tcPr>
           <w:p>
             <w:pPr>
@@ -4252,7 +4846,24 @@
         </w:tc>
         <w:tc>
           <w:tcPr>
-            <w:tcW w:type="dxa" w:w="1080"/>
+            <w:tcW w:type="dxa" w:w="893"/>
+          </w:tcPr>
+          <w:p>
+            <w:pPr>
+              <w:spacing w:after="20"/>
+            </w:pPr>
+            <w:r>
+              <w:rPr>
+                <w:color w:val="1C3A36"/>
+                <w:sz w:val="15"/>
+              </w:rPr>
+              <w:t>Company</w:t>
+            </w:r>
+          </w:p>
+        </w:tc>
+        <w:tc>
+          <w:tcPr>
+            <w:tcW w:type="dxa" w:w="1123"/>
           </w:tcPr>
           <w:p>
             <w:pPr>
@@ -4269,7 +4880,7 @@
         </w:tc>
         <w:tc>
           <w:tcPr>
-            <w:tcW w:type="dxa" w:w="8928"/>
+            <w:tcW w:type="dxa" w:w="7920"/>
           </w:tcPr>
           <w:p>
             <w:pPr>
@@ -4305,7 +4916,7 @@
         </w:tc>
         <w:tc>
           <w:tcPr>
-            <w:tcW w:type="dxa" w:w="2232"/>
+            <w:tcW w:type="dxa" w:w="2304"/>
           </w:tcPr>
           <w:p>
             <w:pPr>
@@ -4322,7 +4933,24 @@
         </w:tc>
         <w:tc>
           <w:tcPr>
-            <w:tcW w:type="dxa" w:w="1080"/>
+            <w:tcW w:type="dxa" w:w="893"/>
+          </w:tcPr>
+          <w:p>
+            <w:pPr>
+              <w:spacing w:after="20"/>
+            </w:pPr>
+            <w:r>
+              <w:rPr>
+                <w:color w:val="1C3A36"/>
+                <w:sz w:val="15"/>
+              </w:rPr>
+              <w:t>Company</w:t>
+            </w:r>
+          </w:p>
+        </w:tc>
+        <w:tc>
+          <w:tcPr>
+            <w:tcW w:type="dxa" w:w="1123"/>
           </w:tcPr>
           <w:p>
             <w:pPr>
@@ -4339,7 +4967,7 @@
         </w:tc>
         <w:tc>
           <w:tcPr>
-            <w:tcW w:type="dxa" w:w="8928"/>
+            <w:tcW w:type="dxa" w:w="7920"/>
           </w:tcPr>
           <w:p>
             <w:pPr>
@@ -4375,7 +5003,7 @@
         </w:tc>
         <w:tc>
           <w:tcPr>
-            <w:tcW w:type="dxa" w:w="2232"/>
+            <w:tcW w:type="dxa" w:w="2304"/>
           </w:tcPr>
           <w:p>
             <w:pPr>
@@ -4392,7 +5020,24 @@
         </w:tc>
         <w:tc>
           <w:tcPr>
-            <w:tcW w:type="dxa" w:w="1080"/>
+            <w:tcW w:type="dxa" w:w="893"/>
+          </w:tcPr>
+          <w:p>
+            <w:pPr>
+              <w:spacing w:after="20"/>
+            </w:pPr>
+            <w:r>
+              <w:rPr>
+                <w:color w:val="1C3A36"/>
+                <w:sz w:val="15"/>
+              </w:rPr>
+              <w:t>Company</w:t>
+            </w:r>
+          </w:p>
+        </w:tc>
+        <w:tc>
+          <w:tcPr>
+            <w:tcW w:type="dxa" w:w="1123"/>
           </w:tcPr>
           <w:p>
             <w:pPr>
@@ -4409,7 +5054,7 @@
         </w:tc>
         <w:tc>
           <w:tcPr>
-            <w:tcW w:type="dxa" w:w="8928"/>
+            <w:tcW w:type="dxa" w:w="7920"/>
           </w:tcPr>
           <w:p>
             <w:pPr>
@@ -4445,7 +5090,7 @@
         </w:tc>
         <w:tc>
           <w:tcPr>
-            <w:tcW w:type="dxa" w:w="2232"/>
+            <w:tcW w:type="dxa" w:w="2304"/>
           </w:tcPr>
           <w:p>
             <w:pPr>
@@ -4462,7 +5107,24 @@
         </w:tc>
         <w:tc>
           <w:tcPr>
-            <w:tcW w:type="dxa" w:w="1080"/>
+            <w:tcW w:type="dxa" w:w="893"/>
+          </w:tcPr>
+          <w:p>
+            <w:pPr>
+              <w:spacing w:after="20"/>
+            </w:pPr>
+            <w:r>
+              <w:rPr>
+                <w:color w:val="1C3A36"/>
+                <w:sz w:val="15"/>
+              </w:rPr>
+              <w:t>Company</w:t>
+            </w:r>
+          </w:p>
+        </w:tc>
+        <w:tc>
+          <w:tcPr>
+            <w:tcW w:type="dxa" w:w="1123"/>
           </w:tcPr>
           <w:p>
             <w:pPr>
@@ -4479,7 +5141,7 @@
         </w:tc>
         <w:tc>
           <w:tcPr>
-            <w:tcW w:type="dxa" w:w="8928"/>
+            <w:tcW w:type="dxa" w:w="7920"/>
           </w:tcPr>
           <w:p>
             <w:pPr>
@@ -4515,7 +5177,7 @@
         </w:tc>
         <w:tc>
           <w:tcPr>
-            <w:tcW w:type="dxa" w:w="2232"/>
+            <w:tcW w:type="dxa" w:w="2304"/>
           </w:tcPr>
           <w:p>
             <w:pPr>
@@ -4532,7 +5194,24 @@
         </w:tc>
         <w:tc>
           <w:tcPr>
-            <w:tcW w:type="dxa" w:w="1080"/>
+            <w:tcW w:type="dxa" w:w="893"/>
+          </w:tcPr>
+          <w:p>
+            <w:pPr>
+              <w:spacing w:after="20"/>
+            </w:pPr>
+            <w:r>
+              <w:rPr>
+                <w:color w:val="1C3A36"/>
+                <w:sz w:val="15"/>
+              </w:rPr>
+              <w:t>Company</w:t>
+            </w:r>
+          </w:p>
+        </w:tc>
+        <w:tc>
+          <w:tcPr>
+            <w:tcW w:type="dxa" w:w="1123"/>
           </w:tcPr>
           <w:p>
             <w:pPr>
@@ -4549,7 +5228,7 @@
         </w:tc>
         <w:tc>
           <w:tcPr>
-            <w:tcW w:type="dxa" w:w="8928"/>
+            <w:tcW w:type="dxa" w:w="7920"/>
           </w:tcPr>
           <w:p>
             <w:pPr>
@@ -4585,7 +5264,7 @@
         </w:tc>
         <w:tc>
           <w:tcPr>
-            <w:tcW w:type="dxa" w:w="2232"/>
+            <w:tcW w:type="dxa" w:w="2304"/>
           </w:tcPr>
           <w:p>
             <w:pPr>
@@ -4602,7 +5281,24 @@
         </w:tc>
         <w:tc>
           <w:tcPr>
-            <w:tcW w:type="dxa" w:w="1080"/>
+            <w:tcW w:type="dxa" w:w="893"/>
+          </w:tcPr>
+          <w:p>
+            <w:pPr>
+              <w:spacing w:after="20"/>
+            </w:pPr>
+            <w:r>
+              <w:rPr>
+                <w:color w:val="1C3A36"/>
+                <w:sz w:val="15"/>
+              </w:rPr>
+              <w:t>Company</w:t>
+            </w:r>
+          </w:p>
+        </w:tc>
+        <w:tc>
+          <w:tcPr>
+            <w:tcW w:type="dxa" w:w="1123"/>
           </w:tcPr>
           <w:p>
             <w:pPr>
@@ -4619,7 +5315,7 @@
         </w:tc>
         <w:tc>
           <w:tcPr>
-            <w:tcW w:type="dxa" w:w="8928"/>
+            <w:tcW w:type="dxa" w:w="7920"/>
           </w:tcPr>
           <w:p>
             <w:pPr>
@@ -4655,7 +5351,7 @@
         </w:tc>
         <w:tc>
           <w:tcPr>
-            <w:tcW w:type="dxa" w:w="2232"/>
+            <w:tcW w:type="dxa" w:w="2304"/>
           </w:tcPr>
           <w:p>
             <w:pPr>
@@ -4672,7 +5368,24 @@
         </w:tc>
         <w:tc>
           <w:tcPr>
-            <w:tcW w:type="dxa" w:w="1080"/>
+            <w:tcW w:type="dxa" w:w="893"/>
+          </w:tcPr>
+          <w:p>
+            <w:pPr>
+              <w:spacing w:after="20"/>
+            </w:pPr>
+            <w:r>
+              <w:rPr>
+                <w:color w:val="1C3A36"/>
+                <w:sz w:val="15"/>
+              </w:rPr>
+              <w:t>Company</w:t>
+            </w:r>
+          </w:p>
+        </w:tc>
+        <w:tc>
+          <w:tcPr>
+            <w:tcW w:type="dxa" w:w="1123"/>
           </w:tcPr>
           <w:p>
             <w:pPr>
@@ -4689,7 +5402,7 @@
         </w:tc>
         <w:tc>
           <w:tcPr>
-            <w:tcW w:type="dxa" w:w="8928"/>
+            <w:tcW w:type="dxa" w:w="7920"/>
           </w:tcPr>
           <w:p>
             <w:pPr>
@@ -4725,7 +5438,7 @@
         </w:tc>
         <w:tc>
           <w:tcPr>
-            <w:tcW w:type="dxa" w:w="2232"/>
+            <w:tcW w:type="dxa" w:w="2304"/>
           </w:tcPr>
           <w:p>
             <w:pPr>
@@ -4742,7 +5455,24 @@
         </w:tc>
         <w:tc>
           <w:tcPr>
-            <w:tcW w:type="dxa" w:w="1080"/>
+            <w:tcW w:type="dxa" w:w="893"/>
+          </w:tcPr>
+          <w:p>
+            <w:pPr>
+              <w:spacing w:after="20"/>
+            </w:pPr>
+            <w:r>
+              <w:rPr>
+                <w:color w:val="1C3A36"/>
+                <w:sz w:val="15"/>
+              </w:rPr>
+              <w:t>Company</w:t>
+            </w:r>
+          </w:p>
+        </w:tc>
+        <w:tc>
+          <w:tcPr>
+            <w:tcW w:type="dxa" w:w="1123"/>
           </w:tcPr>
           <w:p>
             <w:pPr>
@@ -4759,7 +5489,7 @@
         </w:tc>
         <w:tc>
           <w:tcPr>
-            <w:tcW w:type="dxa" w:w="8928"/>
+            <w:tcW w:type="dxa" w:w="7920"/>
           </w:tcPr>
           <w:p>
             <w:pPr>
@@ -4795,7 +5525,7 @@
         </w:tc>
         <w:tc>
           <w:tcPr>
-            <w:tcW w:type="dxa" w:w="2232"/>
+            <w:tcW w:type="dxa" w:w="2304"/>
           </w:tcPr>
           <w:p>
             <w:pPr>
@@ -4812,7 +5542,24 @@
         </w:tc>
         <w:tc>
           <w:tcPr>
-            <w:tcW w:type="dxa" w:w="1080"/>
+            <w:tcW w:type="dxa" w:w="893"/>
+          </w:tcPr>
+          <w:p>
+            <w:pPr>
+              <w:spacing w:after="20"/>
+            </w:pPr>
+            <w:r>
+              <w:rPr>
+                <w:color w:val="1C3A36"/>
+                <w:sz w:val="15"/>
+              </w:rPr>
+              <w:t>Company</w:t>
+            </w:r>
+          </w:p>
+        </w:tc>
+        <w:tc>
+          <w:tcPr>
+            <w:tcW w:type="dxa" w:w="1123"/>
           </w:tcPr>
           <w:p>
             <w:pPr>
@@ -4829,7 +5576,7 @@
         </w:tc>
         <w:tc>
           <w:tcPr>
-            <w:tcW w:type="dxa" w:w="8928"/>
+            <w:tcW w:type="dxa" w:w="7920"/>
           </w:tcPr>
           <w:p>
             <w:pPr>
@@ -4865,7 +5612,7 @@
         </w:tc>
         <w:tc>
           <w:tcPr>
-            <w:tcW w:type="dxa" w:w="2232"/>
+            <w:tcW w:type="dxa" w:w="2304"/>
           </w:tcPr>
           <w:p>
             <w:pPr>
@@ -4882,7 +5629,24 @@
         </w:tc>
         <w:tc>
           <w:tcPr>
-            <w:tcW w:type="dxa" w:w="1080"/>
+            <w:tcW w:type="dxa" w:w="893"/>
+          </w:tcPr>
+          <w:p>
+            <w:pPr>
+              <w:spacing w:after="20"/>
+            </w:pPr>
+            <w:r>
+              <w:rPr>
+                <w:color w:val="1C3A36"/>
+                <w:sz w:val="15"/>
+              </w:rPr>
+              <w:t>Company</w:t>
+            </w:r>
+          </w:p>
+        </w:tc>
+        <w:tc>
+          <w:tcPr>
+            <w:tcW w:type="dxa" w:w="1123"/>
           </w:tcPr>
           <w:p>
             <w:pPr>
@@ -4899,7 +5663,7 @@
         </w:tc>
         <w:tc>
           <w:tcPr>
-            <w:tcW w:type="dxa" w:w="8928"/>
+            <w:tcW w:type="dxa" w:w="7920"/>
           </w:tcPr>
           <w:p>
             <w:pPr>
@@ -4935,7 +5699,7 @@
         </w:tc>
         <w:tc>
           <w:tcPr>
-            <w:tcW w:type="dxa" w:w="2232"/>
+            <w:tcW w:type="dxa" w:w="2304"/>
           </w:tcPr>
           <w:p>
             <w:pPr>
@@ -4952,7 +5716,24 @@
         </w:tc>
         <w:tc>
           <w:tcPr>
-            <w:tcW w:type="dxa" w:w="1080"/>
+            <w:tcW w:type="dxa" w:w="893"/>
+          </w:tcPr>
+          <w:p>
+            <w:pPr>
+              <w:spacing w:after="20"/>
+            </w:pPr>
+            <w:r>
+              <w:rPr>
+                <w:color w:val="1C3A36"/>
+                <w:sz w:val="15"/>
+              </w:rPr>
+              <w:t>Company</w:t>
+            </w:r>
+          </w:p>
+        </w:tc>
+        <w:tc>
+          <w:tcPr>
+            <w:tcW w:type="dxa" w:w="1123"/>
           </w:tcPr>
           <w:p>
             <w:pPr>
@@ -4969,7 +5750,7 @@
         </w:tc>
         <w:tc>
           <w:tcPr>
-            <w:tcW w:type="dxa" w:w="8928"/>
+            <w:tcW w:type="dxa" w:w="7920"/>
           </w:tcPr>
           <w:p>
             <w:pPr>
@@ -5005,7 +5786,7 @@
         </w:tc>
         <w:tc>
           <w:tcPr>
-            <w:tcW w:type="dxa" w:w="2232"/>
+            <w:tcW w:type="dxa" w:w="2304"/>
           </w:tcPr>
           <w:p>
             <w:pPr>
@@ -5022,7 +5803,24 @@
         </w:tc>
         <w:tc>
           <w:tcPr>
-            <w:tcW w:type="dxa" w:w="1080"/>
+            <w:tcW w:type="dxa" w:w="893"/>
+          </w:tcPr>
+          <w:p>
+            <w:pPr>
+              <w:spacing w:after="20"/>
+            </w:pPr>
+            <w:r>
+              <w:rPr>
+                <w:color w:val="1C3A36"/>
+                <w:sz w:val="15"/>
+              </w:rPr>
+              <w:t>Company</w:t>
+            </w:r>
+          </w:p>
+        </w:tc>
+        <w:tc>
+          <w:tcPr>
+            <w:tcW w:type="dxa" w:w="1123"/>
           </w:tcPr>
           <w:p>
             <w:pPr>
@@ -5039,7 +5837,7 @@
         </w:tc>
         <w:tc>
           <w:tcPr>
-            <w:tcW w:type="dxa" w:w="8928"/>
+            <w:tcW w:type="dxa" w:w="7920"/>
           </w:tcPr>
           <w:p>
             <w:pPr>
@@ -5075,7 +5873,7 @@
         </w:tc>
         <w:tc>
           <w:tcPr>
-            <w:tcW w:type="dxa" w:w="2232"/>
+            <w:tcW w:type="dxa" w:w="2304"/>
           </w:tcPr>
           <w:p>
             <w:pPr>
@@ -5092,7 +5890,24 @@
         </w:tc>
         <w:tc>
           <w:tcPr>
-            <w:tcW w:type="dxa" w:w="1080"/>
+            <w:tcW w:type="dxa" w:w="893"/>
+          </w:tcPr>
+          <w:p>
+            <w:pPr>
+              <w:spacing w:after="20"/>
+            </w:pPr>
+            <w:r>
+              <w:rPr>
+                <w:color w:val="1C3A36"/>
+                <w:sz w:val="15"/>
+              </w:rPr>
+              <w:t>Company</w:t>
+            </w:r>
+          </w:p>
+        </w:tc>
+        <w:tc>
+          <w:tcPr>
+            <w:tcW w:type="dxa" w:w="1123"/>
           </w:tcPr>
           <w:p>
             <w:pPr>
@@ -5109,7 +5924,7 @@
         </w:tc>
         <w:tc>
           <w:tcPr>
-            <w:tcW w:type="dxa" w:w="8928"/>
+            <w:tcW w:type="dxa" w:w="7920"/>
           </w:tcPr>
           <w:p>
             <w:pPr>
@@ -5145,7 +5960,7 @@
         </w:tc>
         <w:tc>
           <w:tcPr>
-            <w:tcW w:type="dxa" w:w="2232"/>
+            <w:tcW w:type="dxa" w:w="2304"/>
           </w:tcPr>
           <w:p>
             <w:pPr>
@@ -5162,7 +5977,24 @@
         </w:tc>
         <w:tc>
           <w:tcPr>
-            <w:tcW w:type="dxa" w:w="1080"/>
+            <w:tcW w:type="dxa" w:w="893"/>
+          </w:tcPr>
+          <w:p>
+            <w:pPr>
+              <w:spacing w:after="20"/>
+            </w:pPr>
+            <w:r>
+              <w:rPr>
+                <w:color w:val="1C3A36"/>
+                <w:sz w:val="15"/>
+              </w:rPr>
+              <w:t>Company</w:t>
+            </w:r>
+          </w:p>
+        </w:tc>
+        <w:tc>
+          <w:tcPr>
+            <w:tcW w:type="dxa" w:w="1123"/>
           </w:tcPr>
           <w:p>
             <w:pPr>
@@ -5179,7 +6011,7 @@
         </w:tc>
         <w:tc>
           <w:tcPr>
-            <w:tcW w:type="dxa" w:w="8928"/>
+            <w:tcW w:type="dxa" w:w="7920"/>
           </w:tcPr>
           <w:p>
             <w:pPr>
@@ -5215,7 +6047,7 @@
         </w:tc>
         <w:tc>
           <w:tcPr>
-            <w:tcW w:type="dxa" w:w="2232"/>
+            <w:tcW w:type="dxa" w:w="2304"/>
           </w:tcPr>
           <w:p>
             <w:pPr>
@@ -5232,7 +6064,24 @@
         </w:tc>
         <w:tc>
           <w:tcPr>
-            <w:tcW w:type="dxa" w:w="1080"/>
+            <w:tcW w:type="dxa" w:w="893"/>
+          </w:tcPr>
+          <w:p>
+            <w:pPr>
+              <w:spacing w:after="20"/>
+            </w:pPr>
+            <w:r>
+              <w:rPr>
+                <w:color w:val="1C3A36"/>
+                <w:sz w:val="15"/>
+              </w:rPr>
+              <w:t>Company</w:t>
+            </w:r>
+          </w:p>
+        </w:tc>
+        <w:tc>
+          <w:tcPr>
+            <w:tcW w:type="dxa" w:w="1123"/>
           </w:tcPr>
           <w:p>
             <w:pPr>
@@ -5249,7 +6098,7 @@
         </w:tc>
         <w:tc>
           <w:tcPr>
-            <w:tcW w:type="dxa" w:w="8928"/>
+            <w:tcW w:type="dxa" w:w="7920"/>
           </w:tcPr>
           <w:p>
             <w:pPr>
@@ -5285,7 +6134,7 @@
         </w:tc>
         <w:tc>
           <w:tcPr>
-            <w:tcW w:type="dxa" w:w="2232"/>
+            <w:tcW w:type="dxa" w:w="2304"/>
           </w:tcPr>
           <w:p>
             <w:pPr>
@@ -5302,7 +6151,24 @@
         </w:tc>
         <w:tc>
           <w:tcPr>
-            <w:tcW w:type="dxa" w:w="1080"/>
+            <w:tcW w:type="dxa" w:w="893"/>
+          </w:tcPr>
+          <w:p>
+            <w:pPr>
+              <w:spacing w:after="20"/>
+            </w:pPr>
+            <w:r>
+              <w:rPr>
+                <w:color w:val="1C3A36"/>
+                <w:sz w:val="15"/>
+              </w:rPr>
+              <w:t>Company</w:t>
+            </w:r>
+          </w:p>
+        </w:tc>
+        <w:tc>
+          <w:tcPr>
+            <w:tcW w:type="dxa" w:w="1123"/>
           </w:tcPr>
           <w:p>
             <w:pPr>
@@ -5319,7 +6185,7 @@
         </w:tc>
         <w:tc>
           <w:tcPr>
-            <w:tcW w:type="dxa" w:w="8928"/>
+            <w:tcW w:type="dxa" w:w="7920"/>
           </w:tcPr>
           <w:p>
             <w:pPr>
@@ -5355,7 +6221,7 @@
         </w:tc>
         <w:tc>
           <w:tcPr>
-            <w:tcW w:type="dxa" w:w="2232"/>
+            <w:tcW w:type="dxa" w:w="2304"/>
           </w:tcPr>
           <w:p>
             <w:pPr>
@@ -5372,7 +6238,24 @@
         </w:tc>
         <w:tc>
           <w:tcPr>
-            <w:tcW w:type="dxa" w:w="1080"/>
+            <w:tcW w:type="dxa" w:w="893"/>
+          </w:tcPr>
+          <w:p>
+            <w:pPr>
+              <w:spacing w:after="20"/>
+            </w:pPr>
+            <w:r>
+              <w:rPr>
+                <w:color w:val="1C3A36"/>
+                <w:sz w:val="15"/>
+              </w:rPr>
+              <w:t>Company</w:t>
+            </w:r>
+          </w:p>
+        </w:tc>
+        <w:tc>
+          <w:tcPr>
+            <w:tcW w:type="dxa" w:w="1123"/>
           </w:tcPr>
           <w:p>
             <w:pPr>
@@ -5389,7 +6272,7 @@
         </w:tc>
         <w:tc>
           <w:tcPr>
-            <w:tcW w:type="dxa" w:w="8928"/>
+            <w:tcW w:type="dxa" w:w="7920"/>
           </w:tcPr>
           <w:p>
             <w:pPr>
@@ -5425,7 +6308,7 @@
         </w:tc>
         <w:tc>
           <w:tcPr>
-            <w:tcW w:type="dxa" w:w="2232"/>
+            <w:tcW w:type="dxa" w:w="2304"/>
           </w:tcPr>
           <w:p>
             <w:pPr>
@@ -5442,7 +6325,24 @@
         </w:tc>
         <w:tc>
           <w:tcPr>
-            <w:tcW w:type="dxa" w:w="1080"/>
+            <w:tcW w:type="dxa" w:w="893"/>
+          </w:tcPr>
+          <w:p>
+            <w:pPr>
+              <w:spacing w:after="20"/>
+            </w:pPr>
+            <w:r>
+              <w:rPr>
+                <w:color w:val="1C3A36"/>
+                <w:sz w:val="15"/>
+              </w:rPr>
+              <w:t>Company</w:t>
+            </w:r>
+          </w:p>
+        </w:tc>
+        <w:tc>
+          <w:tcPr>
+            <w:tcW w:type="dxa" w:w="1123"/>
           </w:tcPr>
           <w:p>
             <w:pPr>
@@ -5459,7 +6359,7 @@
         </w:tc>
         <w:tc>
           <w:tcPr>
-            <w:tcW w:type="dxa" w:w="8928"/>
+            <w:tcW w:type="dxa" w:w="7920"/>
           </w:tcPr>
           <w:p>
             <w:pPr>
@@ -5495,7 +6395,7 @@
         </w:tc>
         <w:tc>
           <w:tcPr>
-            <w:tcW w:type="dxa" w:w="2232"/>
+            <w:tcW w:type="dxa" w:w="2304"/>
           </w:tcPr>
           <w:p>
             <w:pPr>
@@ -5512,7 +6412,24 @@
         </w:tc>
         <w:tc>
           <w:tcPr>
-            <w:tcW w:type="dxa" w:w="1080"/>
+            <w:tcW w:type="dxa" w:w="893"/>
+          </w:tcPr>
+          <w:p>
+            <w:pPr>
+              <w:spacing w:after="20"/>
+            </w:pPr>
+            <w:r>
+              <w:rPr>
+                <w:color w:val="1C3A36"/>
+                <w:sz w:val="15"/>
+              </w:rPr>
+              <w:t>Company</w:t>
+            </w:r>
+          </w:p>
+        </w:tc>
+        <w:tc>
+          <w:tcPr>
+            <w:tcW w:type="dxa" w:w="1123"/>
           </w:tcPr>
           <w:p>
             <w:pPr>
@@ -5529,7 +6446,7 @@
         </w:tc>
         <w:tc>
           <w:tcPr>
-            <w:tcW w:type="dxa" w:w="8928"/>
+            <w:tcW w:type="dxa" w:w="7920"/>
           </w:tcPr>
           <w:p>
             <w:pPr>
@@ -5565,7 +6482,7 @@
         </w:tc>
         <w:tc>
           <w:tcPr>
-            <w:tcW w:type="dxa" w:w="2232"/>
+            <w:tcW w:type="dxa" w:w="2304"/>
           </w:tcPr>
           <w:p>
             <w:pPr>
@@ -5582,7 +6499,24 @@
         </w:tc>
         <w:tc>
           <w:tcPr>
-            <w:tcW w:type="dxa" w:w="1080"/>
+            <w:tcW w:type="dxa" w:w="893"/>
+          </w:tcPr>
+          <w:p>
+            <w:pPr>
+              <w:spacing w:after="20"/>
+            </w:pPr>
+            <w:r>
+              <w:rPr>
+                <w:color w:val="1C3A36"/>
+                <w:sz w:val="15"/>
+              </w:rPr>
+              <w:t>Company</w:t>
+            </w:r>
+          </w:p>
+        </w:tc>
+        <w:tc>
+          <w:tcPr>
+            <w:tcW w:type="dxa" w:w="1123"/>
           </w:tcPr>
           <w:p>
             <w:pPr>
@@ -5599,7 +6533,7 @@
         </w:tc>
         <w:tc>
           <w:tcPr>
-            <w:tcW w:type="dxa" w:w="8928"/>
+            <w:tcW w:type="dxa" w:w="7920"/>
           </w:tcPr>
           <w:p>
             <w:pPr>
@@ -5635,7 +6569,7 @@
         </w:tc>
         <w:tc>
           <w:tcPr>
-            <w:tcW w:type="dxa" w:w="2232"/>
+            <w:tcW w:type="dxa" w:w="2304"/>
           </w:tcPr>
           <w:p>
             <w:pPr>
@@ -5652,7 +6586,24 @@
         </w:tc>
         <w:tc>
           <w:tcPr>
-            <w:tcW w:type="dxa" w:w="1080"/>
+            <w:tcW w:type="dxa" w:w="893"/>
+          </w:tcPr>
+          <w:p>
+            <w:pPr>
+              <w:spacing w:after="20"/>
+            </w:pPr>
+            <w:r>
+              <w:rPr>
+                <w:color w:val="1C3A36"/>
+                <w:sz w:val="15"/>
+              </w:rPr>
+              <w:t>Company</w:t>
+            </w:r>
+          </w:p>
+        </w:tc>
+        <w:tc>
+          <w:tcPr>
+            <w:tcW w:type="dxa" w:w="1123"/>
           </w:tcPr>
           <w:p>
             <w:pPr>
@@ -5669,7 +6620,7 @@
         </w:tc>
         <w:tc>
           <w:tcPr>
-            <w:tcW w:type="dxa" w:w="8928"/>
+            <w:tcW w:type="dxa" w:w="7920"/>
           </w:tcPr>
           <w:p>
             <w:pPr>
@@ -5705,7 +6656,7 @@
         </w:tc>
         <w:tc>
           <w:tcPr>
-            <w:tcW w:type="dxa" w:w="2232"/>
+            <w:tcW w:type="dxa" w:w="2304"/>
           </w:tcPr>
           <w:p>
             <w:pPr>
@@ -5722,7 +6673,24 @@
         </w:tc>
         <w:tc>
           <w:tcPr>
-            <w:tcW w:type="dxa" w:w="1080"/>
+            <w:tcW w:type="dxa" w:w="893"/>
+          </w:tcPr>
+          <w:p>
+            <w:pPr>
+              <w:spacing w:after="20"/>
+            </w:pPr>
+            <w:r>
+              <w:rPr>
+                <w:color w:val="1C3A36"/>
+                <w:sz w:val="15"/>
+              </w:rPr>
+              <w:t>Company</w:t>
+            </w:r>
+          </w:p>
+        </w:tc>
+        <w:tc>
+          <w:tcPr>
+            <w:tcW w:type="dxa" w:w="1123"/>
           </w:tcPr>
           <w:p>
             <w:pPr>
@@ -5739,7 +6707,7 @@
         </w:tc>
         <w:tc>
           <w:tcPr>
-            <w:tcW w:type="dxa" w:w="8928"/>
+            <w:tcW w:type="dxa" w:w="7920"/>
           </w:tcPr>
           <w:p>
             <w:pPr>
@@ -5775,7 +6743,7 @@
         </w:tc>
         <w:tc>
           <w:tcPr>
-            <w:tcW w:type="dxa" w:w="2232"/>
+            <w:tcW w:type="dxa" w:w="2304"/>
           </w:tcPr>
           <w:p>
             <w:pPr>
@@ -5792,7 +6760,24 @@
         </w:tc>
         <w:tc>
           <w:tcPr>
-            <w:tcW w:type="dxa" w:w="1080"/>
+            <w:tcW w:type="dxa" w:w="893"/>
+          </w:tcPr>
+          <w:p>
+            <w:pPr>
+              <w:spacing w:after="20"/>
+            </w:pPr>
+            <w:r>
+              <w:rPr>
+                <w:color w:val="1C3A36"/>
+                <w:sz w:val="15"/>
+              </w:rPr>
+              <w:t>Company</w:t>
+            </w:r>
+          </w:p>
+        </w:tc>
+        <w:tc>
+          <w:tcPr>
+            <w:tcW w:type="dxa" w:w="1123"/>
           </w:tcPr>
           <w:p>
             <w:pPr>
@@ -5809,7 +6794,7 @@
         </w:tc>
         <w:tc>
           <w:tcPr>
-            <w:tcW w:type="dxa" w:w="8928"/>
+            <w:tcW w:type="dxa" w:w="7920"/>
           </w:tcPr>
           <w:p>
             <w:pPr>
@@ -5845,7 +6830,7 @@
         </w:tc>
         <w:tc>
           <w:tcPr>
-            <w:tcW w:type="dxa" w:w="2232"/>
+            <w:tcW w:type="dxa" w:w="2304"/>
           </w:tcPr>
           <w:p>
             <w:pPr>
@@ -5862,7 +6847,24 @@
         </w:tc>
         <w:tc>
           <w:tcPr>
-            <w:tcW w:type="dxa" w:w="1080"/>
+            <w:tcW w:type="dxa" w:w="893"/>
+          </w:tcPr>
+          <w:p>
+            <w:pPr>
+              <w:spacing w:after="20"/>
+            </w:pPr>
+            <w:r>
+              <w:rPr>
+                <w:color w:val="1C3A36"/>
+                <w:sz w:val="15"/>
+              </w:rPr>
+              <w:t>Company</w:t>
+            </w:r>
+          </w:p>
+        </w:tc>
+        <w:tc>
+          <w:tcPr>
+            <w:tcW w:type="dxa" w:w="1123"/>
           </w:tcPr>
           <w:p>
             <w:pPr>
@@ -5879,7 +6881,7 @@
         </w:tc>
         <w:tc>
           <w:tcPr>
-            <w:tcW w:type="dxa" w:w="8928"/>
+            <w:tcW w:type="dxa" w:w="7920"/>
           </w:tcPr>
           <w:p>
             <w:pPr>
@@ -5915,7 +6917,7 @@
         </w:tc>
         <w:tc>
           <w:tcPr>
-            <w:tcW w:type="dxa" w:w="2232"/>
+            <w:tcW w:type="dxa" w:w="2304"/>
           </w:tcPr>
           <w:p>
             <w:pPr>
@@ -5932,7 +6934,24 @@
         </w:tc>
         <w:tc>
           <w:tcPr>
-            <w:tcW w:type="dxa" w:w="1080"/>
+            <w:tcW w:type="dxa" w:w="893"/>
+          </w:tcPr>
+          <w:p>
+            <w:pPr>
+              <w:spacing w:after="20"/>
+            </w:pPr>
+            <w:r>
+              <w:rPr>
+                <w:color w:val="1C3A36"/>
+                <w:sz w:val="15"/>
+              </w:rPr>
+              <w:t>Company</w:t>
+            </w:r>
+          </w:p>
+        </w:tc>
+        <w:tc>
+          <w:tcPr>
+            <w:tcW w:type="dxa" w:w="1123"/>
           </w:tcPr>
           <w:p>
             <w:pPr>
@@ -5949,7 +6968,7 @@
         </w:tc>
         <w:tc>
           <w:tcPr>
-            <w:tcW w:type="dxa" w:w="8928"/>
+            <w:tcW w:type="dxa" w:w="7920"/>
           </w:tcPr>
           <w:p>
             <w:pPr>
@@ -5985,7 +7004,7 @@
         </w:tc>
         <w:tc>
           <w:tcPr>
-            <w:tcW w:type="dxa" w:w="2232"/>
+            <w:tcW w:type="dxa" w:w="2304"/>
           </w:tcPr>
           <w:p>
             <w:pPr>
@@ -6002,7 +7021,24 @@
         </w:tc>
         <w:tc>
           <w:tcPr>
-            <w:tcW w:type="dxa" w:w="1080"/>
+            <w:tcW w:type="dxa" w:w="893"/>
+          </w:tcPr>
+          <w:p>
+            <w:pPr>
+              <w:spacing w:after="20"/>
+            </w:pPr>
+            <w:r>
+              <w:rPr>
+                <w:color w:val="1C3A36"/>
+                <w:sz w:val="15"/>
+              </w:rPr>
+              <w:t>Company</w:t>
+            </w:r>
+          </w:p>
+        </w:tc>
+        <w:tc>
+          <w:tcPr>
+            <w:tcW w:type="dxa" w:w="1123"/>
           </w:tcPr>
           <w:p>
             <w:pPr>
@@ -6019,7 +7055,7 @@
         </w:tc>
         <w:tc>
           <w:tcPr>
-            <w:tcW w:type="dxa" w:w="8928"/>
+            <w:tcW w:type="dxa" w:w="7920"/>
           </w:tcPr>
           <w:p>
             <w:pPr>
@@ -6055,7 +7091,7 @@
         </w:tc>
         <w:tc>
           <w:tcPr>
-            <w:tcW w:type="dxa" w:w="2232"/>
+            <w:tcW w:type="dxa" w:w="2304"/>
           </w:tcPr>
           <w:p>
             <w:pPr>
@@ -6072,7 +7108,24 @@
         </w:tc>
         <w:tc>
           <w:tcPr>
-            <w:tcW w:type="dxa" w:w="1080"/>
+            <w:tcW w:type="dxa" w:w="893"/>
+          </w:tcPr>
+          <w:p>
+            <w:pPr>
+              <w:spacing w:after="20"/>
+            </w:pPr>
+            <w:r>
+              <w:rPr>
+                <w:color w:val="1C3A36"/>
+                <w:sz w:val="15"/>
+              </w:rPr>
+              <w:t>Company</w:t>
+            </w:r>
+          </w:p>
+        </w:tc>
+        <w:tc>
+          <w:tcPr>
+            <w:tcW w:type="dxa" w:w="1123"/>
           </w:tcPr>
           <w:p>
             <w:pPr>
@@ -6089,7 +7142,7 @@
         </w:tc>
         <w:tc>
           <w:tcPr>
-            <w:tcW w:type="dxa" w:w="8928"/>
+            <w:tcW w:type="dxa" w:w="7920"/>
           </w:tcPr>
           <w:p>
             <w:pPr>
@@ -6125,7 +7178,7 @@
         </w:tc>
         <w:tc>
           <w:tcPr>
-            <w:tcW w:type="dxa" w:w="2232"/>
+            <w:tcW w:type="dxa" w:w="2304"/>
           </w:tcPr>
           <w:p>
             <w:pPr>
@@ -6142,7 +7195,24 @@
         </w:tc>
         <w:tc>
           <w:tcPr>
-            <w:tcW w:type="dxa" w:w="1080"/>
+            <w:tcW w:type="dxa" w:w="893"/>
+          </w:tcPr>
+          <w:p>
+            <w:pPr>
+              <w:spacing w:after="20"/>
+            </w:pPr>
+            <w:r>
+              <w:rPr>
+                <w:color w:val="1C3A36"/>
+                <w:sz w:val="15"/>
+              </w:rPr>
+              <w:t>Company</w:t>
+            </w:r>
+          </w:p>
+        </w:tc>
+        <w:tc>
+          <w:tcPr>
+            <w:tcW w:type="dxa" w:w="1123"/>
           </w:tcPr>
           <w:p>
             <w:pPr>
@@ -6159,7 +7229,7 @@
         </w:tc>
         <w:tc>
           <w:tcPr>
-            <w:tcW w:type="dxa" w:w="8928"/>
+            <w:tcW w:type="dxa" w:w="7920"/>
           </w:tcPr>
           <w:p>
             <w:pPr>
@@ -6195,7 +7265,7 @@
         </w:tc>
         <w:tc>
           <w:tcPr>
-            <w:tcW w:type="dxa" w:w="2232"/>
+            <w:tcW w:type="dxa" w:w="2304"/>
           </w:tcPr>
           <w:p>
             <w:pPr>
@@ -6212,7 +7282,24 @@
         </w:tc>
         <w:tc>
           <w:tcPr>
-            <w:tcW w:type="dxa" w:w="1080"/>
+            <w:tcW w:type="dxa" w:w="893"/>
+          </w:tcPr>
+          <w:p>
+            <w:pPr>
+              <w:spacing w:after="20"/>
+            </w:pPr>
+            <w:r>
+              <w:rPr>
+                <w:color w:val="1C3A36"/>
+                <w:sz w:val="15"/>
+              </w:rPr>
+              <w:t>Company</w:t>
+            </w:r>
+          </w:p>
+        </w:tc>
+        <w:tc>
+          <w:tcPr>
+            <w:tcW w:type="dxa" w:w="1123"/>
           </w:tcPr>
           <w:p>
             <w:pPr>
@@ -6229,7 +7316,7 @@
         </w:tc>
         <w:tc>
           <w:tcPr>
-            <w:tcW w:type="dxa" w:w="8928"/>
+            <w:tcW w:type="dxa" w:w="7920"/>
           </w:tcPr>
           <w:p>
             <w:pPr>
@@ -6265,7 +7352,7 @@
         </w:tc>
         <w:tc>
           <w:tcPr>
-            <w:tcW w:type="dxa" w:w="2232"/>
+            <w:tcW w:type="dxa" w:w="2304"/>
           </w:tcPr>
           <w:p>
             <w:pPr>
@@ -6282,7 +7369,24 @@
         </w:tc>
         <w:tc>
           <w:tcPr>
-            <w:tcW w:type="dxa" w:w="1080"/>
+            <w:tcW w:type="dxa" w:w="893"/>
+          </w:tcPr>
+          <w:p>
+            <w:pPr>
+              <w:spacing w:after="20"/>
+            </w:pPr>
+            <w:r>
+              <w:rPr>
+                <w:color w:val="1C3A36"/>
+                <w:sz w:val="15"/>
+              </w:rPr>
+              <w:t>Company</w:t>
+            </w:r>
+          </w:p>
+        </w:tc>
+        <w:tc>
+          <w:tcPr>
+            <w:tcW w:type="dxa" w:w="1123"/>
           </w:tcPr>
           <w:p>
             <w:pPr>
@@ -6299,7 +7403,7 @@
         </w:tc>
         <w:tc>
           <w:tcPr>
-            <w:tcW w:type="dxa" w:w="8928"/>
+            <w:tcW w:type="dxa" w:w="7920"/>
           </w:tcPr>
           <w:p>
             <w:pPr>
@@ -6335,7 +7439,7 @@
         </w:tc>
         <w:tc>
           <w:tcPr>
-            <w:tcW w:type="dxa" w:w="2232"/>
+            <w:tcW w:type="dxa" w:w="2304"/>
           </w:tcPr>
           <w:p>
             <w:pPr>
@@ -6352,7 +7456,24 @@
         </w:tc>
         <w:tc>
           <w:tcPr>
-            <w:tcW w:type="dxa" w:w="1080"/>
+            <w:tcW w:type="dxa" w:w="893"/>
+          </w:tcPr>
+          <w:p>
+            <w:pPr>
+              <w:spacing w:after="20"/>
+            </w:pPr>
+            <w:r>
+              <w:rPr>
+                <w:color w:val="1C3A36"/>
+                <w:sz w:val="15"/>
+              </w:rPr>
+              <w:t>Company</w:t>
+            </w:r>
+          </w:p>
+        </w:tc>
+        <w:tc>
+          <w:tcPr>
+            <w:tcW w:type="dxa" w:w="1123"/>
           </w:tcPr>
           <w:p>
             <w:pPr>
@@ -6369,7 +7490,7 @@
         </w:tc>
         <w:tc>
           <w:tcPr>
-            <w:tcW w:type="dxa" w:w="8928"/>
+            <w:tcW w:type="dxa" w:w="7920"/>
           </w:tcPr>
           <w:p>
             <w:pPr>
@@ -6381,132 +7502,6 @@
                 <w:sz w:val="15"/>
               </w:rPr>
               <w:t>Marginal cost of debt = the company's OWN FY2025 borrowing-cost capitalisation rate (note 30), struck on the 2025 full refinance of both AED 2.75bn RCFs at EIBOR + a REDUCED margin; sits above the 4.48% AED sovereign as a same-currency corporate must (2024 comparison: 5.993%; spot 3M EIBOR 3.66% + implied margin ~0.9-1.3%)</w:t>
-            </w:r>
-          </w:p>
-        </w:tc>
-      </w:tr>
-    </w:tbl>
-    <w:p>
-      <w:pPr>
-        <w:spacing w:after="40"/>
-      </w:pPr>
-    </w:p>
-    <w:p>
-      <w:pPr>
-        <w:spacing w:after="80" w:before="180"/>
-      </w:pPr>
-      <w:r>
-        <w:rPr>
-          <w:b/>
-          <w:i w:val="0"/>
-          <w:color w:val="1C3A36"/>
-          <w:sz w:val="22"/>
-        </w:rPr>
-        <w:t>Country layer — 6 inputs</w:t>
-      </w:r>
-    </w:p>
-    <w:tbl>
-      <w:tblPr>
-        <w:tblW w:type="auto" w:w="0"/>
-        <w:jc w:val="center"/>
-        <w:tblLook w:firstColumn="1" w:firstRow="1" w:lastColumn="0" w:lastRow="0" w:noHBand="0" w:noVBand="1" w:val="04A0"/>
-        <w:tblLayout w:type="fixed"/>
-        <w:tblCellMar>
-          <w:top w:w="40" w:type="dxa"/>
-          <w:left w:w="80" w:type="dxa"/>
-          <w:bottom w:w="40" w:type="dxa"/>
-          <w:right w:w="80" w:type="dxa"/>
-        </w:tblCellMar>
-        <w:tblBorders>
-          <w:top w:val="single" w:sz="4" w:space="0" w:color="C9D4D1"/>
-          <w:left w:val="single" w:sz="4" w:space="0" w:color="C9D4D1"/>
-          <w:bottom w:val="single" w:sz="4" w:space="0" w:color="C9D4D1"/>
-          <w:right w:val="single" w:sz="4" w:space="0" w:color="C9D4D1"/>
-          <w:insideH w:val="single" w:sz="4" w:space="0" w:color="C9D4D1"/>
-          <w:insideV w:val="single" w:sz="4" w:space="0" w:color="C9D4D1"/>
-        </w:tblBorders>
-        <w:tblLayout w:type="fixed"/>
-      </w:tblPr>
-      <w:tblGrid>
-        <w:gridCol w:w="1872"/>
-        <w:gridCol w:w="2232"/>
-        <w:gridCol w:w="1080"/>
-        <w:gridCol w:w="8928"/>
-      </w:tblGrid>
-      <w:tr>
-        <w:tc>
-          <w:tcPr>
-            <w:tcW w:type="dxa" w:w="1872"/>
-            <w:shd w:val="clear" w:color="auto" w:fill="EAF0EE"/>
-          </w:tcPr>
-          <w:p>
-            <w:pPr>
-              <w:spacing w:after="20"/>
-            </w:pPr>
-            <w:r>
-              <w:rPr>
-                <w:b/>
-                <w:color w:val="1C3A36"/>
-                <w:sz w:val="15"/>
-              </w:rPr>
-              <w:t>Input</w:t>
-            </w:r>
-          </w:p>
-        </w:tc>
-        <w:tc>
-          <w:tcPr>
-            <w:tcW w:type="dxa" w:w="2232"/>
-            <w:shd w:val="clear" w:color="auto" w:fill="EAF0EE"/>
-          </w:tcPr>
-          <w:p>
-            <w:pPr>
-              <w:spacing w:after="20"/>
-            </w:pPr>
-            <w:r>
-              <w:rPr>
-                <w:b/>
-                <w:color w:val="1C3A36"/>
-                <w:sz w:val="15"/>
-              </w:rPr>
-              <w:t>Value</w:t>
-            </w:r>
-          </w:p>
-        </w:tc>
-        <w:tc>
-          <w:tcPr>
-            <w:tcW w:type="dxa" w:w="1080"/>
-            <w:shd w:val="clear" w:color="auto" w:fill="EAF0EE"/>
-          </w:tcPr>
-          <w:p>
-            <w:pPr>
-              <w:spacing w:after="20"/>
-            </w:pPr>
-            <w:r>
-              <w:rPr>
-                <w:b/>
-                <w:color w:val="1C3A36"/>
-                <w:sz w:val="15"/>
-              </w:rPr>
-              <w:t>Date</w:t>
-            </w:r>
-          </w:p>
-        </w:tc>
-        <w:tc>
-          <w:tcPr>
-            <w:tcW w:type="dxa" w:w="8928"/>
-            <w:shd w:val="clear" w:color="auto" w:fill="EAF0EE"/>
-          </w:tcPr>
-          <w:p>
-            <w:pPr>
-              <w:spacing w:after="20"/>
-            </w:pPr>
-            <w:r>
-              <w:rPr>
-                <w:b/>
-                <w:color w:val="1C3A36"/>
-                <w:sz w:val="15"/>
-              </w:rPr>
-              <w:t>Source and construction</w:t>
             </w:r>
           </w:p>
         </w:tc>
@@ -6531,7 +7526,7 @@
         </w:tc>
         <w:tc>
           <w:tcPr>
-            <w:tcW w:type="dxa" w:w="2232"/>
+            <w:tcW w:type="dxa" w:w="2304"/>
           </w:tcPr>
           <w:p>
             <w:pPr>
@@ -6548,7 +7543,24 @@
         </w:tc>
         <w:tc>
           <w:tcPr>
-            <w:tcW w:type="dxa" w:w="1080"/>
+            <w:tcW w:type="dxa" w:w="893"/>
+          </w:tcPr>
+          <w:p>
+            <w:pPr>
+              <w:spacing w:after="20"/>
+            </w:pPr>
+            <w:r>
+              <w:rPr>
+                <w:color w:val="1C3A36"/>
+                <w:sz w:val="15"/>
+              </w:rPr>
+              <w:t>Country</w:t>
+            </w:r>
+          </w:p>
+        </w:tc>
+        <w:tc>
+          <w:tcPr>
+            <w:tcW w:type="dxa" w:w="1123"/>
           </w:tcPr>
           <w:p>
             <w:pPr>
@@ -6565,7 +7577,7 @@
         </w:tc>
         <w:tc>
           <w:tcPr>
-            <w:tcW w:type="dxa" w:w="8928"/>
+            <w:tcW w:type="dxa" w:w="7920"/>
           </w:tcPr>
           <w:p>
             <w:pPr>
@@ -6601,7 +7613,7 @@
         </w:tc>
         <w:tc>
           <w:tcPr>
-            <w:tcW w:type="dxa" w:w="2232"/>
+            <w:tcW w:type="dxa" w:w="2304"/>
           </w:tcPr>
           <w:p>
             <w:pPr>
@@ -6618,7 +7630,24 @@
         </w:tc>
         <w:tc>
           <w:tcPr>
-            <w:tcW w:type="dxa" w:w="1080"/>
+            <w:tcW w:type="dxa" w:w="893"/>
+          </w:tcPr>
+          <w:p>
+            <w:pPr>
+              <w:spacing w:after="20"/>
+            </w:pPr>
+            <w:r>
+              <w:rPr>
+                <w:color w:val="1C3A36"/>
+                <w:sz w:val="15"/>
+              </w:rPr>
+              <w:t>Country</w:t>
+            </w:r>
+          </w:p>
+        </w:tc>
+        <w:tc>
+          <w:tcPr>
+            <w:tcW w:type="dxa" w:w="1123"/>
           </w:tcPr>
           <w:p>
             <w:pPr>
@@ -6635,7 +7664,7 @@
         </w:tc>
         <w:tc>
           <w:tcPr>
-            <w:tcW w:type="dxa" w:w="8928"/>
+            <w:tcW w:type="dxa" w:w="7920"/>
           </w:tcPr>
           <w:p>
             <w:pPr>
@@ -6671,7 +7700,7 @@
         </w:tc>
         <w:tc>
           <w:tcPr>
-            <w:tcW w:type="dxa" w:w="2232"/>
+            <w:tcW w:type="dxa" w:w="2304"/>
           </w:tcPr>
           <w:p>
             <w:pPr>
@@ -6688,7 +7717,24 @@
         </w:tc>
         <w:tc>
           <w:tcPr>
-            <w:tcW w:type="dxa" w:w="1080"/>
+            <w:tcW w:type="dxa" w:w="893"/>
+          </w:tcPr>
+          <w:p>
+            <w:pPr>
+              <w:spacing w:after="20"/>
+            </w:pPr>
+            <w:r>
+              <w:rPr>
+                <w:color w:val="1C3A36"/>
+                <w:sz w:val="15"/>
+              </w:rPr>
+              <w:t>Country</w:t>
+            </w:r>
+          </w:p>
+        </w:tc>
+        <w:tc>
+          <w:tcPr>
+            <w:tcW w:type="dxa" w:w="1123"/>
           </w:tcPr>
           <w:p>
             <w:pPr>
@@ -6705,7 +7751,7 @@
         </w:tc>
         <w:tc>
           <w:tcPr>
-            <w:tcW w:type="dxa" w:w="8928"/>
+            <w:tcW w:type="dxa" w:w="7920"/>
           </w:tcPr>
           <w:p>
             <w:pPr>
@@ -6741,7 +7787,7 @@
         </w:tc>
         <w:tc>
           <w:tcPr>
-            <w:tcW w:type="dxa" w:w="2232"/>
+            <w:tcW w:type="dxa" w:w="2304"/>
           </w:tcPr>
           <w:p>
             <w:pPr>
@@ -6758,7 +7804,24 @@
         </w:tc>
         <w:tc>
           <w:tcPr>
-            <w:tcW w:type="dxa" w:w="1080"/>
+            <w:tcW w:type="dxa" w:w="893"/>
+          </w:tcPr>
+          <w:p>
+            <w:pPr>
+              <w:spacing w:after="20"/>
+            </w:pPr>
+            <w:r>
+              <w:rPr>
+                <w:color w:val="1C3A36"/>
+                <w:sz w:val="15"/>
+              </w:rPr>
+              <w:t>Country</w:t>
+            </w:r>
+          </w:p>
+        </w:tc>
+        <w:tc>
+          <w:tcPr>
+            <w:tcW w:type="dxa" w:w="1123"/>
           </w:tcPr>
           <w:p>
             <w:pPr>
@@ -6775,7 +7838,7 @@
         </w:tc>
         <w:tc>
           <w:tcPr>
-            <w:tcW w:type="dxa" w:w="8928"/>
+            <w:tcW w:type="dxa" w:w="7920"/>
           </w:tcPr>
           <w:p>
             <w:pPr>
@@ -6811,7 +7874,7 @@
         </w:tc>
         <w:tc>
           <w:tcPr>
-            <w:tcW w:type="dxa" w:w="2232"/>
+            <w:tcW w:type="dxa" w:w="2304"/>
           </w:tcPr>
           <w:p>
             <w:pPr>
@@ -6828,7 +7891,24 @@
         </w:tc>
         <w:tc>
           <w:tcPr>
-            <w:tcW w:type="dxa" w:w="1080"/>
+            <w:tcW w:type="dxa" w:w="893"/>
+          </w:tcPr>
+          <w:p>
+            <w:pPr>
+              <w:spacing w:after="20"/>
+            </w:pPr>
+            <w:r>
+              <w:rPr>
+                <w:color w:val="1C3A36"/>
+                <w:sz w:val="15"/>
+              </w:rPr>
+              <w:t>Country</w:t>
+            </w:r>
+          </w:p>
+        </w:tc>
+        <w:tc>
+          <w:tcPr>
+            <w:tcW w:type="dxa" w:w="1123"/>
           </w:tcPr>
           <w:p>
             <w:pPr>
@@ -6845,7 +7925,7 @@
         </w:tc>
         <w:tc>
           <w:tcPr>
-            <w:tcW w:type="dxa" w:w="8928"/>
+            <w:tcW w:type="dxa" w:w="7920"/>
           </w:tcPr>
           <w:p>
             <w:pPr>
@@ -6881,7 +7961,7 @@
         </w:tc>
         <w:tc>
           <w:tcPr>
-            <w:tcW w:type="dxa" w:w="2232"/>
+            <w:tcW w:type="dxa" w:w="2304"/>
           </w:tcPr>
           <w:p>
             <w:pPr>
@@ -6898,7 +7978,24 @@
         </w:tc>
         <w:tc>
           <w:tcPr>
-            <w:tcW w:type="dxa" w:w="1080"/>
+            <w:tcW w:type="dxa" w:w="893"/>
+          </w:tcPr>
+          <w:p>
+            <w:pPr>
+              <w:spacing w:after="20"/>
+            </w:pPr>
+            <w:r>
+              <w:rPr>
+                <w:color w:val="1C3A36"/>
+                <w:sz w:val="15"/>
+              </w:rPr>
+              <w:t>Country</w:t>
+            </w:r>
+          </w:p>
+        </w:tc>
+        <w:tc>
+          <w:tcPr>
+            <w:tcW w:type="dxa" w:w="1123"/>
           </w:tcPr>
           <w:p>
             <w:pPr>
@@ -6915,7 +8012,7 @@
         </w:tc>
         <w:tc>
           <w:tcPr>
-            <w:tcW w:type="dxa" w:w="8928"/>
+            <w:tcW w:type="dxa" w:w="7920"/>
           </w:tcPr>
           <w:p>
             <w:pPr>
@@ -6927,132 +8024,6 @@
                 <w:sz w:val="15"/>
               </w:rPr>
               <w:t>UAE total ERP, sovereign-CDS basis (via Abu Dhabi CDS), Damodaran July-2026</w:t>
-            </w:r>
-          </w:p>
-        </w:tc>
-      </w:tr>
-    </w:tbl>
-    <w:p>
-      <w:pPr>
-        <w:spacing w:after="40"/>
-      </w:pPr>
-    </w:p>
-    <w:p>
-      <w:pPr>
-        <w:spacing w:after="80" w:before="180"/>
-      </w:pPr>
-      <w:r>
-        <w:rPr>
-          <w:b/>
-          <w:i w:val="0"/>
-          <w:color w:val="1C3A36"/>
-          <w:sz w:val="22"/>
-        </w:rPr>
-        <w:t>House layer — 1 input</w:t>
-      </w:r>
-    </w:p>
-    <w:tbl>
-      <w:tblPr>
-        <w:tblW w:type="auto" w:w="0"/>
-        <w:jc w:val="center"/>
-        <w:tblLook w:firstColumn="1" w:firstRow="1" w:lastColumn="0" w:lastRow="0" w:noHBand="0" w:noVBand="1" w:val="04A0"/>
-        <w:tblLayout w:type="fixed"/>
-        <w:tblCellMar>
-          <w:top w:w="40" w:type="dxa"/>
-          <w:left w:w="80" w:type="dxa"/>
-          <w:bottom w:w="40" w:type="dxa"/>
-          <w:right w:w="80" w:type="dxa"/>
-        </w:tblCellMar>
-        <w:tblBorders>
-          <w:top w:val="single" w:sz="4" w:space="0" w:color="C9D4D1"/>
-          <w:left w:val="single" w:sz="4" w:space="0" w:color="C9D4D1"/>
-          <w:bottom w:val="single" w:sz="4" w:space="0" w:color="C9D4D1"/>
-          <w:right w:val="single" w:sz="4" w:space="0" w:color="C9D4D1"/>
-          <w:insideH w:val="single" w:sz="4" w:space="0" w:color="C9D4D1"/>
-          <w:insideV w:val="single" w:sz="4" w:space="0" w:color="C9D4D1"/>
-        </w:tblBorders>
-        <w:tblLayout w:type="fixed"/>
-      </w:tblPr>
-      <w:tblGrid>
-        <w:gridCol w:w="1872"/>
-        <w:gridCol w:w="2232"/>
-        <w:gridCol w:w="1080"/>
-        <w:gridCol w:w="8928"/>
-      </w:tblGrid>
-      <w:tr>
-        <w:tc>
-          <w:tcPr>
-            <w:tcW w:type="dxa" w:w="1872"/>
-            <w:shd w:val="clear" w:color="auto" w:fill="EAF0EE"/>
-          </w:tcPr>
-          <w:p>
-            <w:pPr>
-              <w:spacing w:after="20"/>
-            </w:pPr>
-            <w:r>
-              <w:rPr>
-                <w:b/>
-                <w:color w:val="1C3A36"/>
-                <w:sz w:val="15"/>
-              </w:rPr>
-              <w:t>Input</w:t>
-            </w:r>
-          </w:p>
-        </w:tc>
-        <w:tc>
-          <w:tcPr>
-            <w:tcW w:type="dxa" w:w="2232"/>
-            <w:shd w:val="clear" w:color="auto" w:fill="EAF0EE"/>
-          </w:tcPr>
-          <w:p>
-            <w:pPr>
-              <w:spacing w:after="20"/>
-            </w:pPr>
-            <w:r>
-              <w:rPr>
-                <w:b/>
-                <w:color w:val="1C3A36"/>
-                <w:sz w:val="15"/>
-              </w:rPr>
-              <w:t>Value</w:t>
-            </w:r>
-          </w:p>
-        </w:tc>
-        <w:tc>
-          <w:tcPr>
-            <w:tcW w:type="dxa" w:w="1080"/>
-            <w:shd w:val="clear" w:color="auto" w:fill="EAF0EE"/>
-          </w:tcPr>
-          <w:p>
-            <w:pPr>
-              <w:spacing w:after="20"/>
-            </w:pPr>
-            <w:r>
-              <w:rPr>
-                <w:b/>
-                <w:color w:val="1C3A36"/>
-                <w:sz w:val="15"/>
-              </w:rPr>
-              <w:t>Date</w:t>
-            </w:r>
-          </w:p>
-        </w:tc>
-        <w:tc>
-          <w:tcPr>
-            <w:tcW w:type="dxa" w:w="8928"/>
-            <w:shd w:val="clear" w:color="auto" w:fill="EAF0EE"/>
-          </w:tcPr>
-          <w:p>
-            <w:pPr>
-              <w:spacing w:after="20"/>
-            </w:pPr>
-            <w:r>
-              <w:rPr>
-                <w:b/>
-                <w:color w:val="1C3A36"/>
-                <w:sz w:val="15"/>
-              </w:rPr>
-              <w:t>Source and construction</w:t>
             </w:r>
           </w:p>
         </w:tc>
@@ -7077,7 +8048,7 @@
         </w:tc>
         <w:tc>
           <w:tcPr>
-            <w:tcW w:type="dxa" w:w="2232"/>
+            <w:tcW w:type="dxa" w:w="2304"/>
           </w:tcPr>
           <w:p>
             <w:pPr>
@@ -7094,7 +8065,24 @@
         </w:tc>
         <w:tc>
           <w:tcPr>
-            <w:tcW w:type="dxa" w:w="1080"/>
+            <w:tcW w:type="dxa" w:w="893"/>
+          </w:tcPr>
+          <w:p>
+            <w:pPr>
+              <w:spacing w:after="20"/>
+            </w:pPr>
+            <w:r>
+              <w:rPr>
+                <w:color w:val="1C3A36"/>
+                <w:sz w:val="15"/>
+              </w:rPr>
+              <w:t>House</w:t>
+            </w:r>
+          </w:p>
+        </w:tc>
+        <w:tc>
+          <w:tcPr>
+            <w:tcW w:type="dxa" w:w="1123"/>
           </w:tcPr>
           <w:p>
             <w:pPr>
@@ -7111,7 +8099,7 @@
         </w:tc>
         <w:tc>
           <w:tcPr>
-            <w:tcW w:type="dxa" w:w="8928"/>
+            <w:tcW w:type="dxa" w:w="7920"/>
           </w:tcPr>
           <w:p>
             <w:pPr>

</xml_diff>

<commit_message>
EMPOWER study delivery: rendered PDFs (23pp study / 9pp bibliography / 64pp model), finalized QC gate evidence table
Co-Authored-By: Claude Fable 5 <noreply@anthropic.com>
Claude-Session: https://claude.ai/code/session_012CkW3xW1KqNUtQUf3ovr6G
</commit_message>
<xml_diff>
--- a/engine/empower_study/EMPOWER_Bibliography_09-08-2026.docx
+++ b/engine/empower_study/EMPOWER_Bibliography_09-08-2026.docx
@@ -5,13 +5,13 @@
     <w:tbl>
       <w:tblPr>
         <w:tblW w:type="auto" w:w="0"/>
-        <w:tblLook w:firstColumn="1" w:firstRow="1" w:lastColumn="0" w:lastRow="0" w:noHBand="0" w:noVBand="1" w:val="04A0"/>
         <w:tblCellMar>
           <w:top w:w="90" w:type="dxa"/>
           <w:left w:w="150" w:type="dxa"/>
           <w:bottom w:w="90" w:type="dxa"/>
           <w:right w:w="150" w:type="dxa"/>
         </w:tblCellMar>
+        <w:tblLook w:firstColumn="1" w:firstRow="1" w:lastColumn="0" w:lastRow="0" w:noHBand="0" w:noVBand="1" w:val="04A0"/>
       </w:tblPr>
       <w:tblGrid>
         <w:gridCol w:w="14112"/>
@@ -79,14 +79,6 @@
       <w:tblPr>
         <w:tblW w:type="auto" w:w="0"/>
         <w:jc w:val="center"/>
-        <w:tblLook w:firstColumn="1" w:firstRow="1" w:lastColumn="0" w:lastRow="0" w:noHBand="0" w:noVBand="1" w:val="04A0"/>
-        <w:tblLayout w:type="fixed"/>
-        <w:tblCellMar>
-          <w:top w:w="40" w:type="dxa"/>
-          <w:left w:w="80" w:type="dxa"/>
-          <w:bottom w:w="40" w:type="dxa"/>
-          <w:right w:w="80" w:type="dxa"/>
-        </w:tblCellMar>
         <w:tblBorders>
           <w:top w:val="single" w:sz="4" w:space="0" w:color="C9D4D1"/>
           <w:left w:val="single" w:sz="4" w:space="0" w:color="C9D4D1"/>
@@ -96,6 +88,13 @@
           <w:insideV w:val="single" w:sz="4" w:space="0" w:color="C9D4D1"/>
         </w:tblBorders>
         <w:tblLayout w:type="fixed"/>
+        <w:tblCellMar>
+          <w:top w:w="40" w:type="dxa"/>
+          <w:left w:w="80" w:type="dxa"/>
+          <w:bottom w:w="40" w:type="dxa"/>
+          <w:right w:w="80" w:type="dxa"/>
+        </w:tblCellMar>
+        <w:tblLook w:firstColumn="1" w:firstRow="1" w:lastColumn="0" w:lastRow="0" w:noHBand="0" w:noVBand="1" w:val="04A0"/>
       </w:tblPr>
       <w:tblGrid>
         <w:gridCol w:w="1512"/>
@@ -328,14 +327,6 @@
       <w:tblPr>
         <w:tblW w:type="auto" w:w="0"/>
         <w:jc w:val="center"/>
-        <w:tblLook w:firstColumn="1" w:firstRow="1" w:lastColumn="0" w:lastRow="0" w:noHBand="0" w:noVBand="1" w:val="04A0"/>
-        <w:tblLayout w:type="fixed"/>
-        <w:tblCellMar>
-          <w:top w:w="40" w:type="dxa"/>
-          <w:left w:w="80" w:type="dxa"/>
-          <w:bottom w:w="40" w:type="dxa"/>
-          <w:right w:w="80" w:type="dxa"/>
-        </w:tblCellMar>
         <w:tblBorders>
           <w:top w:val="single" w:sz="4" w:space="0" w:color="C9D4D1"/>
           <w:left w:val="single" w:sz="4" w:space="0" w:color="C9D4D1"/>
@@ -345,6 +336,13 @@
           <w:insideV w:val="single" w:sz="4" w:space="0" w:color="C9D4D1"/>
         </w:tblBorders>
         <w:tblLayout w:type="fixed"/>
+        <w:tblCellMar>
+          <w:top w:w="40" w:type="dxa"/>
+          <w:left w:w="80" w:type="dxa"/>
+          <w:bottom w:w="40" w:type="dxa"/>
+          <w:right w:w="80" w:type="dxa"/>
+        </w:tblCellMar>
+        <w:tblLook w:firstColumn="1" w:firstRow="1" w:lastColumn="0" w:lastRow="0" w:noHBand="0" w:noVBand="1" w:val="04A0"/>
       </w:tblPr>
       <w:tblGrid>
         <w:gridCol w:w="3528"/>
@@ -1033,14 +1031,6 @@
       <w:tblPr>
         <w:tblW w:type="auto" w:w="0"/>
         <w:jc w:val="center"/>
-        <w:tblLook w:firstColumn="1" w:firstRow="1" w:lastColumn="0" w:lastRow="0" w:noHBand="0" w:noVBand="1" w:val="04A0"/>
-        <w:tblLayout w:type="fixed"/>
-        <w:tblCellMar>
-          <w:top w:w="40" w:type="dxa"/>
-          <w:left w:w="80" w:type="dxa"/>
-          <w:bottom w:w="40" w:type="dxa"/>
-          <w:right w:w="80" w:type="dxa"/>
-        </w:tblCellMar>
         <w:tblBorders>
           <w:top w:val="single" w:sz="4" w:space="0" w:color="C9D4D1"/>
           <w:left w:val="single" w:sz="4" w:space="0" w:color="C9D4D1"/>
@@ -1050,6 +1040,13 @@
           <w:insideV w:val="single" w:sz="4" w:space="0" w:color="C9D4D1"/>
         </w:tblBorders>
         <w:tblLayout w:type="fixed"/>
+        <w:tblCellMar>
+          <w:top w:w="40" w:type="dxa"/>
+          <w:left w:w="80" w:type="dxa"/>
+          <w:bottom w:w="40" w:type="dxa"/>
+          <w:right w:w="80" w:type="dxa"/>
+        </w:tblCellMar>
+        <w:tblLook w:firstColumn="1" w:firstRow="1" w:lastColumn="0" w:lastRow="0" w:noHBand="0" w:noVBand="1" w:val="04A0"/>
       </w:tblPr>
       <w:tblGrid>
         <w:gridCol w:w="1872"/>
@@ -8158,14 +8155,6 @@
       <w:tblPr>
         <w:tblW w:type="auto" w:w="0"/>
         <w:jc w:val="center"/>
-        <w:tblLook w:firstColumn="1" w:firstRow="1" w:lastColumn="0" w:lastRow="0" w:noHBand="0" w:noVBand="1" w:val="04A0"/>
-        <w:tblLayout w:type="fixed"/>
-        <w:tblCellMar>
-          <w:top w:w="40" w:type="dxa"/>
-          <w:left w:w="80" w:type="dxa"/>
-          <w:bottom w:w="40" w:type="dxa"/>
-          <w:right w:w="80" w:type="dxa"/>
-        </w:tblCellMar>
         <w:tblBorders>
           <w:top w:val="single" w:sz="4" w:space="0" w:color="C9D4D1"/>
           <w:left w:val="single" w:sz="4" w:space="0" w:color="C9D4D1"/>
@@ -8175,6 +8164,13 @@
           <w:insideV w:val="single" w:sz="4" w:space="0" w:color="C9D4D1"/>
         </w:tblBorders>
         <w:tblLayout w:type="fixed"/>
+        <w:tblCellMar>
+          <w:top w:w="40" w:type="dxa"/>
+          <w:left w:w="80" w:type="dxa"/>
+          <w:bottom w:w="40" w:type="dxa"/>
+          <w:right w:w="80" w:type="dxa"/>
+        </w:tblCellMar>
+        <w:tblLook w:firstColumn="1" w:firstRow="1" w:lastColumn="0" w:lastRow="0" w:noHBand="0" w:noVBand="1" w:val="04A0"/>
       </w:tblPr>
       <w:tblGrid>
         <w:gridCol w:w="2160"/>
@@ -9003,14 +8999,6 @@
       <w:tblPr>
         <w:tblW w:type="auto" w:w="0"/>
         <w:jc w:val="center"/>
-        <w:tblLook w:firstColumn="1" w:firstRow="1" w:lastColumn="0" w:lastRow="0" w:noHBand="0" w:noVBand="1" w:val="04A0"/>
-        <w:tblLayout w:type="fixed"/>
-        <w:tblCellMar>
-          <w:top w:w="40" w:type="dxa"/>
-          <w:left w:w="80" w:type="dxa"/>
-          <w:bottom w:w="40" w:type="dxa"/>
-          <w:right w:w="80" w:type="dxa"/>
-        </w:tblCellMar>
         <w:tblBorders>
           <w:top w:val="single" w:sz="4" w:space="0" w:color="C9D4D1"/>
           <w:left w:val="single" w:sz="4" w:space="0" w:color="C9D4D1"/>
@@ -9020,6 +9008,13 @@
           <w:insideV w:val="single" w:sz="4" w:space="0" w:color="C9D4D1"/>
         </w:tblBorders>
         <w:tblLayout w:type="fixed"/>
+        <w:tblCellMar>
+          <w:top w:w="40" w:type="dxa"/>
+          <w:left w:w="80" w:type="dxa"/>
+          <w:bottom w:w="40" w:type="dxa"/>
+          <w:right w:w="80" w:type="dxa"/>
+        </w:tblCellMar>
+        <w:tblLook w:firstColumn="1" w:firstRow="1" w:lastColumn="0" w:lastRow="0" w:noHBand="0" w:noVBand="1" w:val="04A0"/>
       </w:tblPr>
       <w:tblGrid>
         <w:gridCol w:w="3528"/>
@@ -9268,14 +9263,6 @@
       <w:tblPr>
         <w:tblW w:type="auto" w:w="0"/>
         <w:jc w:val="center"/>
-        <w:tblLook w:firstColumn="1" w:firstRow="1" w:lastColumn="0" w:lastRow="0" w:noHBand="0" w:noVBand="1" w:val="04A0"/>
-        <w:tblLayout w:type="fixed"/>
-        <w:tblCellMar>
-          <w:top w:w="40" w:type="dxa"/>
-          <w:left w:w="80" w:type="dxa"/>
-          <w:bottom w:w="40" w:type="dxa"/>
-          <w:right w:w="80" w:type="dxa"/>
-        </w:tblCellMar>
         <w:tblBorders>
           <w:top w:val="single" w:sz="4" w:space="0" w:color="C9D4D1"/>
           <w:left w:val="single" w:sz="4" w:space="0" w:color="C9D4D1"/>
@@ -9285,6 +9272,13 @@
           <w:insideV w:val="single" w:sz="4" w:space="0" w:color="C9D4D1"/>
         </w:tblBorders>
         <w:tblLayout w:type="fixed"/>
+        <w:tblCellMar>
+          <w:top w:w="40" w:type="dxa"/>
+          <w:left w:w="80" w:type="dxa"/>
+          <w:bottom w:w="40" w:type="dxa"/>
+          <w:right w:w="80" w:type="dxa"/>
+        </w:tblCellMar>
+        <w:tblLook w:firstColumn="1" w:firstRow="1" w:lastColumn="0" w:lastRow="0" w:noHBand="0" w:noVBand="1" w:val="04A0"/>
       </w:tblPr>
       <w:tblGrid>
         <w:gridCol w:w="2736"/>

</xml_diff>

<commit_message>
EMPOWER re-edition: beta re-based to FTSE ADX General Index per instruction (0.863 vs 0.652 DFM, retained as comparison); full recompute + rebuild + re-verification
Co-Authored-By: Claude Fable 5 <noreply@anthropic.com>
Claude-Session: https://claude.ai/code/session_012CkW3xW1KqNUtQUf3ovr6G
</commit_message>
<xml_diff>
--- a/engine/empower_study/EMPOWER_Bibliography_09-08-2026.docx
+++ b/engine/empower_study/EMPOWER_Bibliography_09-08-2026.docx
@@ -7360,7 +7360,7 @@
                 <w:color w:val="1C3A36"/>
                 <w:sz w:val="15"/>
               </w:rPr>
-              <w:t>0.652</w:t>
+              <w:t>0.863</w:t>
             </w:r>
           </w:p>
         </w:tc>
@@ -7394,7 +7394,7 @@
                 <w:color w:val="1C3A36"/>
                 <w:sz w:val="15"/>
               </w:rPr>
-              <w:t>2026-08-09</w:t>
+              <w:t>2026-08-10</w:t>
             </w:r>
           </w:p>
         </w:tc>
@@ -7411,7 +7411,7 @@
                 <w:color w:val="1C3A36"/>
                 <w:sz w:val="15"/>
               </w:rPr>
-              <w:t>Own-stock weekly regression vs DFM General Index, full listing window 25-Nov-2022..17-Jul-2026 (3.64y, inside the 2-5y band): beta 0.652, R2 0.157, n 190, SE 0.110, CI90 [0.47, 0.83] — meets the study’s minimum statistical-usability standard</w:t>
+              <w:t>Own-stock weekly regression vs the FTSE ADX General Index — the UAE base market index PER EXPLICIT INSTRUCTION 10-Aug-2026, replacing the listing exchange's own DFM General Index (that regression, beta 0.652, is retained in beta_result_dfmgi.json as a comparison). User-supplied FADGI history 2011-2026; regression window 25-Nov-2022..24-Jul-2026 (3.66y, clipped at the index file's endpoint two weeks before the anchor): beta 0.863, R2 0.103, n 189, SE 0.186, CI90 [0.56, 1.17] — meets the study’s minimum statistical-usability standard</w:t>
             </w:r>
           </w:p>
         </w:tc>
@@ -8287,7 +8287,7 @@
                 <w:color w:val="1C3A36"/>
                 <w:sz w:val="15"/>
               </w:rPr>
-              <w:t>Usage per connected ton carries a 6% shock in 2026 and recovers to the 2025 level through 2027; the never-recovers case is computed as a full alternative model (2.594 against 2.664 per share) and published beside it</w:t>
+              <w:t>Usage per connected ton carries a 6% shock in 2026 and recovers to the 2025 level through 2027; the never-recovers case is computed as a full alternative model (2.123 against 2.182 per share) and published beside it</w:t>
             </w:r>
           </w:p>
         </w:tc>
@@ -8357,7 +8357,7 @@
                 <w:color w:val="1C3A36"/>
                 <w:sz w:val="15"/>
               </w:rPr>
-              <w:t>The audited 9% effective rate is the base; the 15% domestic minimum top-up rate is computed as a full second column (2.483 against 2.664) — published side by side, never averaged</w:t>
+              <w:t>The audited 9% effective rate is the base; the 15% domestic minimum top-up rate is computed as a full second column (2.027 against 2.182) — published side by side, never averaged</w:t>
             </w:r>
           </w:p>
         </w:tc>
@@ -8777,7 +8777,7 @@
                 <w:color w:val="1C3A36"/>
                 <w:sz w:val="15"/>
               </w:rPr>
-              <w:t>Risk-free = the longest dirham sovereign print less the UAE's own default spread; beta 0.652 from the stock's own weekly history against the DFM General Index; the published UAE equity risk premium; both spread bases computed (they converge: 7.22% against 7.23%)</w:t>
+              <w:t>Risk-free = the longest dirham sovereign print less the UAE's own default spread; beta 0.863 from the stock's own weekly history against the FTSE ADX General Index (adopted as the UAE market index by instruction; the DFM-index regression, 0.652, is retained as a comparison); the published UAE equity risk premium; both spread bases computed (they converge: 8.24% against 8.28%)</w:t>
             </w:r>
           </w:p>
         </w:tc>
@@ -9358,7 +9358,7 @@
                 <w:color w:val="1C3A36"/>
                 <w:sz w:val="16"/>
               </w:rPr>
-              <w:t>DFM General Index daily series (Yahoo Finance chart API)</w:t>
+              <w:t>Market index series for the beta regression</w:t>
             </w:r>
           </w:p>
         </w:tc>
@@ -9375,7 +9375,7 @@
                 <w:color w:val="1C3A36"/>
                 <w:sz w:val="16"/>
               </w:rPr>
-              <w:t>The retrieved index series is sparse — roughly a fifth of trading sessions are missing — and it ends at 16-Jul-2026, three weeks before the anchor date. A separately quoted "live" index level on an aggregator page matched the stale 16-Jul close exactly</w:t>
+              <w:t>The FTSE ADX General Index history used (supplied export) ends at 24-Jul-2026, two weeks before the anchor date, so the regression window clips there. The previously used DFM General Index series (an aggregator pull, ~a fifth of sessions missing, ending 16-Jul-2026) is retained only as the archived comparison regression (beta 0.652 against 0.863 adopted)</w:t>
             </w:r>
           </w:p>
         </w:tc>

</xml_diff>

<commit_message>
EMPOWER re-edition 2: full external-audit response implemented across model, workbook (1154 live formulas) and documents; PDFs rebuilt and read; QC gate updated
Co-Authored-By: Claude Fable 5 <noreply@anthropic.com>
Claude-Session: https://claude.ai/code/session_012CkW3xW1KqNUtQUf3ovr6G
</commit_message>
<xml_diff>
--- a/engine/empower_study/EMPOWER_Bibliography_09-08-2026.docx
+++ b/engine/empower_study/EMPOWER_Bibliography_09-08-2026.docx
@@ -36,7 +36,7 @@
                 <w:color w:val="9FB0AC"/>
                 <w:sz w:val="20"/>
               </w:rPr>
-              <w:t xml:space="preserve">   9 August 2026</w:t>
+              <w:t xml:space="preserve">   9 August 2026 · revised 17 August 2026</w:t>
             </w:r>
           </w:p>
         </w:tc>
@@ -72,7 +72,7 @@
           <w:color w:val="1C3A36"/>
           <w:sz w:val="20"/>
         </w:rPr>
-        <w:t>Companion document to the valuation study dated 9 August 2026. It exists so a reader can check the study rather than trust it: every input the model uses is listed with its value, its source and construction, the date the source itself bears (not the date it was read), and the research layer it belongs to. The judgements — the places where the analyst chose rather than observed — are collected separately, each with the evidence that would overturn it. Searches that returned nothing are recorded, because an absence of disclosure shaped the model as much as the disclosures did.</w:t>
+        <w:t>Companion document to the valuation study dated 9 August 2026 and revised 17 August 2026 following an external audit — the findings, dispositions and prices are catalogued in the accompanying critique-response note, and the register below reflects the revised inputs and constructions. It exists so a reader can check the study rather than trust it: every input the model uses is listed with its value, its source and construction, the date the source itself bears (not the date it was read), and the research layer it belongs to. The judgements — the places where the analyst chose rather than observed — are collected separately, each with the evidence that would overturn it. Searches that returned nothing are recorded, because an absence of disclosure shaped the model as much as the disclosures did.</w:t>
       </w:r>
     </w:p>
     <w:tbl>
@@ -563,7 +563,7 @@
                 <w:color w:val="1C3A36"/>
                 <w:sz w:val="16"/>
               </w:rPr>
-              <w:t>Full FY2023 statements: revenue, cost of sales, operating profit, the tax CREDIT from first recognition of deferred tax assets; the airport-cooling concession acquisition (70% of DXB CoolCo, 35-year concession) and the borrowing step-up that funded it; consumption revenue in the auditor's key-audit-matter section</w:t>
+              <w:t>Full FY2023 statements: revenue, cost of sales, operating profit, the tax CREDIT from first recognition of deferred tax assets; the airport-cooling concession acquisition — 85% of DXB CoolCo with the seller (Dubai Aviation City) retaining the 15% minority recognised at AED 157.5m, accounted for as a service concession under IFRIC 12 with a financial-asset receivable of AED 1,050.0m recovered over the concession, stated as "a term of 35 years from the commencement date (5 July 2023)" — and the borrowing step-up that funded it; consumption revenue in the auditor's key-audit-matter section</w:t>
             </w:r>
           </w:p>
         </w:tc>
@@ -1756,7 +1756,7 @@
                 <w:color w:val="1C3A36"/>
                 <w:sz w:val="15"/>
               </w:rPr>
-              <w:t>Interest income on financial assets at amortised cost (airport concession receivable), presented INSIDE gross profit, FY2023 audited FS</w:t>
+              <w:t>Interest income on financial assets at amortised cost (the related-party acquisition receivables — concession-grantor financial asset under IFRIC 12 from Dubai Aviation City, and the Nakheel minimum-demand commitment), presented INSIDE gross profit, FY2023 audited FS</w:t>
             </w:r>
           </w:p>
         </w:tc>
@@ -2662,7 +2662,7 @@
                 <w:color w:val="1C3A36"/>
                 <w:sz w:val="15"/>
               </w:rPr>
-              <w:t>246.6</w:t>
+              <w:t>256.4</w:t>
             </w:r>
           </w:p>
         </w:tc>
@@ -2713,7 +2713,7 @@
                 <w:color w:val="1C3A36"/>
                 <w:sz w:val="15"/>
               </w:rPr>
-              <w:t>General &amp; administrative expenses, FY2025 audited FS</w:t>
+              <w:t>General &amp; administrative expenses, FY2025 audited FS statement face (OCR, verified against the operating-profit identity to the dirham; CORRECTED 17-Aug-2026 — a first-pass extraction carried 246.577, which also closed the identity because 9.806 had been shifted between G&amp;A and other income)</w:t>
             </w:r>
           </w:p>
         </w:tc>
@@ -3097,7 +3097,7 @@
                 <w:color w:val="1C3A36"/>
                 <w:sz w:val="15"/>
               </w:rPr>
-              <w:t>14.624</w:t>
+              <w:t>24.43</w:t>
             </w:r>
           </w:p>
         </w:tc>
@@ -3148,7 +3148,7 @@
                 <w:color w:val="1C3A36"/>
                 <w:sz w:val="15"/>
               </w:rPr>
-              <w:t>Other income, FY2025 audited FS</w:t>
+              <w:t>Other income, FY2025 audited FS statement face; note 29 composition: rental income 18.094 + government grant 2.780 + scrap 1.482 + others 2.074 (CORRECTED 17-Aug-2026 from a first-pass 14.624)</w:t>
             </w:r>
           </w:p>
         </w:tc>
@@ -3167,7 +3167,7 @@
                 <w:color w:val="1C3A36"/>
                 <w:sz w:val="15"/>
               </w:rPr>
-              <w:t>op fy23</w:t>
+              <w:t>rental fy25</w:t>
             </w:r>
           </w:p>
         </w:tc>
@@ -3184,7 +3184,7 @@
                 <w:color w:val="1C3A36"/>
                 <w:sz w:val="15"/>
               </w:rPr>
-              <w:t>1,119.9</w:t>
+              <w:t>18.094</w:t>
             </w:r>
           </w:p>
         </w:tc>
@@ -3218,7 +3218,7 @@
                 <w:color w:val="1C3A36"/>
                 <w:sz w:val="15"/>
               </w:rPr>
-              <w:t>2024-02-14</w:t>
+              <w:t>2026-02-09</w:t>
             </w:r>
           </w:p>
         </w:tc>
@@ -3235,7 +3235,7 @@
                 <w:color w:val="1C3A36"/>
                 <w:sz w:val="15"/>
               </w:rPr>
-              <w:t>Operating profit, FY2023 audited FS</w:t>
+              <w:t>Rental income inside other income, FY2025 note 29 — the return on the investment properties the bridge adds at book, so it is EXCLUDED from operating EBITDA (double-count fix, critique CCU6 confirmed against the note)</w:t>
             </w:r>
           </w:p>
         </w:tc>
@@ -3254,7 +3254,7 @@
                 <w:color w:val="1C3A36"/>
                 <w:sz w:val="15"/>
               </w:rPr>
-              <w:t>op fy24</w:t>
+              <w:t>op fy23</w:t>
             </w:r>
           </w:p>
         </w:tc>
@@ -3271,7 +3271,7 @@
                 <w:color w:val="1C3A36"/>
                 <w:sz w:val="15"/>
               </w:rPr>
-              <w:t>1,192.4</w:t>
+              <w:t>1,119.9</w:t>
             </w:r>
           </w:p>
         </w:tc>
@@ -3305,7 +3305,7 @@
                 <w:color w:val="1C3A36"/>
                 <w:sz w:val="15"/>
               </w:rPr>
-              <w:t>2025-02-14</w:t>
+              <w:t>2024-02-14</w:t>
             </w:r>
           </w:p>
         </w:tc>
@@ -3322,7 +3322,7 @@
                 <w:color w:val="1C3A36"/>
                 <w:sz w:val="15"/>
               </w:rPr>
-              <w:t>Operating profit, FY2024 audited FS</w:t>
+              <w:t>Operating profit, FY2023 audited FS</w:t>
             </w:r>
           </w:p>
         </w:tc>
@@ -3341,7 +3341,7 @@
                 <w:color w:val="1C3A36"/>
                 <w:sz w:val="15"/>
               </w:rPr>
-              <w:t>op fy25</w:t>
+              <w:t>op fy24</w:t>
             </w:r>
           </w:p>
         </w:tc>
@@ -3358,7 +3358,7 @@
                 <w:color w:val="1C3A36"/>
                 <w:sz w:val="15"/>
               </w:rPr>
-              <w:t>1,272.5</w:t>
+              <w:t>1,192.4</w:t>
             </w:r>
           </w:p>
         </w:tc>
@@ -3392,7 +3392,7 @@
                 <w:color w:val="1C3A36"/>
                 <w:sz w:val="15"/>
               </w:rPr>
-              <w:t>2026-02-09</w:t>
+              <w:t>2025-02-14</w:t>
             </w:r>
           </w:p>
         </w:tc>
@@ -3409,7 +3409,7 @@
                 <w:color w:val="1C3A36"/>
                 <w:sz w:val="15"/>
               </w:rPr>
-              <w:t>Operating profit, FY2025 audited FS</w:t>
+              <w:t>Operating profit, FY2024 audited FS</w:t>
             </w:r>
           </w:p>
         </w:tc>
@@ -3428,7 +3428,7 @@
                 <w:color w:val="1C3A36"/>
                 <w:sz w:val="15"/>
               </w:rPr>
-              <w:t>fin inc fy25</w:t>
+              <w:t>op fy25</w:t>
             </w:r>
           </w:p>
         </w:tc>
@@ -3445,7 +3445,7 @@
                 <w:color w:val="1C3A36"/>
                 <w:sz w:val="15"/>
               </w:rPr>
-              <w:t>55.347</w:t>
+              <w:t>1,272.5</w:t>
             </w:r>
           </w:p>
         </w:tc>
@@ -3496,7 +3496,7 @@
                 <w:color w:val="1C3A36"/>
                 <w:sz w:val="15"/>
               </w:rPr>
-              <w:t>Finance income, FY2025 audited FS note 30</w:t>
+              <w:t>Operating profit, FY2025 audited FS</w:t>
             </w:r>
           </w:p>
         </w:tc>
@@ -3515,7 +3515,7 @@
                 <w:color w:val="1C3A36"/>
                 <w:sz w:val="15"/>
               </w:rPr>
-              <w:t>fin cost fy25</w:t>
+              <w:t>fin inc fy25</w:t>
             </w:r>
           </w:p>
         </w:tc>
@@ -3532,7 +3532,7 @@
                 <w:color w:val="1C3A36"/>
                 <w:sz w:val="15"/>
               </w:rPr>
-              <w:t>224.7</w:t>
+              <w:t>55.347</w:t>
             </w:r>
           </w:p>
         </w:tc>
@@ -3583,7 +3583,7 @@
                 <w:color w:val="1C3A36"/>
                 <w:sz w:val="15"/>
               </w:rPr>
-              <w:t>Finance costs (net of 10.711 capitalised), FY2025 audited FS note 30</w:t>
+              <w:t>Finance income, FY2025 audited FS note 30</w:t>
             </w:r>
           </w:p>
         </w:tc>
@@ -3602,7 +3602,7 @@
                 <w:color w:val="1C3A36"/>
                 <w:sz w:val="15"/>
               </w:rPr>
-              <w:t>pbt fy23</w:t>
+              <w:t>fin cost fy25</w:t>
             </w:r>
           </w:p>
         </w:tc>
@@ -3619,7 +3619,7 @@
                 <w:color w:val="1C3A36"/>
                 <w:sz w:val="15"/>
               </w:rPr>
-              <w:t>942.6</w:t>
+              <w:t>224.7</w:t>
             </w:r>
           </w:p>
         </w:tc>
@@ -3653,7 +3653,7 @@
                 <w:color w:val="1C3A36"/>
                 <w:sz w:val="15"/>
               </w:rPr>
-              <w:t>2024-02-14</w:t>
+              <w:t>2026-02-09</w:t>
             </w:r>
           </w:p>
         </w:tc>
@@ -3670,7 +3670,7 @@
                 <w:color w:val="1C3A36"/>
                 <w:sz w:val="15"/>
               </w:rPr>
-              <w:t>Profit before tax, FY2023 audited FS</w:t>
+              <w:t>Finance costs (net of 10.711 capitalised), FY2025 audited FS note 30</w:t>
             </w:r>
           </w:p>
         </w:tc>
@@ -3689,7 +3689,7 @@
                 <w:color w:val="1C3A36"/>
                 <w:sz w:val="15"/>
               </w:rPr>
-              <w:t>pbt fy24</w:t>
+              <w:t>pbt fy23</w:t>
             </w:r>
           </w:p>
         </w:tc>
@@ -3706,7 +3706,7 @@
                 <w:color w:val="1C3A36"/>
                 <w:sz w:val="15"/>
               </w:rPr>
-              <w:t>998.3</w:t>
+              <w:t>942.6</w:t>
             </w:r>
           </w:p>
         </w:tc>
@@ -3740,7 +3740,7 @@
                 <w:color w:val="1C3A36"/>
                 <w:sz w:val="15"/>
               </w:rPr>
-              <w:t>2025-02-14</w:t>
+              <w:t>2024-02-14</w:t>
             </w:r>
           </w:p>
         </w:tc>
@@ -3757,7 +3757,7 @@
                 <w:color w:val="1C3A36"/>
                 <w:sz w:val="15"/>
               </w:rPr>
-              <w:t>Profit before tax, FY2024 audited FS</w:t>
+              <w:t>Profit before tax, FY2023 audited FS</w:t>
             </w:r>
           </w:p>
         </w:tc>
@@ -3776,7 +3776,7 @@
                 <w:color w:val="1C3A36"/>
                 <w:sz w:val="15"/>
               </w:rPr>
-              <w:t>pbt fy25</w:t>
+              <w:t>pbt fy24</w:t>
             </w:r>
           </w:p>
         </w:tc>
@@ -3793,7 +3793,7 @@
                 <w:color w:val="1C3A36"/>
                 <w:sz w:val="15"/>
               </w:rPr>
-              <w:t>1,103.2</w:t>
+              <w:t>998.3</w:t>
             </w:r>
           </w:p>
         </w:tc>
@@ -3827,7 +3827,7 @@
                 <w:color w:val="1C3A36"/>
                 <w:sz w:val="15"/>
               </w:rPr>
-              <w:t>2026-02-09</w:t>
+              <w:t>2025-02-14</w:t>
             </w:r>
           </w:p>
         </w:tc>
@@ -3844,7 +3844,7 @@
                 <w:color w:val="1C3A36"/>
                 <w:sz w:val="15"/>
               </w:rPr>
-              <w:t>Profit before tax, FY2025 audited FS</w:t>
+              <w:t>Profit before tax, FY2024 audited FS</w:t>
             </w:r>
           </w:p>
         </w:tc>
@@ -3863,7 +3863,7 @@
                 <w:color w:val="1C3A36"/>
                 <w:sz w:val="15"/>
               </w:rPr>
-              <w:t>tax fy23</w:t>
+              <w:t>pbt fy25</w:t>
             </w:r>
           </w:p>
         </w:tc>
@@ -3880,7 +3880,7 @@
                 <w:color w:val="1C3A36"/>
                 <w:sz w:val="15"/>
               </w:rPr>
-              <w:t>17.454</w:t>
+              <w:t>1,103.2</w:t>
             </w:r>
           </w:p>
         </w:tc>
@@ -3914,7 +3914,7 @@
                 <w:color w:val="1C3A36"/>
                 <w:sz w:val="15"/>
               </w:rPr>
-              <w:t>2024-02-14</w:t>
+              <w:t>2026-02-09</w:t>
             </w:r>
           </w:p>
         </w:tc>
@@ -3931,7 +3931,7 @@
                 <w:color w:val="1C3A36"/>
                 <w:sz w:val="15"/>
               </w:rPr>
-              <w:t>Income tax CREDIT (deferred tax asset first recognition ahead of UAE CT), FY2023 audited FS</w:t>
+              <w:t>Profit before tax, FY2025 audited FS</w:t>
             </w:r>
           </w:p>
         </w:tc>
@@ -3950,7 +3950,7 @@
                 <w:color w:val="1C3A36"/>
                 <w:sz w:val="15"/>
               </w:rPr>
-              <w:t>tax fy24</w:t>
+              <w:t>tax fy23</w:t>
             </w:r>
           </w:p>
         </w:tc>
@@ -3967,7 +3967,7 @@
                 <w:color w:val="1C3A36"/>
                 <w:sz w:val="15"/>
               </w:rPr>
-              <w:t>-90.097</w:t>
+              <w:t>17.454</w:t>
             </w:r>
           </w:p>
         </w:tc>
@@ -4001,7 +4001,7 @@
                 <w:color w:val="1C3A36"/>
                 <w:sz w:val="15"/>
               </w:rPr>
-              <w:t>2025-02-14</w:t>
+              <w:t>2024-02-14</w:t>
             </w:r>
           </w:p>
         </w:tc>
@@ -4018,7 +4018,7 @@
                 <w:color w:val="1C3A36"/>
                 <w:sz w:val="15"/>
               </w:rPr>
-              <w:t>Income tax expense, FY2024 audited FS</w:t>
+              <w:t>Income tax CREDIT (deferred tax asset first recognition ahead of UAE CT), FY2023 audited FS</w:t>
             </w:r>
           </w:p>
         </w:tc>
@@ -4037,7 +4037,7 @@
                 <w:color w:val="1C3A36"/>
                 <w:sz w:val="15"/>
               </w:rPr>
-              <w:t>tax fy25</w:t>
+              <w:t>tax fy24</w:t>
             </w:r>
           </w:p>
         </w:tc>
@@ -4054,7 +4054,7 @@
                 <w:color w:val="1C3A36"/>
                 <w:sz w:val="15"/>
               </w:rPr>
-              <w:t>-99.226</w:t>
+              <w:t>-90.097</w:t>
             </w:r>
           </w:p>
         </w:tc>
@@ -4088,7 +4088,7 @@
                 <w:color w:val="1C3A36"/>
                 <w:sz w:val="15"/>
               </w:rPr>
-              <w:t>2026-02-09</w:t>
+              <w:t>2025-02-14</w:t>
             </w:r>
           </w:p>
         </w:tc>
@@ -4105,7 +4105,7 @@
                 <w:color w:val="1C3A36"/>
                 <w:sz w:val="15"/>
               </w:rPr>
-              <w:t>Income tax expense (current 98.082 + deferred 1.144), FY2025 audited FS note 28</w:t>
+              <w:t>Income tax expense, FY2024 audited FS</w:t>
             </w:r>
           </w:p>
         </w:tc>
@@ -4124,7 +4124,7 @@
                 <w:color w:val="1C3A36"/>
                 <w:sz w:val="15"/>
               </w:rPr>
-              <w:t>pat fy23</w:t>
+              <w:t>tax fy25</w:t>
             </w:r>
           </w:p>
         </w:tc>
@@ -4141,7 +4141,7 @@
                 <w:color w:val="1C3A36"/>
                 <w:sz w:val="15"/>
               </w:rPr>
-              <w:t>960.1</w:t>
+              <w:t>-99.226</w:t>
             </w:r>
           </w:p>
         </w:tc>
@@ -4175,7 +4175,7 @@
                 <w:color w:val="1C3A36"/>
                 <w:sz w:val="15"/>
               </w:rPr>
-              <w:t>2024-02-14</w:t>
+              <w:t>2026-02-09</w:t>
             </w:r>
           </w:p>
         </w:tc>
@@ -4192,7 +4192,7 @@
                 <w:color w:val="1C3A36"/>
                 <w:sz w:val="15"/>
               </w:rPr>
-              <w:t>Profit after tax, FY2023 audited FS</w:t>
+              <w:t>Income tax expense (current 98.082 + deferred 1.144), FY2025 audited FS note 28</w:t>
             </w:r>
           </w:p>
         </w:tc>
@@ -4211,7 +4211,7 @@
                 <w:color w:val="1C3A36"/>
                 <w:sz w:val="15"/>
               </w:rPr>
-              <w:t>pat fy24</w:t>
+              <w:t>pat fy23</w:t>
             </w:r>
           </w:p>
         </w:tc>
@@ -4228,7 +4228,7 @@
                 <w:color w:val="1C3A36"/>
                 <w:sz w:val="15"/>
               </w:rPr>
-              <w:t>908.2</w:t>
+              <w:t>960.1</w:t>
             </w:r>
           </w:p>
         </w:tc>
@@ -4262,7 +4262,7 @@
                 <w:color w:val="1C3A36"/>
                 <w:sz w:val="15"/>
               </w:rPr>
-              <w:t>2025-02-14</w:t>
+              <w:t>2024-02-14</w:t>
             </w:r>
           </w:p>
         </w:tc>
@@ -4279,7 +4279,7 @@
                 <w:color w:val="1C3A36"/>
                 <w:sz w:val="15"/>
               </w:rPr>
-              <w:t>Profit after tax, FY2024 audited FS</w:t>
+              <w:t>Profit after tax, FY2023 audited FS</w:t>
             </w:r>
           </w:p>
         </w:tc>
@@ -4298,7 +4298,7 @@
                 <w:color w:val="1C3A36"/>
                 <w:sz w:val="15"/>
               </w:rPr>
-              <w:t>pat fy25</w:t>
+              <w:t>pat fy24</w:t>
             </w:r>
           </w:p>
         </w:tc>
@@ -4315,7 +4315,7 @@
                 <w:color w:val="1C3A36"/>
                 <w:sz w:val="15"/>
               </w:rPr>
-              <w:t>1,003.9</w:t>
+              <w:t>908.2</w:t>
             </w:r>
           </w:p>
         </w:tc>
@@ -4349,7 +4349,7 @@
                 <w:color w:val="1C3A36"/>
                 <w:sz w:val="15"/>
               </w:rPr>
-              <w:t>2026-02-09</w:t>
+              <w:t>2025-02-14</w:t>
             </w:r>
           </w:p>
         </w:tc>
@@ -4366,7 +4366,7 @@
                 <w:color w:val="1C3A36"/>
                 <w:sz w:val="15"/>
               </w:rPr>
-              <w:t>Profit after tax, FY2025 audited FS</w:t>
+              <w:t>Profit after tax, FY2024 audited FS</w:t>
             </w:r>
           </w:p>
         </w:tc>
@@ -4385,7 +4385,7 @@
                 <w:color w:val="1C3A36"/>
                 <w:sz w:val="15"/>
               </w:rPr>
-              <w:t>npa fy23</w:t>
+              <w:t>pat fy25</w:t>
             </w:r>
           </w:p>
         </w:tc>
@@ -4402,7 +4402,7 @@
                 <w:color w:val="1C3A36"/>
                 <w:sz w:val="15"/>
               </w:rPr>
-              <w:t>952.9</w:t>
+              <w:t>1,003.9</w:t>
             </w:r>
           </w:p>
         </w:tc>
@@ -4436,7 +4436,7 @@
                 <w:color w:val="1C3A36"/>
                 <w:sz w:val="15"/>
               </w:rPr>
-              <w:t>2024-02-14</w:t>
+              <w:t>2026-02-09</w:t>
             </w:r>
           </w:p>
         </w:tc>
@@ -4453,7 +4453,7 @@
                 <w:color w:val="1C3A36"/>
                 <w:sz w:val="15"/>
               </w:rPr>
-              <w:t>Profit attributable to equity holders, FY2023</w:t>
+              <w:t>Profit after tax, FY2025 audited FS</w:t>
             </w:r>
           </w:p>
         </w:tc>
@@ -4472,7 +4472,7 @@
                 <w:color w:val="1C3A36"/>
                 <w:sz w:val="15"/>
               </w:rPr>
-              <w:t>npa fy24</w:t>
+              <w:t>npa fy23</w:t>
             </w:r>
           </w:p>
         </w:tc>
@@ -4489,7 +4489,7 @@
                 <w:color w:val="1C3A36"/>
                 <w:sz w:val="15"/>
               </w:rPr>
-              <w:t>896.8</w:t>
+              <w:t>952.9</w:t>
             </w:r>
           </w:p>
         </w:tc>
@@ -4523,7 +4523,7 @@
                 <w:color w:val="1C3A36"/>
                 <w:sz w:val="15"/>
               </w:rPr>
-              <w:t>2025-02-14</w:t>
+              <w:t>2024-02-14</w:t>
             </w:r>
           </w:p>
         </w:tc>
@@ -4540,7 +4540,7 @@
                 <w:color w:val="1C3A36"/>
                 <w:sz w:val="15"/>
               </w:rPr>
-              <w:t>Profit attributable to equity holders, FY2024</w:t>
+              <w:t>Profit attributable to equity holders, FY2023</w:t>
             </w:r>
           </w:p>
         </w:tc>
@@ -4559,7 +4559,7 @@
                 <w:color w:val="1C3A36"/>
                 <w:sz w:val="15"/>
               </w:rPr>
-              <w:t>npa fy25</w:t>
+              <w:t>npa fy24</w:t>
             </w:r>
           </w:p>
         </w:tc>
@@ -4576,7 +4576,7 @@
                 <w:color w:val="1C3A36"/>
                 <w:sz w:val="15"/>
               </w:rPr>
-              <w:t>993.3</w:t>
+              <w:t>896.8</w:t>
             </w:r>
           </w:p>
         </w:tc>
@@ -4610,7 +4610,7 @@
                 <w:color w:val="1C3A36"/>
                 <w:sz w:val="15"/>
               </w:rPr>
-              <w:t>2026-02-09</w:t>
+              <w:t>2025-02-14</w:t>
             </w:r>
           </w:p>
         </w:tc>
@@ -4627,7 +4627,7 @@
                 <w:color w:val="1C3A36"/>
                 <w:sz w:val="15"/>
               </w:rPr>
-              <w:t>Profit attributable to equity holders, FY2025</w:t>
+              <w:t>Profit attributable to equity holders, FY2024</w:t>
             </w:r>
           </w:p>
         </w:tc>
@@ -4646,7 +4646,7 @@
                 <w:color w:val="1C3A36"/>
                 <w:sz w:val="15"/>
               </w:rPr>
-              <w:t>dna fy23</w:t>
+              <w:t>npa fy25</w:t>
             </w:r>
           </w:p>
         </w:tc>
@@ -4663,7 +4663,7 @@
                 <w:color w:val="1C3A36"/>
                 <w:sz w:val="15"/>
               </w:rPr>
-              <w:t>348.2</w:t>
+              <w:t>993.3</w:t>
             </w:r>
           </w:p>
         </w:tc>
@@ -4697,7 +4697,7 @@
                 <w:color w:val="1C3A36"/>
                 <w:sz w:val="15"/>
               </w:rPr>
-              <w:t>2024-02-14</w:t>
+              <w:t>2026-02-09</w:t>
             </w:r>
           </w:p>
         </w:tc>
@@ -4714,7 +4714,7 @@
                 <w:color w:val="1C3A36"/>
                 <w:sz w:val="15"/>
               </w:rPr>
-              <w:t>FY2023 CF: PPE dep 332.884 + RoU 3.158 + intangibles 12.157</w:t>
+              <w:t>Profit attributable to equity holders, FY2025</w:t>
             </w:r>
           </w:p>
         </w:tc>
@@ -4733,7 +4733,7 @@
                 <w:color w:val="1C3A36"/>
                 <w:sz w:val="15"/>
               </w:rPr>
-              <w:t>dna fy24</w:t>
+              <w:t>dna fy23</w:t>
             </w:r>
           </w:p>
         </w:tc>
@@ -4750,7 +4750,7 @@
                 <w:color w:val="1C3A36"/>
                 <w:sz w:val="15"/>
               </w:rPr>
-              <w:t>359.1</w:t>
+              <w:t>348.2</w:t>
             </w:r>
           </w:p>
         </w:tc>
@@ -4784,7 +4784,7 @@
                 <w:color w:val="1C3A36"/>
                 <w:sz w:val="15"/>
               </w:rPr>
-              <w:t>2025-02-14</w:t>
+              <w:t>2024-02-14</w:t>
             </w:r>
           </w:p>
         </w:tc>
@@ -4801,7 +4801,7 @@
                 <w:color w:val="1C3A36"/>
                 <w:sz w:val="15"/>
               </w:rPr>
-              <w:t>FY2024 CF: PPE dep 342.332 + RoU 4.592 + intangibles 12.157</w:t>
+              <w:t>FY2023 CF: PPE dep 332.884 + RoU 3.158 + intangibles 12.157</w:t>
             </w:r>
           </w:p>
         </w:tc>
@@ -4820,7 +4820,7 @@
                 <w:color w:val="1C3A36"/>
                 <w:sz w:val="15"/>
               </w:rPr>
-              <w:t>dna fy25</w:t>
+              <w:t>dna fy24</w:t>
             </w:r>
           </w:p>
         </w:tc>
@@ -4837,7 +4837,7 @@
                 <w:color w:val="1C3A36"/>
                 <w:sz w:val="15"/>
               </w:rPr>
-              <w:t>369.7</w:t>
+              <w:t>359.1</w:t>
             </w:r>
           </w:p>
         </w:tc>
@@ -4871,7 +4871,7 @@
                 <w:color w:val="1C3A36"/>
                 <w:sz w:val="15"/>
               </w:rPr>
-              <w:t>2026-02-09</w:t>
+              <w:t>2025-02-14</w:t>
             </w:r>
           </w:p>
         </w:tc>
@@ -4888,7 +4888,7 @@
                 <w:color w:val="1C3A36"/>
                 <w:sz w:val="15"/>
               </w:rPr>
-              <w:t>FY2025 CF: PPE dep 352.199 + RoU 5.361 + intangibles 12.157 (investment-property dep 6.317 excluded — investment properties are a non-operating side pocket in the bridge)</w:t>
+              <w:t>FY2024 CF: PPE dep 342.332 + RoU 4.592 + intangibles 12.157</w:t>
             </w:r>
           </w:p>
         </w:tc>
@@ -4907,7 +4907,7 @@
                 <w:color w:val="1C3A36"/>
                 <w:sz w:val="15"/>
               </w:rPr>
-              <w:t>capex fy23</w:t>
+              <w:t>dna fy25</w:t>
             </w:r>
           </w:p>
         </w:tc>
@@ -4924,7 +4924,7 @@
                 <w:color w:val="1C3A36"/>
                 <w:sz w:val="15"/>
               </w:rPr>
-              <w:t>320.1</w:t>
+              <w:t>369.7</w:t>
             </w:r>
           </w:p>
         </w:tc>
@@ -4958,7 +4958,7 @@
                 <w:color w:val="1C3A36"/>
                 <w:sz w:val="15"/>
               </w:rPr>
-              <w:t>2024-02-14</w:t>
+              <w:t>2026-02-09</w:t>
             </w:r>
           </w:p>
         </w:tc>
@@ -4975,7 +4975,7 @@
                 <w:color w:val="1C3A36"/>
                 <w:sz w:val="15"/>
               </w:rPr>
-              <w:t>FY2023 CF: additions to PPE</w:t>
+              <w:t>FY2025 CF: PPE dep 352.199 + RoU 5.361 + intangibles 12.157 (investment-property dep 6.317 excluded — investment properties are a non-operating side pocket in the bridge)</w:t>
             </w:r>
           </w:p>
         </w:tc>
@@ -4994,7 +4994,7 @@
                 <w:color w:val="1C3A36"/>
                 <w:sz w:val="15"/>
               </w:rPr>
-              <w:t>capex fy24</w:t>
+              <w:t>capex fy23</w:t>
             </w:r>
           </w:p>
         </w:tc>
@@ -5011,7 +5011,7 @@
                 <w:color w:val="1C3A36"/>
                 <w:sz w:val="15"/>
               </w:rPr>
-              <w:t>306.8</w:t>
+              <w:t>320.1</w:t>
             </w:r>
           </w:p>
         </w:tc>
@@ -5045,7 +5045,7 @@
                 <w:color w:val="1C3A36"/>
                 <w:sz w:val="15"/>
               </w:rPr>
-              <w:t>2025-02-14</w:t>
+              <w:t>2024-02-14</w:t>
             </w:r>
           </w:p>
         </w:tc>
@@ -5062,7 +5062,7 @@
                 <w:color w:val="1C3A36"/>
                 <w:sz w:val="15"/>
               </w:rPr>
-              <w:t>FY2024 CF: additions to PPE</w:t>
+              <w:t>FY2023 CF: additions to PPE</w:t>
             </w:r>
           </w:p>
         </w:tc>
@@ -5081,7 +5081,7 @@
                 <w:color w:val="1C3A36"/>
                 <w:sz w:val="15"/>
               </w:rPr>
-              <w:t>capex fy25</w:t>
+              <w:t>capex fy24</w:t>
             </w:r>
           </w:p>
         </w:tc>
@@ -5098,7 +5098,7 @@
                 <w:color w:val="1C3A36"/>
                 <w:sz w:val="15"/>
               </w:rPr>
-              <w:t>440.0</w:t>
+              <w:t>306.8</w:t>
             </w:r>
           </w:p>
         </w:tc>
@@ -5132,7 +5132,7 @@
                 <w:color w:val="1C3A36"/>
                 <w:sz w:val="15"/>
               </w:rPr>
-              <w:t>2026-02-09</w:t>
+              <w:t>2025-02-14</w:t>
             </w:r>
           </w:p>
         </w:tc>
@@ -5149,7 +5149,7 @@
                 <w:color w:val="1C3A36"/>
                 <w:sz w:val="15"/>
               </w:rPr>
-              <w:t>FY2025 CF: capital expenditure net of project-cost accruals (a further 171.085 was non-cash accrual movement, note 36)</w:t>
+              <w:t>FY2024 CF: additions to PPE</w:t>
             </w:r>
           </w:p>
         </w:tc>
@@ -5168,7 +5168,7 @@
                 <w:color w:val="1C3A36"/>
                 <w:sz w:val="15"/>
               </w:rPr>
-              <w:t>rt conn</w:t>
+              <w:t>capex fy25</w:t>
             </w:r>
           </w:p>
         </w:tc>
@@ -5185,7 +5185,7 @@
                 <w:color w:val="1C3A36"/>
                 <w:sz w:val="15"/>
               </w:rPr>
-              <w:t>2021: 1,368.0; 2022: 1,405.0; 2024: 1,566.0; 2025: 1,656.0; H1_2026: 1,707.0</w:t>
+              <w:t>440.0</w:t>
             </w:r>
           </w:p>
         </w:tc>
@@ -5219,7 +5219,7 @@
                 <w:color w:val="1C3A36"/>
                 <w:sz w:val="15"/>
               </w:rPr>
-              <w:t>2026-08-05</w:t>
+              <w:t>2026-02-09</w:t>
             </w:r>
           </w:p>
         </w:tc>
@@ -5236,7 +5236,7 @@
                 <w:color w:val="1C3A36"/>
                 <w:sz w:val="15"/>
               </w:rPr>
-              <w:t>Connected capacity history, k RT, H1-2026 earnings deck p13 (2023 not charted; interpolation never used — growth is computed 2024-&gt;2025)</w:t>
+              <w:t>FY2025 CF: capital expenditure net of project-cost accruals (a further 171.085 was non-cash accrual movement, note 36)</w:t>
             </w:r>
           </w:p>
         </w:tc>
@@ -5255,7 +5255,7 @@
                 <w:color w:val="1C3A36"/>
                 <w:sz w:val="15"/>
               </w:rPr>
-              <w:t>rt contracted</w:t>
+              <w:t>rt conn</w:t>
             </w:r>
           </w:p>
         </w:tc>
@@ -5272,7 +5272,7 @@
                 <w:color w:val="1C3A36"/>
                 <w:sz w:val="15"/>
               </w:rPr>
-              <w:t>2,018.0</w:t>
+              <w:t>2021: 1,368.0; 2022: 1,405.0; 2024: 1,566.0; 2025: 1,656.0; H1_2026: 1,707.0</w:t>
             </w:r>
           </w:p>
         </w:tc>
@@ -5323,7 +5323,7 @@
                 <w:color w:val="1C3A36"/>
                 <w:sz w:val="15"/>
               </w:rPr>
-              <w:t>Contracted capacity 30-Jun-2026, k RT, deck pp3-4,10</w:t>
+              <w:t>Connected capacity history, k RT, H1-2026 earnings deck p13 (2023 not charted; interpolation never used — growth is computed 2024-&gt;2025)</w:t>
             </w:r>
           </w:p>
         </w:tc>
@@ -5342,7 +5342,7 @@
                 <w:color w:val="1C3A36"/>
                 <w:sz w:val="15"/>
               </w:rPr>
-              <w:t>rt guid 2026</w:t>
+              <w:t>rt contracted</w:t>
             </w:r>
           </w:p>
         </w:tc>
@@ -5359,7 +5359,7 @@
                 <w:color w:val="1C3A36"/>
                 <w:sz w:val="15"/>
               </w:rPr>
-              <w:t>100.0, 110.0</w:t>
+              <w:t>2,018.0</w:t>
             </w:r>
           </w:p>
         </w:tc>
@@ -5410,7 +5410,7 @@
                 <w:color w:val="1C3A36"/>
                 <w:sz w:val="15"/>
               </w:rPr>
-              <w:t>FY2026 new-connections guidance, k RT, deck p13</w:t>
+              <w:t>Contracted capacity 30-Jun-2026, k RT, deck pp3-4,10</w:t>
             </w:r>
           </w:p>
         </w:tc>
@@ -5429,7 +5429,7 @@
                 <w:color w:val="1C3A36"/>
                 <w:sz w:val="15"/>
               </w:rPr>
-              <w:t>cons rev</w:t>
+              <w:t>rt guid 2026</w:t>
             </w:r>
           </w:p>
         </w:tc>
@@ -5446,7 +5446,7 @@
                 <w:color w:val="1C3A36"/>
                 <w:sz w:val="15"/>
               </w:rPr>
-              <w:t>2022: 1,463.0; 2023: 1,719.6; 2024: 1,895.3; 2025: 1,923.9</w:t>
+              <w:t>100.0, 110.0</w:t>
             </w:r>
           </w:p>
         </w:tc>
@@ -5480,7 +5480,7 @@
                 <w:color w:val="1C3A36"/>
                 <w:sz w:val="15"/>
               </w:rPr>
-              <w:t>2026-02-09</w:t>
+              <w:t>2026-08-05</w:t>
             </w:r>
           </w:p>
         </w:tc>
@@ -5497,7 +5497,7 @@
                 <w:color w:val="1C3A36"/>
                 <w:sz w:val="15"/>
               </w:rPr>
-              <w:t>Consumption revenue, auditor's key-audit-matter section of each audited FS FY2022-FY2025 (the only disclosed AED split of the revenue streams)</w:t>
+              <w:t>FY2026 new-connections guidance, k RT, deck p13</w:t>
             </w:r>
           </w:p>
         </w:tc>
@@ -5516,7 +5516,7 @@
                 <w:color w:val="1C3A36"/>
                 <w:sz w:val="15"/>
               </w:rPr>
-              <w:t>pipes rev fy25</w:t>
+              <w:t>cons rev</w:t>
             </w:r>
           </w:p>
         </w:tc>
@@ -5533,7 +5533,7 @@
                 <w:color w:val="1C3A36"/>
                 <w:sz w:val="15"/>
               </w:rPr>
-              <w:t>17.214</w:t>
+              <w:t>2022: 1,463.0; 2023: 1,719.6; 2024: 1,895.3; 2025: 1,923.9</w:t>
             </w:r>
           </w:p>
         </w:tc>
@@ -5584,7 +5584,7 @@
                 <w:color w:val="1C3A36"/>
                 <w:sz w:val="15"/>
               </w:rPr>
-              <w:t>Sale of pre-insulated pipes (Logstor), revenue note 23, FY2025 audited FS</w:t>
+              <w:t>Consumption revenue, auditor's key-audit-matter section of each audited FS FY2022-FY2025 (the only disclosed AED split of the revenue streams)</w:t>
             </w:r>
           </w:p>
         </w:tc>
@@ -5603,7 +5603,7 @@
                 <w:color w:val="1C3A36"/>
                 <w:sz w:val="15"/>
               </w:rPr>
-              <w:t>eflh h1</w:t>
+              <w:t>pipes rev fy25</w:t>
             </w:r>
           </w:p>
         </w:tc>
@@ -5620,7 +5620,7 @@
                 <w:color w:val="1C3A36"/>
                 <w:sz w:val="15"/>
               </w:rPr>
-              <w:t>-0.09</w:t>
+              <w:t>17.214</w:t>
             </w:r>
           </w:p>
         </w:tc>
@@ -5654,7 +5654,7 @@
                 <w:color w:val="1C3A36"/>
                 <w:sz w:val="15"/>
               </w:rPr>
-              <w:t>2026-08-05</w:t>
+              <w:t>2026-02-09</w:t>
             </w:r>
           </w:p>
         </w:tc>
@@ -5671,7 +5671,7 @@
                 <w:color w:val="1C3A36"/>
                 <w:sz w:val="15"/>
               </w:rPr>
-              <w:t>Equivalent full-load hours H1-2026: 698 hrs, -9.0% y/y (consumption -42m RTh), deck p4; interim note 30 ties the fall partly to conflict impact on hospitality occupancy</w:t>
+              <w:t>Sale of pre-insulated pipes (Logstor), revenue note 23, FY2025 audited FS</w:t>
             </w:r>
           </w:p>
         </w:tc>
@@ -5690,7 +5690,7 @@
                 <w:color w:val="1C3A36"/>
                 <w:sz w:val="15"/>
               </w:rPr>
-              <w:t>ew cost fy25</w:t>
+              <w:t>eflh h1</w:t>
             </w:r>
           </w:p>
         </w:tc>
@@ -5707,7 +5707,7 @@
                 <w:color w:val="1C3A36"/>
                 <w:sz w:val="15"/>
               </w:rPr>
-              <w:t>1,467.7</w:t>
+              <w:t>-0.09</w:t>
             </w:r>
           </w:p>
         </w:tc>
@@ -5741,7 +5741,7 @@
                 <w:color w:val="1C3A36"/>
                 <w:sz w:val="15"/>
               </w:rPr>
-              <w:t>2026-02-09</w:t>
+              <w:t>2026-08-05</w:t>
             </w:r>
           </w:p>
         </w:tc>
@@ -5758,7 +5758,7 @@
                 <w:color w:val="1C3A36"/>
                 <w:sz w:val="15"/>
               </w:rPr>
-              <w:t>Electricity &amp; water purchased from DEWA (related-party note 12), FY2025 audited FS</w:t>
+              <w:t>Equivalent full-load hours H1-2026: 698 hrs, -9.0% y/y (consumption -42m RTh), deck p4; interim note 30 ties the fall partly to conflict impact on hospitality occupancy</w:t>
             </w:r>
           </w:p>
         </w:tc>
@@ -5777,7 +5777,7 @@
                 <w:color w:val="1C3A36"/>
                 <w:sz w:val="15"/>
               </w:rPr>
-              <w:t>ew cost fy24</w:t>
+              <w:t>ew cost fy25</w:t>
             </w:r>
           </w:p>
         </w:tc>
@@ -5794,7 +5794,7 @@
                 <w:color w:val="1C3A36"/>
                 <w:sz w:val="15"/>
               </w:rPr>
-              <w:t>1,373.2</w:t>
+              <w:t>1,467.7</w:t>
             </w:r>
           </w:p>
         </w:tc>
@@ -5828,7 +5828,7 @@
                 <w:color w:val="1C3A36"/>
                 <w:sz w:val="15"/>
               </w:rPr>
-              <w:t>2025-02-14</w:t>
+              <w:t>2026-02-09</w:t>
             </w:r>
           </w:p>
         </w:tc>
@@ -5845,7 +5845,7 @@
                 <w:color w:val="1C3A36"/>
                 <w:sz w:val="15"/>
               </w:rPr>
-              <w:t>Electricity &amp; water purchased from DEWA (related-party note 12), FY2024 audited FS</w:t>
+              <w:t>Electricity &amp; water purchased from DEWA (related-party note 12), FY2025 audited FS</w:t>
             </w:r>
           </w:p>
         </w:tc>
@@ -5864,7 +5864,7 @@
                 <w:color w:val="1C3A36"/>
                 <w:sz w:val="15"/>
               </w:rPr>
-              <w:t>borrow jun26</w:t>
+              <w:t>ew cost fy24</w:t>
             </w:r>
           </w:p>
         </w:tc>
@@ -5881,7 +5881,7 @@
                 <w:color w:val="1C3A36"/>
                 <w:sz w:val="15"/>
               </w:rPr>
-              <w:t>5,502.8</w:t>
+              <w:t>1,373.2</w:t>
             </w:r>
           </w:p>
         </w:tc>
@@ -5915,7 +5915,7 @@
                 <w:color w:val="1C3A36"/>
                 <w:sz w:val="15"/>
               </w:rPr>
-              <w:t>2026-08-05</w:t>
+              <w:t>2025-02-14</w:t>
             </w:r>
           </w:p>
         </w:tc>
@@ -5932,7 +5932,7 @@
                 <w:color w:val="1C3A36"/>
                 <w:sz w:val="15"/>
               </w:rPr>
-              <w:t>Bank borrowings 30-Jun-2026: current 2.845 + non-current 5,500.000, reviewed interim BS</w:t>
+              <w:t>Electricity &amp; water purchased from DEWA (related-party note 12), FY2024 audited FS</w:t>
             </w:r>
           </w:p>
         </w:tc>
@@ -5951,7 +5951,7 @@
                 <w:color w:val="1C3A36"/>
                 <w:sz w:val="15"/>
               </w:rPr>
-              <w:t>lease jun26</w:t>
+              <w:t>borrow jun26</w:t>
             </w:r>
           </w:p>
         </w:tc>
@@ -5968,7 +5968,7 @@
                 <w:color w:val="1C3A36"/>
                 <w:sz w:val="15"/>
               </w:rPr>
-              <w:t>0.872</w:t>
+              <w:t>5,502.8</w:t>
             </w:r>
           </w:p>
         </w:tc>
@@ -6019,7 +6019,7 @@
                 <w:color w:val="1C3A36"/>
                 <w:sz w:val="15"/>
               </w:rPr>
-              <w:t>Lease liabilities 30-Jun-2026</w:t>
+              <w:t>Bank borrowings 30-Jun-2026: current 2.845 + non-current 5,500.000, reviewed interim BS</w:t>
             </w:r>
           </w:p>
         </w:tc>
@@ -6038,7 +6038,7 @@
                 <w:color w:val="1C3A36"/>
                 <w:sz w:val="15"/>
               </w:rPr>
-              <w:t>cash jun26</w:t>
+              <w:t>lease jun26</w:t>
             </w:r>
           </w:p>
         </w:tc>
@@ -6055,7 +6055,7 @@
                 <w:color w:val="1C3A36"/>
                 <w:sz w:val="15"/>
               </w:rPr>
-              <w:t>2,472.0</w:t>
+              <w:t>0.872</w:t>
             </w:r>
           </w:p>
         </w:tc>
@@ -6106,7 +6106,7 @@
                 <w:color w:val="1C3A36"/>
                 <w:sz w:val="15"/>
               </w:rPr>
-              <w:t>Cash and cash equivalents 30-Jun-2026</w:t>
+              <w:t>Lease liabilities 30-Jun-2026</w:t>
             </w:r>
           </w:p>
         </w:tc>
@@ -6125,7 +6125,7 @@
                 <w:color w:val="1C3A36"/>
                 <w:sz w:val="15"/>
               </w:rPr>
-              <w:t>deposits jun26</w:t>
+              <w:t>cash jun26</w:t>
             </w:r>
           </w:p>
         </w:tc>
@@ -6142,7 +6142,7 @@
                 <w:color w:val="1C3A36"/>
                 <w:sz w:val="15"/>
               </w:rPr>
-              <w:t>40.212</w:t>
+              <w:t>2,472.0</w:t>
             </w:r>
           </w:p>
         </w:tc>
@@ -6193,7 +6193,7 @@
                 <w:color w:val="1C3A36"/>
                 <w:sz w:val="15"/>
               </w:rPr>
-              <w:t>Term deposits (&gt;3m) 30-Jun-2026</w:t>
+              <w:t>Cash and cash equivalents 30-Jun-2026</w:t>
             </w:r>
           </w:p>
         </w:tc>
@@ -6212,7 +6212,7 @@
                 <w:color w:val="1C3A36"/>
                 <w:sz w:val="15"/>
               </w:rPr>
-              <w:t>nci book jun26</w:t>
+              <w:t>deposits jun26</w:t>
             </w:r>
           </w:p>
         </w:tc>
@@ -6229,7 +6229,7 @@
                 <w:color w:val="1C3A36"/>
                 <w:sz w:val="15"/>
               </w:rPr>
-              <w:t>190.7</w:t>
+              <w:t>40.212</w:t>
             </w:r>
           </w:p>
         </w:tc>
@@ -6280,7 +6280,7 @@
                 <w:color w:val="1C3A36"/>
                 <w:sz w:val="15"/>
               </w:rPr>
-              <w:t>Non-controlling interests (30% of DXB CoolCo et al.), 30-Jun-2026 reviewed BS</w:t>
+              <w:t>Term deposits (&gt;3m) 30-Jun-2026</w:t>
             </w:r>
           </w:p>
         </w:tc>
@@ -6299,7 +6299,7 @@
                 <w:color w:val="1C3A36"/>
                 <w:sz w:val="15"/>
               </w:rPr>
-              <w:t>invprop jun26</w:t>
+              <w:t>nci book jun26</w:t>
             </w:r>
           </w:p>
         </w:tc>
@@ -6316,7 +6316,7 @@
                 <w:color w:val="1C3A36"/>
                 <w:sz w:val="15"/>
               </w:rPr>
-              <w:t>168.7</w:t>
+              <w:t>190.7</w:t>
             </w:r>
           </w:p>
         </w:tc>
@@ -6367,7 +6367,7 @@
                 <w:color w:val="1C3A36"/>
                 <w:sz w:val="15"/>
               </w:rPr>
-              <w:t>Investment properties 30-Jun-2026 (non-operating side pocket, added in the bridge at book)</w:t>
+              <w:t>Non-controlling interests (15% of DXB CoolCo et al. — the H1-2026 subsidiary note shows Dxb CoolCo FZCO at 85%/85%), 30-Jun-2026 reviewed BS</w:t>
             </w:r>
           </w:p>
         </w:tc>
@@ -6386,7 +6386,7 @@
                 <w:color w:val="1C3A36"/>
                 <w:sz w:val="15"/>
               </w:rPr>
-              <w:t>fvtpl jun26</w:t>
+              <w:t>recv jun26</w:t>
             </w:r>
           </w:p>
         </w:tc>
@@ -6403,7 +6403,7 @@
                 <w:color w:val="1C3A36"/>
                 <w:sz w:val="15"/>
               </w:rPr>
-              <w:t>53.411</w:t>
+              <w:t>1,294.4</w:t>
             </w:r>
           </w:p>
         </w:tc>
@@ -6454,7 +6454,7 @@
                 <w:color w:val="1C3A36"/>
                 <w:sz w:val="15"/>
               </w:rPr>
-              <w:t>Financial assets at FVTPL 30-Jun-2026 (cash-like, added in the bridge)</w:t>
+              <w:t>Financial assets at amortised cost, 30-Jun-2026 reviewed BS: non-current 1,273.130 + current 21.312. Note 8 composition: AED 1,005.030 from Dubai Aviation City Corporation (DXB CoolCo acquisition, 2023) + AED 289.412 from Nakheel PJSC (Empower Snow acquisition, 2021) — related-party acquisition receivables under common control, NOT an operating concession asset. Clean financial-asset treatment adopted per critique (17-Aug-2026): interest income excluded from operating EBITDA/FCFF, asset added at book in the EV-to-equity bridge, and excluded from terminal invested capital</w:t>
             </w:r>
           </w:p>
         </w:tc>
@@ -6473,7 +6473,7 @@
                 <w:color w:val="1C3A36"/>
                 <w:sz w:val="15"/>
               </w:rPr>
-              <w:t>fvoci jun26</w:t>
+              <w:t>invprop jun26</w:t>
             </w:r>
           </w:p>
         </w:tc>
@@ -6490,7 +6490,7 @@
                 <w:color w:val="1C3A36"/>
                 <w:sz w:val="15"/>
               </w:rPr>
-              <w:t>74.564</w:t>
+              <w:t>168.7</w:t>
             </w:r>
           </w:p>
         </w:tc>
@@ -6541,7 +6541,7 @@
                 <w:color w:val="1C3A36"/>
                 <w:sz w:val="15"/>
               </w:rPr>
-              <w:t>Financial assets at FVOCI 30-Jun-2026 (added at book)</w:t>
+              <w:t>Investment properties 30-Jun-2026 (non-operating side pocket, added in the bridge at book)</w:t>
             </w:r>
           </w:p>
         </w:tc>
@@ -6560,7 +6560,7 @@
                 <w:color w:val="1C3A36"/>
                 <w:sz w:val="15"/>
               </w:rPr>
-              <w:t>eq attr fy25</w:t>
+              <w:t>fvtpl jun26</w:t>
             </w:r>
           </w:p>
         </w:tc>
@@ -6577,7 +6577,7 @@
                 <w:color w:val="1C3A36"/>
                 <w:sz w:val="15"/>
               </w:rPr>
-              <w:t>3,310.9</w:t>
+              <w:t>53.411</w:t>
             </w:r>
           </w:p>
         </w:tc>
@@ -6611,7 +6611,7 @@
                 <w:color w:val="1C3A36"/>
                 <w:sz w:val="15"/>
               </w:rPr>
-              <w:t>2026-02-09</w:t>
+              <w:t>2026-08-05</w:t>
             </w:r>
           </w:p>
         </w:tc>
@@ -6628,7 +6628,7 @@
                 <w:color w:val="1C3A36"/>
                 <w:sz w:val="15"/>
               </w:rPr>
-              <w:t>Equity attributable to holders, 31-Dec-2025 audited BS</w:t>
+              <w:t>Financial assets at FVTPL 30-Jun-2026 (cash-like, added in the bridge)</w:t>
             </w:r>
           </w:p>
         </w:tc>
@@ -6647,7 +6647,7 @@
                 <w:color w:val="1C3A36"/>
                 <w:sz w:val="15"/>
               </w:rPr>
-              <w:t>eq attr jun26</w:t>
+              <w:t>fvoci jun26</w:t>
             </w:r>
           </w:p>
         </w:tc>
@@ -6664,7 +6664,7 @@
                 <w:color w:val="1C3A36"/>
                 <w:sz w:val="15"/>
               </w:rPr>
-              <w:t>3,337.6</w:t>
+              <w:t>74.564</w:t>
             </w:r>
           </w:p>
         </w:tc>
@@ -6715,7 +6715,7 @@
                 <w:color w:val="1C3A36"/>
                 <w:sz w:val="15"/>
               </w:rPr>
-              <w:t>Equity attributable to holders, 30-Jun-2026 reviewed BS</w:t>
+              <w:t>Financial assets at FVOCI 30-Jun-2026 (added at book)</w:t>
             </w:r>
           </w:p>
         </w:tc>
@@ -6734,7 +6734,7 @@
                 <w:color w:val="1C3A36"/>
                 <w:sz w:val="15"/>
               </w:rPr>
-              <w:t>nci pat fy25</w:t>
+              <w:t>eq attr fy25</w:t>
             </w:r>
           </w:p>
         </w:tc>
@@ -6751,7 +6751,7 @@
                 <w:color w:val="1C3A36"/>
                 <w:sz w:val="15"/>
               </w:rPr>
-              <w:t>10.633</w:t>
+              <w:t>3,310.9</w:t>
             </w:r>
           </w:p>
         </w:tc>
@@ -6802,7 +6802,7 @@
                 <w:color w:val="1C3A36"/>
                 <w:sz w:val="15"/>
               </w:rPr>
-              <w:t>Profit attributable to NCI, FY2025 audited FS</w:t>
+              <w:t>Equity attributable to holders, 31-Dec-2025 audited BS</w:t>
             </w:r>
           </w:p>
         </w:tc>
@@ -6821,7 +6821,7 @@
                 <w:color w:val="1C3A36"/>
                 <w:sz w:val="15"/>
               </w:rPr>
-              <w:t>rev h1 26</w:t>
+              <w:t>eq attr jun26</w:t>
             </w:r>
           </w:p>
         </w:tc>
@@ -6838,7 +6838,7 @@
                 <w:color w:val="1C3A36"/>
                 <w:sz w:val="15"/>
               </w:rPr>
-              <w:t>1,519.4</w:t>
+              <w:t>3,337.6</w:t>
             </w:r>
           </w:p>
         </w:tc>
@@ -6889,7 +6889,7 @@
                 <w:color w:val="1C3A36"/>
                 <w:sz w:val="15"/>
               </w:rPr>
-              <w:t>Revenue, H1-2026 reviewed interim FS</w:t>
+              <w:t>Equity attributable to holders, 30-Jun-2026 reviewed BS</w:t>
             </w:r>
           </w:p>
         </w:tc>
@@ -6908,7 +6908,7 @@
                 <w:color w:val="1C3A36"/>
                 <w:sz w:val="15"/>
               </w:rPr>
-              <w:t>rev h1 25</w:t>
+              <w:t>nci pat fy25</w:t>
             </w:r>
           </w:p>
         </w:tc>
@@ -6925,7 +6925,7 @@
                 <w:color w:val="1C3A36"/>
                 <w:sz w:val="15"/>
               </w:rPr>
-              <w:t>1,453.4</w:t>
+              <w:t>10.633</w:t>
             </w:r>
           </w:p>
         </w:tc>
@@ -6959,7 +6959,7 @@
                 <w:color w:val="1C3A36"/>
                 <w:sz w:val="15"/>
               </w:rPr>
-              <w:t>2026-08-05</w:t>
+              <w:t>2026-02-09</w:t>
             </w:r>
           </w:p>
         </w:tc>
@@ -6976,7 +6976,7 @@
                 <w:color w:val="1C3A36"/>
                 <w:sz w:val="15"/>
               </w:rPr>
-              <w:t>Revenue, H1-2025 comparative</w:t>
+              <w:t>Profit attributable to NCI, FY2025 audited FS</w:t>
             </w:r>
           </w:p>
         </w:tc>
@@ -6995,7 +6995,7 @@
                 <w:color w:val="1C3A36"/>
                 <w:sz w:val="15"/>
               </w:rPr>
-              <w:t>pat h1 26</w:t>
+              <w:t>rev h1 26</w:t>
             </w:r>
           </w:p>
         </w:tc>
@@ -7012,7 +7012,7 @@
                 <w:color w:val="1C3A36"/>
                 <w:sz w:val="15"/>
               </w:rPr>
-              <w:t>467.9</w:t>
+              <w:t>1,519.4</w:t>
             </w:r>
           </w:p>
         </w:tc>
@@ -7063,7 +7063,7 @@
                 <w:color w:val="1C3A36"/>
                 <w:sz w:val="15"/>
               </w:rPr>
-              <w:t>Profit after tax, H1-2026 reviewed interim FS</w:t>
+              <w:t>Revenue, H1-2026 reviewed interim FS</w:t>
             </w:r>
           </w:p>
         </w:tc>
@@ -7082,7 +7082,7 @@
                 <w:color w:val="1C3A36"/>
                 <w:sz w:val="15"/>
               </w:rPr>
-              <w:t>ebitda h1 26</w:t>
+              <w:t>rev h1 25</w:t>
             </w:r>
           </w:p>
         </w:tc>
@@ -7099,7 +7099,7 @@
                 <w:color w:val="1C3A36"/>
                 <w:sz w:val="15"/>
               </w:rPr>
-              <w:t>773.0</w:t>
+              <w:t>1,453.4</w:t>
             </w:r>
           </w:p>
         </w:tc>
@@ -7150,7 +7150,7 @@
                 <w:color w:val="1C3A36"/>
                 <w:sz w:val="15"/>
               </w:rPr>
-              <w:t>EBITDA H1-2026 as presented, earnings deck p4 (Q1 margin 56.8%, Q2 46.7%)</w:t>
+              <w:t>Revenue, H1-2025 comparative</w:t>
             </w:r>
           </w:p>
         </w:tc>
@@ -7169,7 +7169,7 @@
                 <w:color w:val="1C3A36"/>
                 <w:sz w:val="15"/>
               </w:rPr>
-              <w:t>netdebt jun26 co</w:t>
+              <w:t>pat h1 26</w:t>
             </w:r>
           </w:p>
         </w:tc>
@@ -7186,7 +7186,7 @@
                 <w:color w:val="1C3A36"/>
                 <w:sz w:val="15"/>
               </w:rPr>
-              <w:t>2,991.0</w:t>
+              <w:t>467.9</w:t>
             </w:r>
           </w:p>
         </w:tc>
@@ -7237,7 +7237,7 @@
                 <w:color w:val="1C3A36"/>
                 <w:sz w:val="15"/>
               </w:rPr>
-              <w:t>Net debt 30-Jun-2026 as the company presents it, deck p11 (1.8x LTM EBITDA) — reproduced exactly by borrowings + leases - cash - term deposits, verified by cross-check</w:t>
+              <w:t>Profit after tax, H1-2026 reviewed interim FS</w:t>
             </w:r>
           </w:p>
         </w:tc>
@@ -7256,7 +7256,7 @@
                 <w:color w:val="1C3A36"/>
                 <w:sz w:val="15"/>
               </w:rPr>
-              <w:t>div policy</w:t>
+              <w:t>ebitda h1 26</w:t>
             </w:r>
           </w:p>
         </w:tc>
@@ -7273,7 +7273,7 @@
                 <w:color w:val="1C3A36"/>
                 <w:sz w:val="15"/>
               </w:rPr>
-              <w:t>875.0</w:t>
+              <w:t>773.0</w:t>
             </w:r>
           </w:p>
         </w:tc>
@@ -7324,7 +7324,7 @@
                 <w:color w:val="1C3A36"/>
                 <w:sz w:val="15"/>
               </w:rPr>
-              <w:t>Dividend AED 875m/yr committed for 2025 AND 2026 (2 x 437.5m, Oct/Apr), deck p12; FY2025 FS note 39: 875.0 paid in 2025</w:t>
+              <w:t>EBITDA H1-2026 as presented, earnings deck p4 (Q1 margin 56.8%, Q2 46.7%)</w:t>
             </w:r>
           </w:p>
         </w:tc>
@@ -7343,7 +7343,7 @@
                 <w:color w:val="1C3A36"/>
                 <w:sz w:val="15"/>
               </w:rPr>
-              <w:t>beta</w:t>
+              <w:t>netdebt jun26 co</w:t>
             </w:r>
           </w:p>
         </w:tc>
@@ -7360,7 +7360,7 @@
                 <w:color w:val="1C3A36"/>
                 <w:sz w:val="15"/>
               </w:rPr>
-              <w:t>0.863</w:t>
+              <w:t>2,991.0</w:t>
             </w:r>
           </w:p>
         </w:tc>
@@ -7394,7 +7394,7 @@
                 <w:color w:val="1C3A36"/>
                 <w:sz w:val="15"/>
               </w:rPr>
-              <w:t>2026-08-10</w:t>
+              <w:t>2026-08-05</w:t>
             </w:r>
           </w:p>
         </w:tc>
@@ -7411,7 +7411,7 @@
                 <w:color w:val="1C3A36"/>
                 <w:sz w:val="15"/>
               </w:rPr>
-              <w:t>Own-stock weekly regression vs the FTSE ADX General Index — the UAE base market index PER EXPLICIT INSTRUCTION 10-Aug-2026, replacing the listing exchange's own DFM General Index (that regression, beta 0.652, is retained in beta_result_dfmgi.json as a comparison). User-supplied FADGI history 2011-2026; regression window 25-Nov-2022..24-Jul-2026 (3.66y, clipped at the index file's endpoint two weeks before the anchor): beta 0.863, R2 0.103, n 189, SE 0.186, CI90 [0.56, 1.17] — meets the study’s minimum statistical-usability standard</w:t>
+              <w:t>Net debt 30-Jun-2026 as the company presents it, deck p11 (1.8x LTM EBITDA) — reproduced exactly by borrowings + leases - cash - term deposits, verified by cross-check</w:t>
             </w:r>
           </w:p>
         </w:tc>
@@ -7430,7 +7430,7 @@
                 <w:color w:val="1C3A36"/>
                 <w:sz w:val="15"/>
               </w:rPr>
-              <w:t>kd marg</w:t>
+              <w:t>div policy</w:t>
             </w:r>
           </w:p>
         </w:tc>
@@ -7447,7 +7447,7 @@
                 <w:color w:val="1C3A36"/>
                 <w:sz w:val="15"/>
               </w:rPr>
-              <w:t>0.0492</w:t>
+              <w:t>875.0</w:t>
             </w:r>
           </w:p>
         </w:tc>
@@ -7481,7 +7481,7 @@
                 <w:color w:val="1C3A36"/>
                 <w:sz w:val="15"/>
               </w:rPr>
-              <w:t>2026-02-09</w:t>
+              <w:t>2026-08-05</w:t>
             </w:r>
           </w:p>
         </w:tc>
@@ -7498,7 +7498,7 @@
                 <w:color w:val="1C3A36"/>
                 <w:sz w:val="15"/>
               </w:rPr>
-              <w:t>Marginal cost of debt = the company's OWN FY2025 borrowing-cost capitalisation rate (note 30), struck on the 2025 full refinance of both AED 2.75bn RCFs at EIBOR + a REDUCED margin; sits above the 4.48% AED sovereign as a same-currency corporate must (2024 comparison: 5.993%; spot 3M EIBOR 3.66% + implied margin ~0.9-1.3%)</w:t>
+              <w:t>Dividend AED 875m/yr committed for 2025 AND 2026 (2 x 437.5m, Oct/Apr), deck p12; FY2025 FS note 39: 875.0 paid in 2025</w:t>
             </w:r>
           </w:p>
         </w:tc>
@@ -7517,7 +7517,7 @@
                 <w:color w:val="1C3A36"/>
                 <w:sz w:val="15"/>
               </w:rPr>
-              <w:t>tax dmtt</w:t>
+              <w:t>beta</w:t>
             </w:r>
           </w:p>
         </w:tc>
@@ -7534,7 +7534,7 @@
                 <w:color w:val="1C3A36"/>
                 <w:sz w:val="15"/>
               </w:rPr>
-              <w:t>0.15</w:t>
+              <w:t>0.863</w:t>
             </w:r>
           </w:p>
         </w:tc>
@@ -7551,7 +7551,7 @@
                 <w:color w:val="1C3A36"/>
                 <w:sz w:val="15"/>
               </w:rPr>
-              <w:t>Country</w:t>
+              <w:t>Company</w:t>
             </w:r>
           </w:p>
         </w:tc>
@@ -7568,7 +7568,7 @@
                 <w:color w:val="1C3A36"/>
                 <w:sz w:val="15"/>
               </w:rPr>
-              <w:t>2026-08-09</w:t>
+              <w:t>2026-08-10</w:t>
             </w:r>
           </w:p>
         </w:tc>
@@ -7585,7 +7585,7 @@
                 <w:color w:val="1C3A36"/>
                 <w:sz w:val="15"/>
               </w:rPr>
-              <w:t>OECD Pillar-Two UAE domestic minimum top-up tax 15% for groups &gt;= EUR 750m revenue — whether DEWA-level (80%) consolidation sweeps Empower in is CONTESTED; computed as the full alternative framing</w:t>
+              <w:t>Own-stock weekly regression vs the FTSE ADX General Index — the UAE base market index PER EXPLICIT INSTRUCTION 10-Aug-2026, replacing the listing exchange's own DFM General Index (that regression, beta 0.652, is retained as the archived comparison regression — priced as a full parallel valuation since the 17-Aug revision). User-supplied FADGI history 2011-2026; regression window 25-Nov-2022..24-Jul-2026 (3.66y, clipped at the index file's endpoint two weeks before the anchor): beta 0.863, R2 0.103, n 189, SE 0.186, CI90 [0.56, 1.17] — meets the study’s minimum statistical-usability standard</w:t>
             </w:r>
           </w:p>
         </w:tc>
@@ -7604,7 +7604,7 @@
                 <w:color w:val="1C3A36"/>
                 <w:sz w:val="15"/>
               </w:rPr>
-              <w:t>rf aed</w:t>
+              <w:t>kd marg</w:t>
             </w:r>
           </w:p>
         </w:tc>
@@ -7621,7 +7621,7 @@
                 <w:color w:val="1C3A36"/>
                 <w:sz w:val="15"/>
               </w:rPr>
-              <w:t>0.0448</w:t>
+              <w:t>0.0492</w:t>
             </w:r>
           </w:p>
         </w:tc>
@@ -7638,7 +7638,7 @@
                 <w:color w:val="1C3A36"/>
                 <w:sz w:val="15"/>
               </w:rPr>
-              <w:t>Country</w:t>
+              <w:t>Company</w:t>
             </w:r>
           </w:p>
         </w:tc>
@@ -7655,7 +7655,7 @@
                 <w:color w:val="1C3A36"/>
                 <w:sz w:val="15"/>
               </w:rPr>
-              <w:t>2026-07-30</w:t>
+              <w:t>2026-02-09</w:t>
             </w:r>
           </w:p>
         </w:tc>
@@ -7672,7 +7672,7 @@
                 <w:color w:val="1C3A36"/>
                 <w:sz w:val="15"/>
               </w:rPr>
-              <w:t>UAE dirham T-Bond, Jan-2031 tranche, auction YTM 30-Jul-2026 — the longest AED sovereign print (4.4y tenor; the 5y+ tenor gap vs the cash-flow horizon is flagged, spread over UST was ~4bp at issue)</w:t>
+              <w:t>Cost-of-debt anchor = the company's own disclosed all-in borrowing cost (the accounting capitalisation rate on general borrowings, note 30 — an average, not a marginal print), struck after the 2025 refinancing into two AED 2.75bn revolving tranches at EIBOR + a REDUCED margin; per the H1-2026 borrowings note only ONE tranche has been extended (to Feb-2028) — the other still matures Sep-2027, a dated roll risk stated in the study; sits above the 4.48% AED sovereign as a same-currency corporate must (2024 comparison: 5.993%; 3M EIBOR ~3.9% in Aug-2026, 3.66% at end-March, + implied margin ~0.9-1.3%)</w:t>
             </w:r>
           </w:p>
         </w:tc>
@@ -7691,7 +7691,7 @@
                 <w:color w:val="1C3A36"/>
                 <w:sz w:val="15"/>
               </w:rPr>
-              <w:t>ds rating</w:t>
+              <w:t>tax dmtt</w:t>
             </w:r>
           </w:p>
         </w:tc>
@@ -7708,7 +7708,7 @@
                 <w:color w:val="1C3A36"/>
                 <w:sz w:val="15"/>
               </w:rPr>
-              <w:t>0.0039</w:t>
+              <w:t>0.15</w:t>
             </w:r>
           </w:p>
         </w:tc>
@@ -7742,7 +7742,7 @@
                 <w:color w:val="1C3A36"/>
                 <w:sz w:val="15"/>
               </w:rPr>
-              <w:t>2026-07-01</w:t>
+              <w:t>2026-08-09</w:t>
             </w:r>
           </w:p>
         </w:tc>
@@ -7759,7 +7759,7 @@
                 <w:color w:val="1C3A36"/>
                 <w:sz w:val="15"/>
               </w:rPr>
-              <w:t>UAE adjusted default spread, rating basis (Aa2), Damodaran ctryprem July-2026 edition (data 30-Jun-2026)</w:t>
+              <w:t>OECD Pillar-Two UAE domestic minimum top-up tax 15% for groups &gt;= EUR 750m revenue — whether DEWA-level (80%) consolidation sweeps Empower in is CONTESTED; computed as the full alternative framing</w:t>
             </w:r>
           </w:p>
         </w:tc>
@@ -7778,7 +7778,7 @@
                 <w:color w:val="1C3A36"/>
                 <w:sz w:val="15"/>
               </w:rPr>
-              <w:t>ds cds</w:t>
+              <w:t>rf aed</w:t>
             </w:r>
           </w:p>
         </w:tc>
@@ -7795,7 +7795,7 @@
                 <w:color w:val="1C3A36"/>
                 <w:sz w:val="15"/>
               </w:rPr>
-              <w:t>0.0052</w:t>
+              <w:t>0.0448</w:t>
             </w:r>
           </w:p>
         </w:tc>
@@ -7829,7 +7829,7 @@
                 <w:color w:val="1C3A36"/>
                 <w:sz w:val="15"/>
               </w:rPr>
-              <w:t>2026-07-01</w:t>
+              <w:t>2026-07-30</w:t>
             </w:r>
           </w:p>
         </w:tc>
@@ -7846,7 +7846,7 @@
                 <w:color w:val="1C3A36"/>
                 <w:sz w:val="15"/>
               </w:rPr>
-              <w:t>Abu Dhabi 10y sovereign CDS adj. for Switzerland, 30-Jun-2026, Damodaran July-2026 (the UAE federal CDS row is n/a; Abu Dhabi is the quoted UAE sovereign CDS — proxy flagged)</w:t>
+              <w:t>UAE dirham T-Bond, Jan-2031 tranche, auction YTM 30-Jul-2026 — the most RECENT AED sovereign print (4.50-year tenor; a longer Feb-2033 T-Sukuk exists — first 7-year AED tranche, AED 1,650m, ISIN AED01889C262 — whose last print, 4.13% in the April tap, predates the July repricing and is therefore not the anchor; both stated in the study. The tenor gap vs the cash-flow horizon is flagged; spread over UST was ~4bp at issue)</w:t>
             </w:r>
           </w:p>
         </w:tc>
@@ -7865,7 +7865,7 @@
                 <w:color w:val="1C3A36"/>
                 <w:sz w:val="15"/>
               </w:rPr>
-              <w:t>erp rating</w:t>
+              <w:t>ds rating</w:t>
             </w:r>
           </w:p>
         </w:tc>
@@ -7882,7 +7882,7 @@
                 <w:color w:val="1C3A36"/>
                 <w:sz w:val="15"/>
               </w:rPr>
-              <w:t>0.0481</w:t>
+              <w:t>0.0039</w:t>
             </w:r>
           </w:p>
         </w:tc>
@@ -7933,7 +7933,7 @@
                 <w:color w:val="1C3A36"/>
                 <w:sz w:val="15"/>
               </w:rPr>
-              <w:t>UAE total equity risk premium, rating basis, Damodaran July-2026</w:t>
+              <w:t>UAE adjusted default spread, rating basis (Aa2), Damodaran ctryprem July-2026 edition (data 30-Jun-2026)</w:t>
             </w:r>
           </w:p>
         </w:tc>
@@ -7952,7 +7952,7 @@
                 <w:color w:val="1C3A36"/>
                 <w:sz w:val="15"/>
               </w:rPr>
-              <w:t>erp cds</w:t>
+              <w:t>ds cds</w:t>
             </w:r>
           </w:p>
         </w:tc>
@@ -7969,7 +7969,7 @@
                 <w:color w:val="1C3A36"/>
                 <w:sz w:val="15"/>
               </w:rPr>
-              <w:t>0.0501</w:t>
+              <w:t>0.0052</w:t>
             </w:r>
           </w:p>
         </w:tc>
@@ -8020,7 +8020,7 @@
                 <w:color w:val="1C3A36"/>
                 <w:sz w:val="15"/>
               </w:rPr>
-              <w:t>UAE total ERP, sovereign-CDS basis (via Abu Dhabi CDS), Damodaran July-2026</w:t>
+              <w:t>Abu Dhabi 10y sovereign CDS adj. for Switzerland, 30-Jun-2026, Damodaran July-2026 (the UAE federal CDS row is n/a; Abu Dhabi is the quoted UAE sovereign CDS — proxy flagged)</w:t>
             </w:r>
           </w:p>
         </w:tc>
@@ -8039,6 +8039,180 @@
                 <w:color w:val="1C3A36"/>
                 <w:sz w:val="15"/>
               </w:rPr>
+              <w:t>erp rating</w:t>
+            </w:r>
+          </w:p>
+        </w:tc>
+        <w:tc>
+          <w:tcPr>
+            <w:tcW w:type="dxa" w:w="2304"/>
+          </w:tcPr>
+          <w:p>
+            <w:pPr>
+              <w:spacing w:after="20"/>
+            </w:pPr>
+            <w:r>
+              <w:rPr>
+                <w:color w:val="1C3A36"/>
+                <w:sz w:val="15"/>
+              </w:rPr>
+              <w:t>0.0481</w:t>
+            </w:r>
+          </w:p>
+        </w:tc>
+        <w:tc>
+          <w:tcPr>
+            <w:tcW w:type="dxa" w:w="893"/>
+          </w:tcPr>
+          <w:p>
+            <w:pPr>
+              <w:spacing w:after="20"/>
+            </w:pPr>
+            <w:r>
+              <w:rPr>
+                <w:color w:val="1C3A36"/>
+                <w:sz w:val="15"/>
+              </w:rPr>
+              <w:t>Country</w:t>
+            </w:r>
+          </w:p>
+        </w:tc>
+        <w:tc>
+          <w:tcPr>
+            <w:tcW w:type="dxa" w:w="1123"/>
+          </w:tcPr>
+          <w:p>
+            <w:pPr>
+              <w:spacing w:after="20"/>
+            </w:pPr>
+            <w:r>
+              <w:rPr>
+                <w:color w:val="1C3A36"/>
+                <w:sz w:val="15"/>
+              </w:rPr>
+              <w:t>2026-07-01</w:t>
+            </w:r>
+          </w:p>
+        </w:tc>
+        <w:tc>
+          <w:tcPr>
+            <w:tcW w:type="dxa" w:w="7920"/>
+          </w:tcPr>
+          <w:p>
+            <w:pPr>
+              <w:spacing w:after="20"/>
+            </w:pPr>
+            <w:r>
+              <w:rPr>
+                <w:color w:val="1C3A36"/>
+                <w:sz w:val="15"/>
+              </w:rPr>
+              <w:t>UAE total equity risk premium, rating basis, Damodaran July-2026</w:t>
+            </w:r>
+          </w:p>
+        </w:tc>
+      </w:tr>
+      <w:tr>
+        <w:tc>
+          <w:tcPr>
+            <w:tcW w:type="dxa" w:w="1872"/>
+          </w:tcPr>
+          <w:p>
+            <w:pPr>
+              <w:spacing w:after="20"/>
+            </w:pPr>
+            <w:r>
+              <w:rPr>
+                <w:color w:val="1C3A36"/>
+                <w:sz w:val="15"/>
+              </w:rPr>
+              <w:t>erp cds</w:t>
+            </w:r>
+          </w:p>
+        </w:tc>
+        <w:tc>
+          <w:tcPr>
+            <w:tcW w:type="dxa" w:w="2304"/>
+          </w:tcPr>
+          <w:p>
+            <w:pPr>
+              <w:spacing w:after="20"/>
+            </w:pPr>
+            <w:r>
+              <w:rPr>
+                <w:color w:val="1C3A36"/>
+                <w:sz w:val="15"/>
+              </w:rPr>
+              <w:t>0.0501</w:t>
+            </w:r>
+          </w:p>
+        </w:tc>
+        <w:tc>
+          <w:tcPr>
+            <w:tcW w:type="dxa" w:w="893"/>
+          </w:tcPr>
+          <w:p>
+            <w:pPr>
+              <w:spacing w:after="20"/>
+            </w:pPr>
+            <w:r>
+              <w:rPr>
+                <w:color w:val="1C3A36"/>
+                <w:sz w:val="15"/>
+              </w:rPr>
+              <w:t>Country</w:t>
+            </w:r>
+          </w:p>
+        </w:tc>
+        <w:tc>
+          <w:tcPr>
+            <w:tcW w:type="dxa" w:w="1123"/>
+          </w:tcPr>
+          <w:p>
+            <w:pPr>
+              <w:spacing w:after="20"/>
+            </w:pPr>
+            <w:r>
+              <w:rPr>
+                <w:color w:val="1C3A36"/>
+                <w:sz w:val="15"/>
+              </w:rPr>
+              <w:t>2026-07-01</w:t>
+            </w:r>
+          </w:p>
+        </w:tc>
+        <w:tc>
+          <w:tcPr>
+            <w:tcW w:type="dxa" w:w="7920"/>
+          </w:tcPr>
+          <w:p>
+            <w:pPr>
+              <w:spacing w:after="20"/>
+            </w:pPr>
+            <w:r>
+              <w:rPr>
+                <w:color w:val="1C3A36"/>
+                <w:sz w:val="15"/>
+              </w:rPr>
+              <w:t>UAE total ERP, sovereign-CDS basis (via Abu Dhabi CDS), Damodaran July-2026</w:t>
+            </w:r>
+          </w:p>
+        </w:tc>
+      </w:tr>
+      <w:tr>
+        <w:tc>
+          <w:tcPr>
+            <w:tcW w:type="dxa" w:w="1872"/>
+          </w:tcPr>
+          <w:p>
+            <w:pPr>
+              <w:spacing w:after="20"/>
+            </w:pPr>
+            <w:r>
+              <w:rPr>
+                <w:color w:val="1C3A36"/>
+                <w:sz w:val="15"/>
+              </w:rPr>
               <w:t>g term</w:t>
             </w:r>
           </w:p>
@@ -8107,7 +8281,7 @@
                 <w:color w:val="1C3A36"/>
                 <w:sz w:val="15"/>
               </w:rPr>
-              <w:t>Terminal growth: long-run UAE nominal-GDP-consistent 2.5% under a flat regulated tariff — bounded by Dubai build-out saturation (connected 1.7m of ~2.0m RT contracted; sensitised 1.5-3.5%)</w:t>
+              <w:t>Terminal growth, two-stage: 2.5% VOLUME-ONLY for a ten-year second stage under the regulator's no-indexation rule (Dubai 2040 build-out, the contracted backlog and the 163-186 new-contracts/yr signing run-rate), then a 1.5% perpetuity (long-run densification, zero real tariff growth); the published grid extends to 0% so the flat-everything end is visible. The former "long-run UAE nominal-GDP-consistent" label was wrong in the conservative direction (UAE nominal GDP CAGR 2024-29 ≈ 5.7%) and is withdrawn</w:t>
             </w:r>
           </w:p>
         </w:tc>
@@ -8270,7 +8444,7 @@
                 <w:color w:val="1C3A36"/>
                 <w:sz w:val="15"/>
               </w:rPr>
-              <w:t>The consumption recovery (the crux)</w:t>
+              <w:t>The consumption recovery (the crux) — DUAL-FRAMED since the 17-Aug revision</w:t>
             </w:r>
           </w:p>
         </w:tc>
@@ -8287,7 +8461,7 @@
                 <w:color w:val="1C3A36"/>
                 <w:sz w:val="15"/>
               </w:rPr>
-              <w:t>Usage per connected ton carries a 6% shock in 2026 and recovers to the 2025 level through 2027; the never-recovers case is computed as a full alternative model (2.123 against 2.182 per share) and published beside it</w:t>
+              <w:t>Usage per connected ton carries a 6% shock in 2026. The recovery (de-escalation) case restores the 2025 level through 2027; the continuation case — the world as it stood on the published facts at the anchor — is a full parallel model (2.057 against 2.115 per share on the primary lens; weighted centrals 1.81/1.84 at 9% tax). NEITHER is privileged as the base: the external audit established that the de-escalation the recovery case requires had not occurred at the anchor date, so the two are published side by side like the tax framings</w:t>
             </w:r>
           </w:p>
         </w:tc>
@@ -8304,7 +8478,7 @@
                 <w:color w:val="1C3A36"/>
                 <w:sz w:val="15"/>
               </w:rPr>
-              <w:t>The interim notes tie the usage fall partly to conflict-hit hospitality occupancy; capacity connections kept growing through the same half, so the loss reads as demand-cyclical, not structural</w:t>
+              <w:t>The interim notes tie the usage fall mainly to lower hospitality activity (the company's own attribution; weather minor); capacity connections kept growing through the same half, so the loss reads as demand-cyclical, not structural — but the macro condition for recovery is a fact about the war, not the company, and is not asserted</w:t>
             </w:r>
           </w:p>
         </w:tc>
@@ -8321,7 +8495,7 @@
                 <w:color w:val="1C3A36"/>
                 <w:sz w:val="15"/>
               </w:rPr>
-              <w:t>Two consecutive half-years with equivalent full-load hours below the 2026 trough — then the never-recovers column becomes the base</w:t>
+              <w:t>De-escalation implemented (strait reopened, attack tempo fading) promotes the recovery case; two consecutive half-years with equivalent full-load hours below the 2026 trough retire it</w:t>
             </w:r>
           </w:p>
         </w:tc>
@@ -8357,7 +8531,7 @@
                 <w:color w:val="1C3A36"/>
                 <w:sz w:val="15"/>
               </w:rPr>
-              <w:t>The audited 9% effective rate is the base; the 15% domestic minimum top-up rate is computed as a full second column (2.027 against 2.182) — published side by side, never averaged</w:t>
+              <w:t>The audited 9% effective rate is the base; the 15% domestic minimum top-up rate is computed as a full second column (1.958 against 2.115) — published side by side, never averaged</w:t>
             </w:r>
           </w:p>
         </w:tc>
@@ -8410,7 +8584,7 @@
                 <w:color w:val="1C3A36"/>
                 <w:sz w:val="15"/>
               </w:rPr>
-              <w:t>Terminal growth</w:t>
+              <w:t>Terminal growth — RELABELLED and RESTRUCTURED in the 17-Aug revision</w:t>
             </w:r>
           </w:p>
         </w:tc>
@@ -8427,7 +8601,7 @@
                 <w:color w:val="1C3A36"/>
                 <w:sz w:val="15"/>
               </w:rPr>
-              <w:t>2.5% in nominal dirhams, sensitised 1.5%–3.5%</w:t>
+              <w:t>Two-stage: 2.5% VOLUME-ONLY for ten further years, then a 1.5% perpetuity; the published grid extends to 0.0%</w:t>
             </w:r>
           </w:p>
         </w:tc>
@@ -8444,7 +8618,7 @@
                 <w:color w:val="1C3A36"/>
                 <w:sz w:val="15"/>
               </w:rPr>
-              <w:t>Bounded by the flat regulated tariff and Dubai build-out saturation: connected capacity already covers most of the contracted pipeline, so perpetual growth above nominal GDP would require expansion the company has not announced</w:t>
+              <w:t>The regulator's tariff instrument bars indexation of capacity charges, so any perpetual growth must be volume; the ten-year stage rests on the Dubai 2040 build-out, the contracted backlog and the disclosed signing run-rate, and the former "nominal-GDP-consistent" label is withdrawn (it understated nominal GDP growth — an error in the conservative direction). The tension is stated: 2.5% volume growth forever would double the connected base every ~28 years, which is why the perpetuity steps down</w:t>
             </w:r>
           </w:p>
         </w:tc>
@@ -8461,7 +8635,7 @@
                 <w:color w:val="1C3A36"/>
                 <w:sz w:val="15"/>
               </w:rPr>
-              <w:t>A new-emirate or acquisition-led expansion commitment, or a tariff regime with real escalation</w:t>
+              <w:t>A new-emirate or acquisition-led expansion commitment (raises the bound), a tariff regime with escalation (impossible under the current instrument without a rule change), or connections stalling below the signing run-rate (lowers it)</w:t>
             </w:r>
           </w:p>
         </w:tc>
@@ -8480,7 +8654,7 @@
                 <w:color w:val="1C3A36"/>
                 <w:sz w:val="15"/>
               </w:rPr>
-              <w:t>Capital expenditure per new refrigeration ton</w:t>
+              <w:t>The valuation clock (stub convention) — ADOPTED in the 17-Aug revision</w:t>
             </w:r>
           </w:p>
         </w:tc>
@@ -8497,7 +8671,7 @@
                 <w:color w:val="1C3A36"/>
                 <w:sz w:val="15"/>
               </w:rPr>
-              <w:t>AED 4,889 per RT added (derived: 2025 cash capital expenditure over the year's added tons), plus a 0.8% maintenance allowance on net plant</w:t>
+              <w:t>Bridge and cash-flow clock BOTH at 30-Jun-2026: 2026 contributes its second half only, discounted at half a year; later year-ends at 1.5-4.5 years; terminal at 4.5</w:t>
             </w:r>
           </w:p>
         </w:tc>
@@ -8514,7 +8688,7 @@
                 <w:color w:val="1C3A36"/>
                 <w:sz w:val="15"/>
               </w:rPr>
-              <w:t>No AED capital-expenditure guidance is disclosed anywhere (a recorded negative search); cost-per-ton on the audited cash figure is the finest sourced level available</w:t>
+              <w:t>The prior convention discounted the full 2026 year against the June balance sheet and so double-counted roughly AED 200m of first-half cash — the audit's finding, confirmed and repriced</w:t>
             </w:r>
           </w:p>
         </w:tc>
@@ -8531,7 +8705,7 @@
                 <w:color w:val="1C3A36"/>
                 <w:sz w:val="15"/>
               </w:rPr>
-              <w:t>Company capital-expenditure guidance, or two years of cash figures diverging materially from the per-ton construction</w:t>
+              <w:t>Nothing — this is now the dating convention, stated so the reader can reproduce the discounting</w:t>
             </w:r>
           </w:p>
         </w:tc>
@@ -8550,7 +8724,7 @@
                 <w:color w:val="1C3A36"/>
                 <w:sz w:val="15"/>
               </w:rPr>
-              <w:t>Electricity-and-water pass-through ratio</w:t>
+              <w:t>The related-party acquisition receivables — CLEAN treatment since the 17-Aug revision</w:t>
             </w:r>
           </w:p>
         </w:tc>
@@ -8567,7 +8741,7 @@
                 <w:color w:val="1C3A36"/>
                 <w:sz w:val="15"/>
               </w:rPr>
-              <w:t>Purchased electricity and water held at 76.3% of consumption revenue (the audited 2025 print; 2024 was 72.5%)</w:t>
+              <w:t>Interest income excluded from operating EBITDA and free cash flow; the asset (AED 1,294.4m at 30-Jun-2026: Dubai Aviation City 1,005.0 + Nakheel 289.4) added at BOOK in the bridge; excluded from terminal invested capital. Rental income on the investment properties treated identically (excluded from operating earnings; the properties sit in the bridge at book)</w:t>
             </w:r>
           </w:p>
         </w:tc>
@@ -8584,7 +8758,7 @@
                 <w:color w:val="1C3A36"/>
                 <w:sz w:val="15"/>
               </w:rPr>
-              <w:t>The cost is tied to its own physical driver — the consumption leg — on the related-party purchase disclosure, never to a blended inflation index; the DEWA slab tariff is flat and the fuel surcharge floats monthly</w:t>
+              <w:t>A financial asset's return cannot be capitalised as an operating perpetuity while the asset is also added — that prices it twice. The first edition's treatment was incoherent in exactly that way (audit finding, conceded); rental income was the same defect found by the re-check against the other-income note</w:t>
             </w:r>
           </w:p>
         </w:tc>
@@ -8601,7 +8775,7 @@
                 <w:color w:val="1C3A36"/>
                 <w:sz w:val="15"/>
               </w:rPr>
-              <w:t>A DEWA tariff revision, or the ratio moving by more than two points in a full-year print</w:t>
+              <w:t>A disclosed impairment, restructuring or prepayment of either receivable — the book-value leg would then be re-marked</w:t>
             </w:r>
           </w:p>
         </w:tc>
@@ -8620,7 +8794,7 @@
                 <w:color w:val="1C3A36"/>
                 <w:sz w:val="15"/>
               </w:rPr>
-              <w:t>Working capital</w:t>
+              <w:t>The cost-of-capital construction — DUAL-FRAMED since the 17-Aug revision</w:t>
             </w:r>
           </w:p>
         </w:tc>
@@ -8637,7 +8811,7 @@
                 <w:color w:val="1C3A36"/>
                 <w:sz w:val="15"/>
               </w:rPr>
-              <w:t>Net working capital held at -51.4% of revenue (negative — customer deposits and payables fund the cycle), from the audited 2025 balance sheet with capital-expenditure accruals stripped out</w:t>
+              <w:t>Base: target net-debt weights at 7.61%. Priced alternatives, each a full parallel valuation: gross-debt weights (7.23%, 2.272/share), net debt at its negative carry (7.79%, 2.048), and the listing-exchange (DFM) index beta (6.77%, 2.492)</w:t>
             </w:r>
           </w:p>
         </w:tc>
@@ -8654,7 +8828,7 @@
                 <w:color w:val="1C3A36"/>
                 <w:sz w:val="15"/>
               </w:rPr>
-              <w:t>The ratio is structural: deposits are contractual and the dominant payable is to the related-party supplier</w:t>
+              <w:t>The audit's largest contested findings were constructions of the discount rate pulling in opposite directions; arbitration on coherence and company policy (net-debt target ~2x EBITDA, payout ≈ free cash flow to equity, so surplus cash is transient) keeps the target-net base — and every alternative is priced instead of argued away</w:t>
             </w:r>
           </w:p>
         </w:tc>
@@ -8671,7 +8845,7 @@
                 <w:color w:val="1C3A36"/>
                 <w:sz w:val="15"/>
               </w:rPr>
-              <w:t>Receivable days lengthening materially (the collection cycle stood near a month at FY2025) or a change in deposit terms</w:t>
+              <w:t>The company running a durable structural cash pile (promotes the carry construction) or de-rating its net-debt policy (promotes gross weights)</w:t>
             </w:r>
           </w:p>
         </w:tc>
@@ -8690,7 +8864,7 @@
                 <w:color w:val="1C3A36"/>
                 <w:sz w:val="15"/>
               </w:rPr>
-              <w:t>The connected-capacity path</w:t>
+              <w:t>Capital expenditure per new refrigeration ton</w:t>
             </w:r>
           </w:p>
         </w:tc>
@@ -8707,7 +8881,7 @@
                 <w:color w:val="1C3A36"/>
                 <w:sz w:val="15"/>
               </w:rPr>
-              <w:t>The 2026 guidance midpoint, then additions funded by the contracted backlog, tapering as the build-out matures</w:t>
+              <w:t>AED 4,889 per RT added (derived: 2025 cash capital expenditure over the year's added tons), plus a 0.8% maintenance allowance on net plant</w:t>
             </w:r>
           </w:p>
         </w:tc>
@@ -8724,7 +8898,7 @@
                 <w:color w:val="1C3A36"/>
                 <w:sz w:val="15"/>
               </w:rPr>
-              <w:t>The company's own guidance and its signed but not-yet-connected backlog are the finest sourced volume drivers available; no market-growth assumption is used</w:t>
+              <w:t>No AED capital-expenditure guidance is disclosed anywhere (a recorded negative search); cost-per-ton on the audited cash figure is the finest sourced level available</w:t>
             </w:r>
           </w:p>
         </w:tc>
@@ -8741,7 +8915,7 @@
                 <w:color w:val="1C3A36"/>
                 <w:sz w:val="15"/>
               </w:rPr>
-              <w:t>Connections printing outside the guidance band, or the contracted backlog shrinking two decks running</w:t>
+              <w:t>Company capital-expenditure guidance, or two years of cash figures diverging materially from the per-ton construction</w:t>
             </w:r>
           </w:p>
         </w:tc>
@@ -8760,7 +8934,7 @@
                 <w:color w:val="1C3A36"/>
                 <w:sz w:val="15"/>
               </w:rPr>
-              <w:t>The cost of equity construction</w:t>
+              <w:t>Electricity-and-water pass-through ratio</w:t>
             </w:r>
           </w:p>
         </w:tc>
@@ -8777,7 +8951,7 @@
                 <w:color w:val="1C3A36"/>
                 <w:sz w:val="15"/>
               </w:rPr>
-              <w:t>Risk-free = the longest dirham sovereign print less the UAE's own default spread; beta 0.863 from the stock's own weekly history against the FTSE ADX General Index (adopted as the UAE market index by instruction; the DFM-index regression, 0.652, is retained as a comparison); the published UAE equity risk premium; both spread bases computed (they converge: 8.24% against 8.28%)</w:t>
+              <w:t>Purchased electricity and water held at 76.3% of consumption revenue (the audited 2025 print; 2024 was 72.5%)</w:t>
             </w:r>
           </w:p>
         </w:tc>
@@ -8794,7 +8968,7 @@
                 <w:color w:val="1C3A36"/>
                 <w:sz w:val="15"/>
               </w:rPr>
-              <w:t>Country risk must enter once — through the premium — not twice; the two published bases are both carried precisely because the choice between them is contested, and here it turns out to cost nothing</w:t>
+              <w:t>The cost is tied to its own physical driver — the consumption leg — on the related-party purchase disclosure, never to a blended inflation index; the DEWA slab tariff is flat and the fuel surcharge floats monthly</w:t>
             </w:r>
           </w:p>
         </w:tc>
@@ -8811,7 +8985,7 @@
                 <w:color w:val="1C3A36"/>
                 <w:sz w:val="15"/>
               </w:rPr>
-              <w:t>A longer dirham sovereign issue (replacing the tenor-mismatched anchor) or the beta interval shifting as the listing history lengthens</w:t>
+              <w:t>A DEWA tariff revision, or the ratio moving by more than two points in a full-year print</w:t>
             </w:r>
           </w:p>
         </w:tc>
@@ -8830,7 +9004,7 @@
                 <w:color w:val="1C3A36"/>
                 <w:sz w:val="15"/>
               </w:rPr>
-              <w:t>Minority interests at their profit share</w:t>
+              <w:t>Working capital</w:t>
             </w:r>
           </w:p>
         </w:tc>
@@ -8847,7 +9021,7 @@
                 <w:color w:val="1C3A36"/>
                 <w:sz w:val="15"/>
               </w:rPr>
-              <w:t>Minorities are charged 1.1% of equity value — their share of profits — rather than book value</w:t>
+              <w:t>Net working capital held at -51.4% of revenue (negative — customer deposits and payables fund the cycle), from the audited 2025 balance sheet with capital-expenditure accruals stripped out</w:t>
             </w:r>
           </w:p>
         </w:tc>
@@ -8864,7 +9038,7 @@
                 <w:color w:val="1C3A36"/>
                 <w:sz w:val="15"/>
               </w:rPr>
-              <w:t>The study values the group above book, so valuing the minority claim at book while valuing everyone else's above it would apply two standards to the same subsidiaries</w:t>
+              <w:t>The ratio is structural: deposits are contractual and the dominant payable is to the related-party supplier</w:t>
             </w:r>
           </w:p>
         </w:tc>
@@ -8881,7 +9055,7 @@
                 <w:color w:val="1C3A36"/>
                 <w:sz w:val="15"/>
               </w:rPr>
-              <w:t>A disclosed transaction in the minority stakes establishing a different value</w:t>
+              <w:t>Receivable days lengthening materially (the collection cycle stood near a month at FY2025) or a change in deposit terms</w:t>
             </w:r>
           </w:p>
         </w:tc>
@@ -8900,7 +9074,7 @@
                 <w:color w:val="1C3A36"/>
                 <w:sz w:val="15"/>
               </w:rPr>
-              <w:t>No accretion roll to the anchor date</w:t>
+              <w:t>The connected-capacity path</w:t>
             </w:r>
           </w:p>
         </w:tc>
@@ -8917,7 +9091,7 @@
                 <w:color w:val="1C3A36"/>
                 <w:sz w:val="15"/>
               </w:rPr>
-              <w:t>The valuation is struck on the 30-Jun-2026 reviewed balance sheet and compared directly with the 07-Aug-2026 closing price</w:t>
+              <w:t>The 2026 guidance midpoint, then additions funded by the contracted backlog, tapering as the build-out matures</w:t>
             </w:r>
           </w:p>
         </w:tc>
@@ -8934,7 +9108,7 @@
                 <w:color w:val="1C3A36"/>
                 <w:sz w:val="15"/>
               </w:rPr>
-              <w:t>The window is five weeks with no dividend inside it; an accretion roll would move the comparison by well under one percent of value</w:t>
+              <w:t>The company's own guidance and its signed but not-yet-connected backlog are the finest sourced volume drivers available; no market-growth assumption is used</w:t>
             </w:r>
           </w:p>
         </w:tc>
@@ -8951,7 +9125,217 @@
                 <w:color w:val="1C3A36"/>
                 <w:sz w:val="15"/>
               </w:rPr>
-              <w:t>Nothing — stated so the reader knows the dating convention rather than to invite evidence</w:t>
+              <w:t>Connections printing outside the guidance band, or the contracted backlog shrinking two decks running</w:t>
+            </w:r>
+          </w:p>
+        </w:tc>
+      </w:tr>
+      <w:tr>
+        <w:tc>
+          <w:tcPr>
+            <w:tcW w:type="dxa" w:w="2160"/>
+          </w:tcPr>
+          <w:p>
+            <w:pPr>
+              <w:spacing w:after="20"/>
+            </w:pPr>
+            <w:r>
+              <w:rPr>
+                <w:color w:val="1C3A36"/>
+                <w:sz w:val="15"/>
+              </w:rPr>
+              <w:t>The cost of equity construction</w:t>
+            </w:r>
+          </w:p>
+        </w:tc>
+        <w:tc>
+          <w:tcPr>
+            <w:tcW w:type="dxa" w:w="4176"/>
+          </w:tcPr>
+          <w:p>
+            <w:pPr>
+              <w:spacing w:after="20"/>
+            </w:pPr>
+            <w:r>
+              <w:rPr>
+                <w:color w:val="1C3A36"/>
+                <w:sz w:val="15"/>
+              </w:rPr>
+              <w:t>Risk-free = the most recent dirham sovereign print less the UAE's own default spread; beta 0.863 from the stock's own weekly history against the FTSE ADX General Index (adopted as the UAE market index by explicit instruction; the DFM-index regression, 0.652, is priced as a full parallel valuation since the 17-Aug revision); the published UAE equity risk premium; both spread bases computed (they converge: 8.24% against 8.28%)</w:t>
+            </w:r>
+          </w:p>
+        </w:tc>
+        <w:tc>
+          <w:tcPr>
+            <w:tcW w:type="dxa" w:w="3960"/>
+          </w:tcPr>
+          <w:p>
+            <w:pPr>
+              <w:spacing w:after="20"/>
+            </w:pPr>
+            <w:r>
+              <w:rPr>
+                <w:color w:val="1C3A36"/>
+                <w:sz w:val="15"/>
+              </w:rPr>
+              <w:t>Country risk must enter once — through the premium — not twice; the two published bases are both carried precisely because the choice between them is contested, and here it turns out to cost nothing. The beta-index choice, by contrast, is worth a fifth of the primary lens and is therefore priced, not footnoted</w:t>
+            </w:r>
+          </w:p>
+        </w:tc>
+        <w:tc>
+          <w:tcPr>
+            <w:tcW w:type="dxa" w:w="3816"/>
+          </w:tcPr>
+          <w:p>
+            <w:pPr>
+              <w:spacing w:after="20"/>
+            </w:pPr>
+            <w:r>
+              <w:rPr>
+                <w:color w:val="1C3A36"/>
+                <w:sz w:val="15"/>
+              </w:rPr>
+              <w:t>A longer LIQUID dirham sovereign print post-repricing (the stale Feb-2033 tap does not qualify and is named as such) or the beta interval shifting as the listing history lengthens</w:t>
+            </w:r>
+          </w:p>
+        </w:tc>
+      </w:tr>
+      <w:tr>
+        <w:tc>
+          <w:tcPr>
+            <w:tcW w:type="dxa" w:w="2160"/>
+          </w:tcPr>
+          <w:p>
+            <w:pPr>
+              <w:spacing w:after="20"/>
+            </w:pPr>
+            <w:r>
+              <w:rPr>
+                <w:color w:val="1C3A36"/>
+                <w:sz w:val="15"/>
+              </w:rPr>
+              <w:t>Minority interests at their profit share</w:t>
+            </w:r>
+          </w:p>
+        </w:tc>
+        <w:tc>
+          <w:tcPr>
+            <w:tcW w:type="dxa" w:w="4176"/>
+          </w:tcPr>
+          <w:p>
+            <w:pPr>
+              <w:spacing w:after="20"/>
+            </w:pPr>
+            <w:r>
+              <w:rPr>
+                <w:color w:val="1C3A36"/>
+                <w:sz w:val="15"/>
+              </w:rPr>
+              <w:t>Minorities are charged 1.1% of equity value — their share of profits — rather than book value</w:t>
+            </w:r>
+          </w:p>
+        </w:tc>
+        <w:tc>
+          <w:tcPr>
+            <w:tcW w:type="dxa" w:w="3960"/>
+          </w:tcPr>
+          <w:p>
+            <w:pPr>
+              <w:spacing w:after="20"/>
+            </w:pPr>
+            <w:r>
+              <w:rPr>
+                <w:color w:val="1C3A36"/>
+                <w:sz w:val="15"/>
+              </w:rPr>
+              <w:t>The study values the group above book, so valuing the minority claim at book while valuing everyone else's above it would apply two standards to the same subsidiaries</w:t>
+            </w:r>
+          </w:p>
+        </w:tc>
+        <w:tc>
+          <w:tcPr>
+            <w:tcW w:type="dxa" w:w="3816"/>
+          </w:tcPr>
+          <w:p>
+            <w:pPr>
+              <w:spacing w:after="20"/>
+            </w:pPr>
+            <w:r>
+              <w:rPr>
+                <w:color w:val="1C3A36"/>
+                <w:sz w:val="15"/>
+              </w:rPr>
+              <w:t>A disclosed transaction in the minority stakes establishing a different value</w:t>
+            </w:r>
+          </w:p>
+        </w:tc>
+      </w:tr>
+      <w:tr>
+        <w:tc>
+          <w:tcPr>
+            <w:tcW w:type="dxa" w:w="2160"/>
+          </w:tcPr>
+          <w:p>
+            <w:pPr>
+              <w:spacing w:after="20"/>
+            </w:pPr>
+            <w:r>
+              <w:rPr>
+                <w:color w:val="1C3A36"/>
+                <w:sz w:val="15"/>
+              </w:rPr>
+              <w:t>The tax framing keeps the interest shield in BOTH columns</w:t>
+            </w:r>
+          </w:p>
+        </w:tc>
+        <w:tc>
+          <w:tcPr>
+            <w:tcW w:type="dxa" w:w="4176"/>
+          </w:tcPr>
+          <w:p>
+            <w:pPr>
+              <w:spacing w:after="20"/>
+            </w:pPr>
+            <w:r>
+              <w:rPr>
+                <w:color w:val="1C3A36"/>
+                <w:sz w:val="15"/>
+              </w:rPr>
+              <w:t>Both framings discount at 7.61%: the 15% minimum top-up is a minimum-effective-rate charge, not a higher statutory rate, so the 9% interest shield survives in the 15% column</w:t>
+            </w:r>
+          </w:p>
+        </w:tc>
+        <w:tc>
+          <w:tcPr>
+            <w:tcW w:type="dxa" w:w="3960"/>
+          </w:tcPr>
+          <w:p>
+            <w:pPr>
+              <w:spacing w:after="20"/>
+            </w:pPr>
+            <w:r>
+              <w:rPr>
+                <w:color w:val="1C3A36"/>
+                <w:sz w:val="15"/>
+              </w:rPr>
+              <w:t>Pillar-Two mechanics: the top-up restores the effective rate to the minimum; it does not change the statutory deductibility of interest — the audit's point, accepted and implemented</w:t>
+            </w:r>
+          </w:p>
+        </w:tc>
+        <w:tc>
+          <w:tcPr>
+            <w:tcW w:type="dxa" w:w="3816"/>
+          </w:tcPr>
+          <w:p>
+            <w:pPr>
+              <w:spacing w:after="20"/>
+            </w:pPr>
+            <w:r>
+              <w:rPr>
+                <w:color w:val="1C3A36"/>
+                <w:sz w:val="15"/>
+              </w:rPr>
+              <w:t>UAE implementing rules explicitly recomputing the debt shield at the top-up rate for in-scope entities</w:t>
             </w:r>
           </w:p>
         </w:tc>
@@ -9411,7 +9795,7 @@
                 <w:color w:val="1C3A36"/>
                 <w:sz w:val="16"/>
               </w:rPr>
-              <w:t>Conflict and ceasefire status, August 2026</w:t>
+              <w:t>Conflict and ceasefire status, August 2026 — RESOLVED in the 17-Aug revision</w:t>
             </w:r>
           </w:p>
         </w:tc>
@@ -9428,7 +9812,7 @@
                 <w:color w:val="1C3A36"/>
                 <w:sz w:val="16"/>
               </w:rPr>
-              <w:t>Reference and wire sources genuinely disagree: one widely used reference page records the ceasefire as holding since 8 April; another records it declared over on 8 July with low-intensity fighting after, following the June framework agreements</w:t>
+              <w:t>The first edition treated the truce status as an unresolved disagreement between sources and leaned on the stale reading ("holding since 8 April"). The dated timeline record, externally re-verified for the revision, is unambiguous: the ceasefire was declared over on 8 July, the Strait of Hormuz was closed from 11 July (US blockade 14 July) and remained closed at the 7 August anchor, and an ADNOC tanker was attacked at sea on 8 August</w:t>
             </w:r>
           </w:p>
         </w:tc>
@@ -9445,7 +9829,113 @@
                 <w:color w:val="1C3A36"/>
                 <w:sz w:val="16"/>
               </w:rPr>
-              <w:t>BOTH readings are recorded and the status is treated as an unresolved, fragile truce; the bear scenario prices the re-escalation reading rather than averaging the two</w:t>
+              <w:t>The study now states the anchor-date facts plainly, relabels the cases so that recovery is conditioned on a de-escalation that had not occurred, publishes the continuation central beside it, and carries a dated 17-August postscript for the newest events (tankers hit 12/14 August; Iran-Oman reopening agreement announced and the formal ceasefire ended 17 August)</w:t>
+            </w:r>
+          </w:p>
+        </w:tc>
+      </w:tr>
+      <w:tr>
+        <w:tc>
+          <w:tcPr>
+            <w:tcW w:type="dxa" w:w="2736"/>
+          </w:tcPr>
+          <w:p>
+            <w:pPr>
+              <w:spacing w:after="20"/>
+            </w:pPr>
+            <w:r>
+              <w:rPr>
+                <w:color w:val="1C3A36"/>
+                <w:sz w:val="16"/>
+              </w:rPr>
+              <w:t>The study's own first edition vs the external audit — recorded on the same terms as any other source discrepancy</w:t>
+            </w:r>
+          </w:p>
+        </w:tc>
+        <w:tc>
+          <w:tcPr>
+            <w:tcW w:type="dxa" w:w="6048"/>
+          </w:tcPr>
+          <w:p>
+            <w:pPr>
+              <w:spacing w:after="20"/>
+            </w:pPr>
+            <w:r>
+              <w:rPr>
+                <w:color w:val="1C3A36"/>
+                <w:sz w:val="16"/>
+              </w:rPr>
+              <w:t>The audit found the first edition carrying a stale ceasefire reading (above); missing the regulator's current tariff instrument (v1.3 of 17-Sep-2025 and v1.4 of 6-Feb-2026, with explicit caps and the no-indexation rule) and the Nov-2025 fees-and-fines resolution; overstating the refinancing scope (one tranche extended, not both); a receivable shown at its current portion in three balance-sheet columns; and a stale peer mark. The re-check that followed also found, and this register discloses, a FY2025 statement-face mis-split (G&amp;A 256.383 / other income 24.430, where the first pass carried 246.577 / 14.624 — both pairs close the operating-profit identity, which is why the assertion never caught it) and a rental-income double-count against the investment properties</w:t>
+            </w:r>
+          </w:p>
+        </w:tc>
+        <w:tc>
+          <w:tcPr>
+            <w:tcW w:type="dxa" w:w="5328"/>
+          </w:tcPr>
+          <w:p>
+            <w:pPr>
+              <w:spacing w:after="20"/>
+            </w:pPr>
+            <w:r>
+              <w:rPr>
+                <w:color w:val="1C3A36"/>
+                <w:sz w:val="16"/>
+              </w:rPr>
+              <w:t>Every item is corrected in the revised deliverables; the full list with prices is in the accompanying critique-response note. The mis-split is a reminder that an identity check constrains SUMS, not splits — the note-level composition (note 29) is now the control</w:t>
+            </w:r>
+          </w:p>
+        </w:tc>
+      </w:tr>
+      <w:tr>
+        <w:tc>
+          <w:tcPr>
+            <w:tcW w:type="dxa" w:w="2736"/>
+          </w:tcPr>
+          <w:p>
+            <w:pPr>
+              <w:spacing w:after="20"/>
+            </w:pPr>
+            <w:r>
+              <w:rPr>
+                <w:color w:val="1C3A36"/>
+                <w:sz w:val="16"/>
+              </w:rPr>
+              <w:t>Peer market value dating</w:t>
+            </w:r>
+          </w:p>
+        </w:tc>
+        <w:tc>
+          <w:tcPr>
+            <w:tcW w:type="dxa" w:w="6048"/>
+          </w:tcPr>
+          <w:p>
+            <w:pPr>
+              <w:spacing w:after="20"/>
+            </w:pPr>
+            <w:r>
+              <w:rPr>
+                <w:color w:val="1C3A36"/>
+                <w:sz w:val="16"/>
+              </w:rPr>
+              <w:t>The relative lens was originally struck on a data-provider mark dated 22-Jun-2026 while the study anchored 7-Aug-2026 — the same input carrying two dates inside one document set, and the peer had itself sold off ~10% between them</w:t>
+            </w:r>
+          </w:p>
+        </w:tc>
+        <w:tc>
+          <w:tcPr>
+            <w:tcW w:type="dxa" w:w="5328"/>
+          </w:tcPr>
+          <w:p>
+            <w:pPr>
+              <w:spacing w:after="20"/>
+            </w:pPr>
+            <w:r>
+              <w:rPr>
+                <w:color w:val="1C3A36"/>
+                <w:sz w:val="16"/>
+              </w:rPr>
+              <w:t>Peer marks are restruck on the anchor dates (Tabreed 2.46 on 6/7-Aug-2026; trailing multiple on trailing operating EBITDA, like-for-like) and the dating rule — one anchor for every market input — is stated</w:t>
             </w:r>
           </w:p>
         </w:tc>

</xml_diff>